<commit_message>
Rewrite user manuals and regenerate docx guides
</commit_message>
<xml_diff>
--- a/docs/manuals/docx/ADMIN-MANUAL.docx
+++ b/docs/manuals/docx/ADMIN-MANUAL.docx
@@ -27,7 +27,7 @@
     </w:p>
     <w:p>
       <w:r>
-        <w:t>Scope: user management, data refresh operations, audit review, and full reporting access</w:t>
+        <w:t>Scope: user accounts, data refresh, audit review, and full reporting access</w:t>
       </w:r>
     </w:p>
     <w:p/>
@@ -73,21 +73,27 @@
         <w:pStyle w:val="Heading1"/>
       </w:pPr>
       <w:r>
-        <w:t>1. What this manual covers</w:t>
+        <w:t>1. About this guide</w:t>
       </w:r>
     </w:p>
     <w:p>
       <w:r>
-        <w:t>Admins have the broadest access in the Regional KPI Dashboard. This role is responsible for:</w:t>
+        <w:t>This guide explains how to use the dashboard as an Admin.</w:t>
       </w:r>
     </w:p>
     <w:p/>
     <w:p>
+      <w:r>
+        <w:t>Admins have the widest level of access in the system. You are responsible for:</w:t>
+      </w:r>
+    </w:p>
+    <w:p/>
+    <w:p>
       <w:pPr>
         <w:pStyle w:val="ManualBullet"/>
       </w:pPr>
       <w:r>
-        <w:t>maintaining user access</w:t>
+        <w:t>creating and updating user accounts</w:t>
       </w:r>
     </w:p>
     <w:p>
@@ -103,7 +109,7 @@
         <w:pStyle w:val="ManualBullet"/>
       </w:pPr>
       <w:r>
-        <w:t>assigning and updating roles</w:t>
+        <w:t>changing user roles and access</w:t>
       </w:r>
     </w:p>
     <w:p>
@@ -111,7 +117,7 @@
         <w:pStyle w:val="ManualBullet"/>
       </w:pPr>
       <w:r>
-        <w:t>monitoring Beacon sync health</w:t>
+        <w:t>checking whether data is up to date</w:t>
       </w:r>
     </w:p>
     <w:p>
@@ -119,7 +125,7 @@
         <w:pStyle w:val="ManualBullet"/>
       </w:pPr>
       <w:r>
-        <w:t>triggering manual sync or CSV import when needed</w:t>
+        <w:t>running manual refresh actions when needed</w:t>
       </w:r>
     </w:p>
     <w:p>
@@ -127,15 +133,7 @@
         <w:pStyle w:val="ManualBullet"/>
       </w:pPr>
       <w:r>
-        <w:t>reviewing audit activity</w:t>
-      </w:r>
-    </w:p>
-    <w:p>
-      <w:pPr>
-        <w:pStyle w:val="ManualBullet"/>
-      </w:pPr>
-      <w:r>
-        <w:t>supporting Managers, RPLs, MLs, and Funders</w:t>
+        <w:t>reviewing audit history</w:t>
       </w:r>
     </w:p>
     <w:p/>
@@ -217,12 +215,12 @@
         <w:pStyle w:val="Heading1"/>
       </w:pPr>
       <w:r>
-        <w:t>2. Before you start</w:t>
+        <w:t>2. Before you make changes</w:t>
       </w:r>
     </w:p>
     <w:p>
       <w:r>
-        <w:t>Use this checklist before making any administrative change:</w:t>
+        <w:t>Use this quick checklist before changing anything important.</w:t>
       </w:r>
     </w:p>
     <w:p/>
@@ -231,7 +229,7 @@
         <w:pStyle w:val="ManualNumber"/>
       </w:pPr>
       <w:r>
-        <w:t>Confirm you are signed in with your own Admin account.</w:t>
+        <w:t>Make sure you are signed in with your own Admin account.</w:t>
       </w:r>
     </w:p>
     <w:p>
@@ -248,7 +246,7 @@
         <w:t>Last Data Refresh</w:t>
       </w:r>
       <w:r>
-        <w:t xml:space="preserve"> card in the sidebar.</w:t>
+        <w:t xml:space="preserve"> time in the sidebar.</w:t>
       </w:r>
     </w:p>
     <w:p>
@@ -256,7 +254,7 @@
         <w:pStyle w:val="ManualNumber"/>
       </w:pPr>
       <w:r>
-        <w:t>Record a clear business reason before changing roles, deleting users, or resetting data.</w:t>
+        <w:t>Be clear about why you are making the change.</w:t>
       </w:r>
     </w:p>
     <w:p>
@@ -264,7 +262,15 @@
         <w:pStyle w:val="ManualNumber"/>
       </w:pPr>
       <w:r>
-        <w:t>Prefer the smallest action that solves the problem.</w:t>
+        <w:t>Choose the smallest action that solves the problem.</w:t>
+      </w:r>
+    </w:p>
+    <w:p>
+      <w:pPr>
+        <w:pStyle w:val="ManualNumber"/>
+      </w:pPr>
+      <w:r>
+        <w:t>Be especially careful when deleting users or resetting data.</w:t>
       </w:r>
     </w:p>
     <w:p/>
@@ -310,7 +316,7 @@
         <w:pStyle w:val="Heading1"/>
       </w:pPr>
       <w:r>
-        <w:t>3. Signing in and moving around</w:t>
+        <w:t>3. Signing in</w:t>
       </w:r>
     </w:p>
     <w:p>
@@ -318,7 +324,7 @@
         <w:pStyle w:val="ManualNumber"/>
       </w:pPr>
       <w:r>
-        <w:t>Open the dashboard URL.</w:t>
+        <w:t>Open the dashboard link.</w:t>
       </w:r>
     </w:p>
     <w:p>
@@ -334,7 +340,7 @@
         <w:pStyle w:val="ManualNumber"/>
       </w:pPr>
       <w:r>
-        <w:t>If prompted, change your password before continuing.</w:t>
+        <w:t>Change your password if the system asks you to do so.</w:t>
       </w:r>
     </w:p>
     <w:p>
@@ -351,13 +357,13 @@
         <w:t>View Mode</w:t>
       </w:r>
       <w:r>
-        <w:t xml:space="preserve"> in the left sidebar to move between dashboards.</w:t>
+        <w:t xml:space="preserve"> in the left sidebar to move between screens.</w:t>
       </w:r>
     </w:p>
     <w:p/>
     <w:p>
       <w:r>
-        <w:t xml:space="preserve">If the application reports </w:t>
+        <w:t xml:space="preserve">If you see </w:t>
       </w:r>
       <w:r>
         <w:rPr>
@@ -366,7 +372,7 @@
         <w:t>Admin client not available</w:t>
       </w:r>
       <w:r>
-        <w:t>, the admin Supabase configuration is likely incomplete and should be checked before you continue.</w:t>
+        <w:t>, the system is missing some Admin configuration and should be checked before you continue.</w:t>
       </w:r>
     </w:p>
     <w:p/>
@@ -375,7 +381,7 @@
         <w:pStyle w:val="Heading1"/>
       </w:pPr>
       <w:r>
-        <w:t>4. Admin Dashboard screen tour</w:t>
+        <w:t>4. Main areas of the Admin Dashboard</w:t>
       </w:r>
     </w:p>
     <w:p>
@@ -389,13 +395,13 @@
         <w:t>Admin Dashboard</w:t>
       </w:r>
       <w:r>
-        <w:t xml:space="preserve"> is the operational control panel for the application.</w:t>
+        <w:t xml:space="preserve"> is the control area for running the system.</w:t>
       </w:r>
     </w:p>
     <w:p/>
     <w:p>
       <w:r>
-        <w:t>Main areas:</w:t>
+        <w:t>Main sections:</w:t>
       </w:r>
     </w:p>
     <w:p/>
@@ -409,9 +415,6 @@
         </w:rPr>
         <w:t>Password Reset Requests</w:t>
       </w:r>
-      <w:r>
-        <w:t>: pending self-service reset requests</w:t>
-      </w:r>
     </w:p>
     <w:p>
       <w:pPr>
@@ -423,9 +426,6 @@
         </w:rPr>
         <w:t>Create New User</w:t>
       </w:r>
-      <w:r>
-        <w:t>: create staff, admin, ML, RPL, manager, or funder users</w:t>
-      </w:r>
     </w:p>
     <w:p>
       <w:pPr>
@@ -437,9 +437,6 @@
         </w:rPr>
         <w:t>Existing Users &amp; Actions</w:t>
       </w:r>
-      <w:r>
-        <w:t>: reset passwords, update roles, delete users</w:t>
-      </w:r>
     </w:p>
     <w:p>
       <w:pPr>
@@ -451,9 +448,6 @@
         </w:rPr>
         <w:t>Sync Performance</w:t>
       </w:r>
-      <w:r>
-        <w:t>: timing and status for recent sync activity</w:t>
-      </w:r>
     </w:p>
     <w:p>
       <w:pPr>
@@ -465,9 +459,6 @@
         </w:rPr>
         <w:t>Beacon API Sync</w:t>
       </w:r>
-      <w:r>
-        <w:t>: smoke test, manual sync, stop, and stuck-sync controls</w:t>
-      </w:r>
     </w:p>
     <w:p>
       <w:pPr>
@@ -479,16 +470,13 @@
         </w:rPr>
         <w:t>Beacon CSV Upload</w:t>
       </w:r>
-      <w:r>
-        <w:t>: manual import from exported CSV files</w:t>
-      </w:r>
     </w:p>
     <w:p>
       <w:pPr>
         <w:pStyle w:val="ManualBullet"/>
       </w:pPr>
       <w:r>
-        <w:t>data reset actions: controlled rebuild or refresh operations</w:t>
+        <w:t>data reset actions</w:t>
       </w:r>
     </w:p>
     <w:p>
@@ -501,9 +489,6 @@
         </w:rPr>
         <w:t>Audit Logs</w:t>
       </w:r>
-      <w:r>
-        <w:t>: review of administrative and user activity</w:t>
-      </w:r>
     </w:p>
     <w:p/>
     <w:p>
@@ -511,7 +496,7 @@
         <w:pStyle w:val="Heading1"/>
       </w:pPr>
       <w:r>
-        <w:t>5. User management workflows</w:t>
+        <w:t>5. User management</w:t>
       </w:r>
     </w:p>
     <w:p>
@@ -524,7 +509,7 @@
     </w:p>
     <w:p>
       <w:r>
-        <w:t xml:space="preserve">Use this when a user has selected </w:t>
+        <w:t xml:space="preserve">Use this when a user has clicked </w:t>
       </w:r>
       <w:r>
         <w:rPr>
@@ -533,7 +518,7 @@
         <w:t>Forgot password?</w:t>
       </w:r>
       <w:r>
-        <w:t xml:space="preserve"> and needs access restored.</w:t>
+        <w:t>.</w:t>
       </w:r>
     </w:p>
     <w:p/>
@@ -559,7 +544,7 @@
         <w:pStyle w:val="ManualNumber"/>
       </w:pPr>
       <w:r>
-        <w:t>Select the pending email address.</w:t>
+        <w:t>Choose the user’s email address.</w:t>
       </w:r>
     </w:p>
     <w:p>
@@ -592,13 +577,13 @@
         <w:pStyle w:val="ManualNumber"/>
       </w:pPr>
       <w:r>
-        <w:t>Tell the user to sign in and change the password immediately.</w:t>
+        <w:t>Tell the user to sign in and change the password straight away.</w:t>
       </w:r>
     </w:p>
     <w:p/>
     <w:p>
       <w:r>
-        <w:t>Expected result:</w:t>
+        <w:t>What happens next:</w:t>
       </w:r>
     </w:p>
     <w:p/>
@@ -607,7 +592,7 @@
         <w:pStyle w:val="ManualBullet"/>
       </w:pPr>
       <w:r>
-        <w:t>the request is marked as completed</w:t>
+        <w:t>the reset request is marked as completed</w:t>
       </w:r>
     </w:p>
     <w:p>
@@ -615,7 +600,7 @@
         <w:pStyle w:val="ManualBullet"/>
       </w:pPr>
       <w:r>
-        <w:t>the user is forced to change password on next login</w:t>
+        <w:t>the user is asked to change the password at next sign-in</w:t>
       </w:r>
     </w:p>
     <w:p>
@@ -623,7 +608,7 @@
         <w:pStyle w:val="ManualBullet"/>
       </w:pPr>
       <w:r>
-        <w:t>the action is recorded in the audit trail</w:t>
+        <w:t>the action is recorded in the audit log</w:t>
       </w:r>
     </w:p>
     <w:p/>
@@ -657,7 +642,7 @@
         <w:pStyle w:val="ManualNumber"/>
       </w:pPr>
       <w:r>
-        <w:t>Enter full name, email, and a starting password.</w:t>
+        <w:t>Enter the person’s full name.</w:t>
       </w:r>
     </w:p>
     <w:p>
@@ -665,7 +650,264 @@
         <w:pStyle w:val="ManualNumber"/>
       </w:pPr>
       <w:r>
-        <w:t>Select one or more roles.</w:t>
+        <w:t>Enter their email address.</w:t>
+      </w:r>
+    </w:p>
+    <w:p>
+      <w:pPr>
+        <w:pStyle w:val="ManualNumber"/>
+      </w:pPr>
+      <w:r>
+        <w:t>Enter a starting password.</w:t>
+      </w:r>
+    </w:p>
+    <w:p>
+      <w:pPr>
+        <w:pStyle w:val="ManualNumber"/>
+      </w:pPr>
+      <w:r>
+        <w:t>Choose one or more roles.</w:t>
+      </w:r>
+    </w:p>
+    <w:p>
+      <w:pPr>
+        <w:pStyle w:val="ManualNumber"/>
+      </w:pPr>
+      <w:r>
+        <w:t>Choose a region from the dropdown if the user is not a funder.</w:t>
+      </w:r>
+    </w:p>
+    <w:p>
+      <w:pPr>
+        <w:pStyle w:val="ManualNumber"/>
+      </w:pPr>
+      <w:r>
+        <w:t>If the user is a funder, choose the funder name or enter one manually.</w:t>
+      </w:r>
+    </w:p>
+    <w:p>
+      <w:pPr>
+        <w:pStyle w:val="ManualNumber"/>
+      </w:pPr>
+      <w:r>
+        <w:t xml:space="preserve">Click </w:t>
+      </w:r>
+      <w:r>
+        <w:rPr>
+          <w:rFonts w:ascii="Consolas" w:hAnsi="Consolas"/>
+        </w:rPr>
+        <w:t>Create User</w:t>
+      </w:r>
+      <w:r>
+        <w:t>.</w:t>
+      </w:r>
+    </w:p>
+    <w:p/>
+    <w:p>
+      <w:r>
+        <w:t>Good practice:</w:t>
+      </w:r>
+    </w:p>
+    <w:p/>
+    <w:p>
+      <w:pPr>
+        <w:pStyle w:val="ManualBullet"/>
+      </w:pPr>
+      <w:r>
+        <w:t>use a named work email where possible</w:t>
+      </w:r>
+    </w:p>
+    <w:p>
+      <w:pPr>
+        <w:pStyle w:val="ManualBullet"/>
+      </w:pPr>
+      <w:r>
+        <w:t>avoid shared accounts</w:t>
+      </w:r>
+    </w:p>
+    <w:p>
+      <w:pPr>
+        <w:pStyle w:val="ManualBullet"/>
+      </w:pPr>
+      <w:r>
+        <w:t>give the lowest level of access the person needs</w:t>
+      </w:r>
+    </w:p>
+    <w:p/>
+    <w:p>
+      <w:pPr>
+        <w:pStyle w:val="Heading2"/>
+      </w:pPr>
+      <w:r>
+        <w:t>5.3 Update an existing user</w:t>
+      </w:r>
+    </w:p>
+    <w:p>
+      <w:r>
+        <w:t xml:space="preserve">The </w:t>
+      </w:r>
+      <w:r>
+        <w:rPr>
+          <w:rFonts w:ascii="Consolas" w:hAnsi="Consolas"/>
+        </w:rPr>
+        <w:t>Existing Users &amp; Actions</w:t>
+      </w:r>
+      <w:r>
+        <w:t xml:space="preserve"> area lets you update a user without deleting and recreating the account.</w:t>
+      </w:r>
+    </w:p>
+    <w:p/>
+    <w:p>
+      <w:r>
+        <w:t>You can:</w:t>
+      </w:r>
+    </w:p>
+    <w:p/>
+    <w:p>
+      <w:pPr>
+        <w:pStyle w:val="ManualBullet"/>
+      </w:pPr>
+      <w:r>
+        <w:t>reset a password</w:t>
+      </w:r>
+    </w:p>
+    <w:p>
+      <w:pPr>
+        <w:pStyle w:val="ManualBullet"/>
+      </w:pPr>
+      <w:r>
+        <w:t>update roles</w:t>
+      </w:r>
+    </w:p>
+    <w:p>
+      <w:pPr>
+        <w:pStyle w:val="ManualBullet"/>
+      </w:pPr>
+      <w:r>
+        <w:t>update name, email, and region</w:t>
+      </w:r>
+    </w:p>
+    <w:p>
+      <w:pPr>
+        <w:pStyle w:val="ManualBullet"/>
+      </w:pPr>
+      <w:r>
+        <w:t>delete a user</w:t>
+      </w:r>
+    </w:p>
+    <w:p/>
+    <w:p>
+      <w:pPr>
+        <w:pStyle w:val="Heading2"/>
+      </w:pPr>
+      <w:r>
+        <w:t>5.4 Reset a password manually</w:t>
+      </w:r>
+    </w:p>
+    <w:p>
+      <w:pPr>
+        <w:pStyle w:val="ManualNumber"/>
+      </w:pPr>
+      <w:r>
+        <w:t xml:space="preserve">Go to </w:t>
+      </w:r>
+      <w:r>
+        <w:rPr>
+          <w:rFonts w:ascii="Consolas" w:hAnsi="Consolas"/>
+        </w:rPr>
+        <w:t>Existing Users &amp; Actions</w:t>
+      </w:r>
+      <w:r>
+        <w:t>.</w:t>
+      </w:r>
+    </w:p>
+    <w:p>
+      <w:pPr>
+        <w:pStyle w:val="ManualNumber"/>
+      </w:pPr>
+      <w:r>
+        <w:t xml:space="preserve">Open </w:t>
+      </w:r>
+      <w:r>
+        <w:rPr>
+          <w:rFonts w:ascii="Consolas" w:hAnsi="Consolas"/>
+        </w:rPr>
+        <w:t>Reset Password</w:t>
+      </w:r>
+      <w:r>
+        <w:t>.</w:t>
+      </w:r>
+    </w:p>
+    <w:p>
+      <w:pPr>
+        <w:pStyle w:val="ManualNumber"/>
+      </w:pPr>
+      <w:r>
+        <w:t>Select the user.</w:t>
+      </w:r>
+    </w:p>
+    <w:p>
+      <w:pPr>
+        <w:pStyle w:val="ManualNumber"/>
+      </w:pPr>
+      <w:r>
+        <w:t>Enter the new temporary password.</w:t>
+      </w:r>
+    </w:p>
+    <w:p>
+      <w:pPr>
+        <w:pStyle w:val="ManualNumber"/>
+      </w:pPr>
+      <w:r>
+        <w:t>Apply the change.</w:t>
+      </w:r>
+    </w:p>
+    <w:p/>
+    <w:p>
+      <w:r>
+        <w:t>Use this when the normal self-service route is not enough.</w:t>
+      </w:r>
+    </w:p>
+    <w:p/>
+    <w:p>
+      <w:pPr>
+        <w:pStyle w:val="Heading2"/>
+      </w:pPr>
+      <w:r>
+        <w:t>5.5 Update a user’s role</w:t>
+      </w:r>
+    </w:p>
+    <w:p>
+      <w:pPr>
+        <w:pStyle w:val="ManualNumber"/>
+      </w:pPr>
+      <w:r>
+        <w:t xml:space="preserve">Open </w:t>
+      </w:r>
+      <w:r>
+        <w:rPr>
+          <w:rFonts w:ascii="Consolas" w:hAnsi="Consolas"/>
+        </w:rPr>
+        <w:t>Update Role</w:t>
+      </w:r>
+      <w:r>
+        <w:t>.</w:t>
+      </w:r>
+    </w:p>
+    <w:p>
+      <w:pPr>
+        <w:pStyle w:val="ManualNumber"/>
+      </w:pPr>
+      <w:r>
+        <w:t>Select the user.</w:t>
+      </w:r>
+    </w:p>
+    <w:p>
+      <w:pPr>
+        <w:pStyle w:val="ManualNumber"/>
+      </w:pPr>
+      <w:r>
+        <w:t>Choose the correct role or roles.</w:t>
       </w:r>
     </w:p>
     <w:p>
@@ -682,7 +924,7 @@
         <w:t>Funder</w:t>
       </w:r>
       <w:r>
-        <w:t xml:space="preserve"> is included, choose the funder name or enter a new one.</w:t>
+        <w:t xml:space="preserve"> is selected, confirm the correct funder name.</w:t>
       </w:r>
     </w:p>
     <w:p>
@@ -690,208 +932,140 @@
         <w:pStyle w:val="ManualNumber"/>
       </w:pPr>
       <w:r>
-        <w:t>Submit the form.</w:t>
+        <w:t>Enter the reason for the change.</w:t>
+      </w:r>
+    </w:p>
+    <w:p>
+      <w:pPr>
+        <w:pStyle w:val="ManualNumber"/>
+      </w:pPr>
+      <w:r>
+        <w:t>Confirm the update.</w:t>
+      </w:r>
+    </w:p>
+    <w:p>
+      <w:pPr>
+        <w:pStyle w:val="ManualNumber"/>
+      </w:pPr>
+      <w:r>
+        <w:t xml:space="preserve">Click </w:t>
+      </w:r>
+      <w:r>
+        <w:rPr>
+          <w:rFonts w:ascii="Consolas" w:hAnsi="Consolas"/>
+        </w:rPr>
+        <w:t>Update Role</w:t>
+      </w:r>
+      <w:r>
+        <w:t>.</w:t>
       </w:r>
     </w:p>
     <w:p/>
     <w:p>
-      <w:r>
-        <w:t>Good practice:</w:t>
+      <w:pPr>
+        <w:pStyle w:val="Heading2"/>
+      </w:pPr>
+      <w:r>
+        <w:t>5.6 Update a user’s details</w:t>
+      </w:r>
+    </w:p>
+    <w:p>
+      <w:pPr>
+        <w:pStyle w:val="ManualNumber"/>
+      </w:pPr>
+      <w:r>
+        <w:t xml:space="preserve">Open </w:t>
+      </w:r>
+      <w:r>
+        <w:rPr>
+          <w:rFonts w:ascii="Consolas" w:hAnsi="Consolas"/>
+        </w:rPr>
+        <w:t>Update User Details</w:t>
+      </w:r>
+      <w:r>
+        <w:t>.</w:t>
+      </w:r>
+    </w:p>
+    <w:p>
+      <w:pPr>
+        <w:pStyle w:val="ManualNumber"/>
+      </w:pPr>
+      <w:r>
+        <w:t>Select the user.</w:t>
+      </w:r>
+    </w:p>
+    <w:p>
+      <w:pPr>
+        <w:pStyle w:val="ManualNumber"/>
+      </w:pPr>
+      <w:r>
+        <w:t>Update their full name if needed.</w:t>
+      </w:r>
+    </w:p>
+    <w:p>
+      <w:pPr>
+        <w:pStyle w:val="ManualNumber"/>
+      </w:pPr>
+      <w:r>
+        <w:t>Update their email address if needed.</w:t>
+      </w:r>
+    </w:p>
+    <w:p>
+      <w:pPr>
+        <w:pStyle w:val="ManualNumber"/>
+      </w:pPr>
+      <w:r>
+        <w:t>Update their region if needed.</w:t>
+      </w:r>
+    </w:p>
+    <w:p>
+      <w:pPr>
+        <w:pStyle w:val="ManualNumber"/>
+      </w:pPr>
+      <w:r>
+        <w:t>Enter the reason for the change.</w:t>
+      </w:r>
+    </w:p>
+    <w:p>
+      <w:pPr>
+        <w:pStyle w:val="ManualNumber"/>
+      </w:pPr>
+      <w:r>
+        <w:t>Confirm the update.</w:t>
+      </w:r>
+    </w:p>
+    <w:p>
+      <w:pPr>
+        <w:pStyle w:val="ManualNumber"/>
+      </w:pPr>
+      <w:r>
+        <w:t xml:space="preserve">Click </w:t>
+      </w:r>
+      <w:r>
+        <w:rPr>
+          <w:rFonts w:ascii="Consolas" w:hAnsi="Consolas"/>
+        </w:rPr>
+        <w:t>Update User Details</w:t>
+      </w:r>
+      <w:r>
+        <w:t>.</w:t>
       </w:r>
     </w:p>
     <w:p/>
     <w:p>
       <w:pPr>
-        <w:pStyle w:val="ManualBullet"/>
-      </w:pPr>
-      <w:r>
-        <w:t>use named organisational email addresses where possible</w:t>
+        <w:pStyle w:val="Heading2"/>
+      </w:pPr>
+      <w:r>
+        <w:t>5.7 Delete a user</w:t>
       </w:r>
     </w:p>
     <w:p>
       <w:pPr>
-        <w:pStyle w:val="ManualBullet"/>
-      </w:pPr>
-      <w:r>
-        <w:t>avoid shared accounts</w:t>
-      </w:r>
-    </w:p>
-    <w:p>
-      <w:pPr>
-        <w:pStyle w:val="ManualBullet"/>
-      </w:pPr>
-      <w:r>
-        <w:t>confirm the least-privilege role before saving</w:t>
-      </w:r>
-    </w:p>
-    <w:p/>
-    <w:p>
-      <w:pPr>
-        <w:pStyle w:val="Heading2"/>
-      </w:pPr>
-      <w:r>
-        <w:t>5.3 Reset an existing user's password</w:t>
-      </w:r>
-    </w:p>
-    <w:p>
-      <w:pPr>
         <w:pStyle w:val="ManualNumber"/>
       </w:pPr>
       <w:r>
-        <w:t xml:space="preserve">Find the user in </w:t>
-      </w:r>
-      <w:r>
-        <w:rPr>
-          <w:rFonts w:ascii="Consolas" w:hAnsi="Consolas"/>
-        </w:rPr>
-        <w:t>Existing Users &amp; Actions</w:t>
-      </w:r>
-      <w:r>
-        <w:t>.</w:t>
-      </w:r>
-    </w:p>
-    <w:p>
-      <w:pPr>
-        <w:pStyle w:val="ManualNumber"/>
-      </w:pPr>
-      <w:r>
-        <w:t xml:space="preserve">Choose </w:t>
-      </w:r>
-      <w:r>
-        <w:rPr>
-          <w:rFonts w:ascii="Consolas" w:hAnsi="Consolas"/>
-        </w:rPr>
-        <w:t>Reset Password</w:t>
-      </w:r>
-      <w:r>
-        <w:t>.</w:t>
-      </w:r>
-    </w:p>
-    <w:p>
-      <w:pPr>
-        <w:pStyle w:val="ManualNumber"/>
-      </w:pPr>
-      <w:r>
-        <w:t>Enter the new temporary password.</w:t>
-      </w:r>
-    </w:p>
-    <w:p>
-      <w:pPr>
-        <w:pStyle w:val="ManualNumber"/>
-      </w:pPr>
-      <w:r>
-        <w:t>Confirm the reset.</w:t>
-      </w:r>
-    </w:p>
-    <w:p/>
-    <w:p>
-      <w:r>
-        <w:t>Use this when the self-service route is unavailable or urgent support is required.</w:t>
-      </w:r>
-    </w:p>
-    <w:p/>
-    <w:p>
-      <w:pPr>
-        <w:pStyle w:val="Heading2"/>
-      </w:pPr>
-      <w:r>
-        <w:t>5.4 Update roles</w:t>
-      </w:r>
-    </w:p>
-    <w:p>
-      <w:pPr>
-        <w:pStyle w:val="ManualNumber"/>
-      </w:pPr>
-      <w:r>
-        <w:t>Select the user.</w:t>
-      </w:r>
-    </w:p>
-    <w:p>
-      <w:pPr>
-        <w:pStyle w:val="ManualNumber"/>
-      </w:pPr>
-      <w:r>
-        <w:t>Choose the revised role set.</w:t>
-      </w:r>
-    </w:p>
-    <w:p>
-      <w:pPr>
-        <w:pStyle w:val="ManualNumber"/>
-      </w:pPr>
-      <w:r>
-        <w:t xml:space="preserve">If </w:t>
-      </w:r>
-      <w:r>
-        <w:rPr>
-          <w:rFonts w:ascii="Consolas" w:hAnsi="Consolas"/>
-        </w:rPr>
-        <w:t>Funder</w:t>
-      </w:r>
-      <w:r>
-        <w:t xml:space="preserve"> is included, verify the mapped funder.</w:t>
-      </w:r>
-    </w:p>
-    <w:p>
-      <w:pPr>
-        <w:pStyle w:val="ManualNumber"/>
-      </w:pPr>
-      <w:r>
-        <w:t>Enter a reason that explains the change.</w:t>
-      </w:r>
-    </w:p>
-    <w:p>
-      <w:pPr>
-        <w:pStyle w:val="ManualNumber"/>
-      </w:pPr>
-      <w:r>
-        <w:t>Confirm and apply the update.</w:t>
-      </w:r>
-    </w:p>
-    <w:p/>
-    <w:p>
-      <w:r>
-        <w:t>Prefer updating the role over deleting and recreating an account. It preserves continuity and makes the audit history easier to follow.</w:t>
-      </w:r>
-    </w:p>
-    <w:p/>
-    <w:p>
-      <w:pPr>
-        <w:pStyle w:val="Heading2"/>
-      </w:pPr>
-      <w:r>
-        <w:t>5.5 Delete a user</w:t>
-      </w:r>
-    </w:p>
-    <w:p>
-      <w:pPr>
-        <w:pStyle w:val="ManualNumber"/>
-      </w:pPr>
-      <w:r>
-        <w:t>Select the user record.</w:t>
-      </w:r>
-    </w:p>
-    <w:p>
-      <w:pPr>
-        <w:pStyle w:val="ManualNumber"/>
-      </w:pPr>
-      <w:r>
-        <w:t>Enter the deletion reason.</w:t>
-      </w:r>
-    </w:p>
-    <w:p>
-      <w:pPr>
-        <w:pStyle w:val="ManualNumber"/>
-      </w:pPr>
-      <w:r>
-        <w:t>Confirm the action carefully.</w:t>
-      </w:r>
-    </w:p>
-    <w:p>
-      <w:pPr>
-        <w:pStyle w:val="ManualNumber"/>
-      </w:pPr>
-      <w:r>
-        <w:t xml:space="preserve">Click </w:t>
+        <w:t xml:space="preserve">Open </w:t>
       </w:r>
       <w:r>
         <w:rPr>
@@ -903,19 +1077,60 @@
         <w:t>.</w:t>
       </w:r>
     </w:p>
-    <w:p/>
     <w:p>
-      <w:r>
-        <w:t>Use deletion only when the account should no longer have dashboard access. If the person still works with the system, a role change is usually safer.</w:t>
+      <w:pPr>
+        <w:pStyle w:val="ManualNumber"/>
+      </w:pPr>
+      <w:r>
+        <w:t>Select the user.</w:t>
+      </w:r>
+    </w:p>
+    <w:p>
+      <w:pPr>
+        <w:pStyle w:val="ManualNumber"/>
+      </w:pPr>
+      <w:r>
+        <w:t>Enter the reason for deletion.</w:t>
+      </w:r>
+    </w:p>
+    <w:p>
+      <w:pPr>
+        <w:pStyle w:val="ManualNumber"/>
+      </w:pPr>
+      <w:r>
+        <w:t>Confirm the action.</w:t>
+      </w:r>
+    </w:p>
+    <w:p>
+      <w:pPr>
+        <w:pStyle w:val="ManualNumber"/>
+      </w:pPr>
+      <w:r>
+        <w:t xml:space="preserve">Click </w:t>
+      </w:r>
+      <w:r>
+        <w:rPr>
+          <w:rFonts w:ascii="Consolas" w:hAnsi="Consolas"/>
+        </w:rPr>
+        <w:t>Delete User</w:t>
+      </w:r>
+      <w:r>
+        <w:t>.</w:t>
       </w:r>
     </w:p>
     <w:p/>
     <w:p>
+      <w:r>
+        <w:t>Delete a user only when they should no longer have access at all. If they still need access, a role or profile update is usually better.</w:t>
+      </w:r>
+    </w:p>
+    <w:p/>
+    <w:p>
       <w:pPr>
         <w:pStyle w:val="Heading1"/>
       </w:pPr>
       <w:r>
-        <w:t>6. Sync and data operations</w:t>
+        <w:t>6. Data refresh and sync checks</w:t>
       </w:r>
     </w:p>
     <w:p>
@@ -923,7 +1138,7 @@
         <w:pStyle w:val="Heading2"/>
       </w:pPr>
       <w:r>
-        <w:t>6.1 Read the Sync Performance panel</w:t>
+        <w:t>6.1 Sync Performance</w:t>
       </w:r>
     </w:p>
     <w:p>
@@ -937,13 +1152,13 @@
         <w:t>Sync Performance</w:t>
       </w:r>
       <w:r>
-        <w:t xml:space="preserve"> to understand whether the data pipeline is healthy.</w:t>
+        <w:t xml:space="preserve"> to check whether the system is healthy.</w:t>
       </w:r>
     </w:p>
     <w:p/>
     <w:p>
       <w:r>
-        <w:t>Key indicators:</w:t>
+        <w:t>This section helps you review:</w:t>
       </w:r>
     </w:p>
     <w:p/>
@@ -952,7 +1167,7 @@
         <w:pStyle w:val="ManualBullet"/>
       </w:pPr>
       <w:r>
-        <w:t>last total sync duration</w:t>
+        <w:t>how long the last sync took</w:t>
       </w:r>
     </w:p>
     <w:p>
@@ -960,7 +1175,7 @@
         <w:pStyle w:val="ManualBullet"/>
       </w:pPr>
       <w:r>
-        <w:t>fetch, transform, and upsert timings</w:t>
+        <w:t>whether the last run was manual or automatic</w:t>
       </w:r>
     </w:p>
     <w:p>
@@ -968,7 +1183,7 @@
         <w:pStyle w:val="ManualBullet"/>
       </w:pPr>
       <w:r>
-        <w:t>average duration across recent successful syncs</w:t>
+        <w:t>whether the data may be out of date</w:t>
       </w:r>
     </w:p>
     <w:p>
@@ -976,61 +1191,7 @@
         <w:pStyle w:val="ManualBullet"/>
       </w:pPr>
       <w:r>
-        <w:t>last successful sync time</w:t>
-      </w:r>
-    </w:p>
-    <w:p>
-      <w:pPr>
-        <w:pStyle w:val="ManualBullet"/>
-      </w:pPr>
-      <w:r>
-        <w:t xml:space="preserve">whether the latest run was </w:t>
-      </w:r>
-      <w:r>
-        <w:rPr>
-          <w:rFonts w:ascii="Consolas" w:hAnsi="Consolas"/>
-        </w:rPr>
-        <w:t>automatic</w:t>
-      </w:r>
-      <w:r>
-        <w:t xml:space="preserve"> or </w:t>
-      </w:r>
-      <w:r>
-        <w:rPr>
-          <w:rFonts w:ascii="Consolas" w:hAnsi="Consolas"/>
-        </w:rPr>
-        <w:t>manual</w:t>
-      </w:r>
-    </w:p>
-    <w:p/>
-    <w:p>
-      <w:r>
-        <w:t>Use this section when:</w:t>
-      </w:r>
-    </w:p>
-    <w:p/>
-    <w:p>
-      <w:pPr>
-        <w:pStyle w:val="ManualBullet"/>
-      </w:pPr>
-      <w:r>
-        <w:t>the dashboard looks stale</w:t>
-      </w:r>
-    </w:p>
-    <w:p>
-      <w:pPr>
-        <w:pStyle w:val="ManualBullet"/>
-      </w:pPr>
-      <w:r>
-        <w:t>overnight syncs may have failed</w:t>
-      </w:r>
-    </w:p>
-    <w:p>
-      <w:pPr>
-        <w:pStyle w:val="ManualBullet"/>
-      </w:pPr>
-      <w:r>
-        <w:t>a manual sync seems slower than expected</w:t>
+        <w:t>whether recent syncs are getting slower</w:t>
       </w:r>
     </w:p>
     <w:p/>
@@ -1053,13 +1214,13 @@
         <w:t>Run Beacon API Smoke Test</w:t>
       </w:r>
       <w:r>
-        <w:t xml:space="preserve"> first when diagnosing a sync issue.</w:t>
+        <w:t xml:space="preserve"> before a full manual sync if you are checking for connection problems.</w:t>
       </w:r>
     </w:p>
     <w:p/>
     <w:p>
       <w:r>
-        <w:t>This is the lowest-risk check because it validates connectivity and response shape without running a full import.</w:t>
+        <w:t>This is the safest first step because it checks the connection without running a full import.</w:t>
       </w:r>
     </w:p>
     <w:p/>
@@ -1093,7 +1254,7 @@
         <w:pStyle w:val="ManualNumber"/>
       </w:pPr>
       <w:r>
-        <w:t>Start with a smoke test if you are troubleshooting.</w:t>
+        <w:t>Run a smoke test first if you are troubleshooting.</w:t>
       </w:r>
     </w:p>
     <w:p>
@@ -1118,7 +1279,7 @@
         <w:pStyle w:val="ManualNumber"/>
       </w:pPr>
       <w:r>
-        <w:t>Monitor progress messages.</w:t>
+        <w:t>Watch the progress messages.</w:t>
       </w:r>
     </w:p>
     <w:p>
@@ -1135,7 +1296,7 @@
         <w:t>Stop Manual API Sync</w:t>
       </w:r>
       <w:r>
-        <w:t xml:space="preserve"> only if the run is genuinely stuck or was started by mistake.</w:t>
+        <w:t xml:space="preserve"> only if the sync is clearly stuck.</w:t>
       </w:r>
     </w:p>
     <w:p>
@@ -1152,7 +1313,7 @@
         <w:t>Clear Stuck Sync</w:t>
       </w:r>
       <w:r>
-        <w:t xml:space="preserve"> only after confirming no live sync is still running.</w:t>
+        <w:t xml:space="preserve"> only after checking there is no live sync still running.</w:t>
       </w:r>
     </w:p>
     <w:p/>
@@ -1161,12 +1322,12 @@
         <w:pStyle w:val="Heading2"/>
       </w:pPr>
       <w:r>
-        <w:t>6.4 Upload Beacon CSV exports</w:t>
+        <w:t>6.4 Upload Beacon CSV files</w:t>
       </w:r>
     </w:p>
     <w:p>
       <w:r>
-        <w:t>Use this route only when you intentionally want to import exported files instead of using the API.</w:t>
+        <w:t>Use this only when you are intentionally loading exported CSV files instead of using the API.</w:t>
       </w:r>
     </w:p>
     <w:p/>
@@ -1192,7 +1353,7 @@
         <w:pStyle w:val="ManualNumber"/>
       </w:pPr>
       <w:r>
-        <w:t>Select the required CSV files.</w:t>
+        <w:t>Select the required files.</w:t>
       </w:r>
     </w:p>
     <w:p>
@@ -1200,7 +1361,7 @@
         <w:pStyle w:val="ManualNumber"/>
       </w:pPr>
       <w:r>
-        <w:t>Start the import.</w:t>
+        <w:t>Start the upload.</w:t>
       </w:r>
     </w:p>
     <w:p>
@@ -1208,7 +1369,7 @@
         <w:pStyle w:val="ManualNumber"/>
       </w:pPr>
       <w:r>
-        <w:t>Review the outcome before moving on to reporting.</w:t>
+        <w:t>Check the result message before moving on.</w:t>
       </w:r>
     </w:p>
     <w:p/>
@@ -1217,12 +1378,12 @@
         <w:pStyle w:val="Heading2"/>
       </w:pPr>
       <w:r>
-        <w:t>6.5 Refresh or rebuild data</w:t>
+        <w:t>6.5 Reset or rebuild dashboard data</w:t>
       </w:r>
     </w:p>
     <w:p>
       <w:r>
-        <w:t>Administrative reset actions should be treated as controlled maintenance tasks.</w:t>
+        <w:t>Treat reset actions as maintenance work.</w:t>
       </w:r>
     </w:p>
     <w:p/>
@@ -1237,7 +1398,7 @@
         <w:pStyle w:val="ManualBullet"/>
       </w:pPr>
       <w:r>
-        <w:t>a failed import needs a clean restart</w:t>
+        <w:t>an import has failed badly</w:t>
       </w:r>
     </w:p>
     <w:p>
@@ -1245,7 +1406,7 @@
         <w:pStyle w:val="ManualBullet"/>
       </w:pPr>
       <w:r>
-        <w:t>the working dataset must be rebuilt</w:t>
+        <w:t>the working data needs rebuilding</w:t>
       </w:r>
     </w:p>
     <w:p>
@@ -1253,13 +1414,13 @@
         <w:pStyle w:val="ManualBullet"/>
       </w:pPr>
       <w:r>
-        <w:t>support or data QA has agreed a reset is necessary</w:t>
+        <w:t>support or data checking work has agreed that a reset is needed</w:t>
       </w:r>
     </w:p>
     <w:p/>
     <w:p>
       <w:r>
-        <w:t>Do not use them casually during active reporting periods.</w:t>
+        <w:t>Do not use reset actions casually during active reporting.</w:t>
       </w:r>
     </w:p>
     <w:p/>
@@ -1273,13 +1434,22 @@
     </w:p>
     <w:p>
       <w:r>
-        <w:t>Audit review is the first place to look before assuming a user error or data issue.</w:t>
+        <w:t xml:space="preserve">The </w:t>
+      </w:r>
+      <w:r>
+        <w:rPr>
+          <w:rFonts w:ascii="Consolas" w:hAnsi="Consolas"/>
+        </w:rPr>
+        <w:t>Audit Logs</w:t>
+      </w:r>
+      <w:r>
+        <w:t xml:space="preserve"> section shows a history of important actions.</w:t>
       </w:r>
     </w:p>
     <w:p/>
     <w:p>
       <w:r>
-        <w:t>The log can help confirm:</w:t>
+        <w:t>Use it to check:</w:t>
       </w:r>
     </w:p>
     <w:p/>
@@ -1296,7 +1466,7 @@
         <w:pStyle w:val="ManualBullet"/>
       </w:pPr>
       <w:r>
-        <w:t>who reset a password</w:t>
+        <w:t>who changed a user profile</w:t>
       </w:r>
     </w:p>
     <w:p>
@@ -1304,7 +1474,7 @@
         <w:pStyle w:val="ManualBullet"/>
       </w:pPr>
       <w:r>
-        <w:t>who started a sync</w:t>
+        <w:t>who reset a password</w:t>
       </w:r>
     </w:p>
     <w:p>
@@ -1312,7 +1482,7 @@
         <w:pStyle w:val="ManualBullet"/>
       </w:pPr>
       <w:r>
-        <w:t>who deleted a user</w:t>
+        <w:t>who started a sync</w:t>
       </w:r>
     </w:p>
     <w:p>
@@ -1320,7 +1490,7 @@
         <w:pStyle w:val="ManualBullet"/>
       </w:pPr>
       <w:r>
-        <w:t>who saved or shared reports</w:t>
+        <w:t>who deleted a user</w:t>
       </w:r>
     </w:p>
     <w:p>
@@ -1328,13 +1498,13 @@
         <w:pStyle w:val="ManualBullet"/>
       </w:pPr>
       <w:r>
-        <w:t>which major dashboard interactions took place</w:t>
+        <w:t>who saved or shared a report</w:t>
       </w:r>
     </w:p>
     <w:p/>
     <w:p>
       <w:r>
-        <w:t>Use the audit trail for support tickets, governance checks, and internal accountability.</w:t>
+        <w:t>Use the log when investigating support issues or checking accountability.</w:t>
       </w:r>
     </w:p>
     <w:p/>
@@ -1343,21 +1513,29 @@
         <w:pStyle w:val="Heading1"/>
       </w:pPr>
       <w:r>
-        <w:t>8. Using the other dashboards as Admin</w:t>
+        <w:t>8. Other dashboards available to Admins</w:t>
       </w:r>
     </w:p>
     <w:p>
-      <w:r>
-        <w:t>Admins can use every operational and reporting view.</w:t>
+      <w:pPr>
+        <w:pStyle w:val="Heading2"/>
+      </w:pPr>
+      <w:r>
+        <w:t>KPI Dashboard</w:t>
+      </w:r>
+    </w:p>
+    <w:p>
+      <w:r>
+        <w:t>Use this for:</w:t>
       </w:r>
     </w:p>
     <w:p/>
     <w:p>
       <w:pPr>
-        <w:pStyle w:val="Heading2"/>
-      </w:pPr>
-      <w:r>
-        <w:t>KPI Dashboard</w:t>
+        <w:pStyle w:val="ManualBullet"/>
+      </w:pPr>
+      <w:r>
+        <w:t>headline KPI monitoring</w:t>
       </w:r>
     </w:p>
     <w:p>
@@ -1365,7 +1543,7 @@
         <w:pStyle w:val="ManualBullet"/>
       </w:pPr>
       <w:r>
-        <w:t>full regional KPI access</w:t>
+        <w:t>drill-down into supporting records</w:t>
       </w:r>
     </w:p>
     <w:p>
@@ -1373,30 +1551,14 @@
         <w:pStyle w:val="ManualBullet"/>
       </w:pPr>
       <w:r>
-        <w:t>drill-down into supporting rows</w:t>
-      </w:r>
-    </w:p>
-    <w:p>
-      <w:pPr>
-        <w:pStyle w:val="ManualBullet"/>
-      </w:pPr>
+        <w:t xml:space="preserve">validation using </w:t>
+      </w:r>
       <w:r>
         <w:rPr>
           <w:rFonts w:ascii="Consolas" w:hAnsi="Consolas"/>
         </w:rPr>
         <w:t>Show KPI Debug</w:t>
       </w:r>
-      <w:r>
-        <w:t xml:space="preserve"> for validation checks</w:t>
-      </w:r>
-    </w:p>
-    <w:p>
-      <w:pPr>
-        <w:pStyle w:val="ManualBullet"/>
-      </w:pPr>
-      <w:r>
-        <w:t>attendee names and IDs visible where source data supports them</w:t>
-      </w:r>
     </w:p>
     <w:p/>
     <w:p>
@@ -1408,44 +1570,17 @@
       </w:r>
     </w:p>
     <w:p>
-      <w:pPr>
-        <w:pStyle w:val="ManualBullet"/>
-      </w:pPr>
-      <w:r>
-        <w:t>all datasets and report outputs</w:t>
-      </w:r>
-    </w:p>
-    <w:p>
-      <w:pPr>
-        <w:pStyle w:val="ManualBullet"/>
-      </w:pPr>
-      <w:r>
-        <w:t>CSV export</w:t>
-      </w:r>
-    </w:p>
-    <w:p>
-      <w:pPr>
-        <w:pStyle w:val="ManualBullet"/>
-      </w:pPr>
-      <w:r>
-        <w:t>advanced filter controls</w:t>
-      </w:r>
-    </w:p>
-    <w:p>
-      <w:pPr>
-        <w:pStyle w:val="ManualBullet"/>
-      </w:pPr>
-      <w:r>
-        <w:t>distance analysis for participant travel review</w:t>
+      <w:r>
+        <w:t>Use this for:</w:t>
       </w:r>
     </w:p>
     <w:p/>
     <w:p>
       <w:pPr>
-        <w:pStyle w:val="Heading2"/>
-      </w:pPr>
-      <w:r>
-        <w:t>ML Dashboard</w:t>
+        <w:pStyle w:val="ManualBullet"/>
+      </w:pPr>
+      <w:r>
+        <w:t>detailed tables</w:t>
       </w:r>
     </w:p>
     <w:p>
@@ -1453,7 +1588,7 @@
         <w:pStyle w:val="ManualBullet"/>
       </w:pPr>
       <w:r>
-        <w:t>event-by-event operational review</w:t>
+        <w:t>charts</w:t>
       </w:r>
     </w:p>
     <w:p>
@@ -1461,7 +1596,7 @@
         <w:pStyle w:val="ManualBullet"/>
       </w:pPr>
       <w:r>
-        <w:t>participant, medical, and emergency fields where available</w:t>
+        <w:t>exports</w:t>
       </w:r>
     </w:p>
     <w:p>
@@ -1469,7 +1604,15 @@
         <w:pStyle w:val="ManualBullet"/>
       </w:pPr>
       <w:r>
-        <w:t>raw event payload for support investigation</w:t>
+        <w:t>advanced filters</w:t>
+      </w:r>
+    </w:p>
+    <w:p>
+      <w:pPr>
+        <w:pStyle w:val="ManualBullet"/>
+      </w:pPr>
+      <w:r>
+        <w:t>distance analysis</w:t>
       </w:r>
     </w:p>
     <w:p/>
@@ -1478,32 +1621,21 @@
         <w:pStyle w:val="Heading2"/>
       </w:pPr>
       <w:r>
-        <w:t>Funder Dashboard</w:t>
+        <w:t>ML Dashboard</w:t>
       </w:r>
     </w:p>
     <w:p>
-      <w:pPr>
-        <w:pStyle w:val="ManualBullet"/>
-      </w:pPr>
-      <w:r>
-        <w:t>funder summary view with selectable funder</w:t>
-      </w:r>
-    </w:p>
-    <w:p>
-      <w:pPr>
-        <w:pStyle w:val="ManualBullet"/>
-      </w:pPr>
-      <w:r>
-        <w:t>useful for preparing sponsor updates or QA of funder-facing figures</w:t>
+      <w:r>
+        <w:t>Use this for:</w:t>
       </w:r>
     </w:p>
     <w:p/>
     <w:p>
       <w:pPr>
-        <w:pStyle w:val="Heading2"/>
-      </w:pPr>
-      <w:r>
-        <w:t>Case Studies</w:t>
+        <w:pStyle w:val="ManualBullet"/>
+      </w:pPr>
+      <w:r>
+        <w:t>event-by-event review</w:t>
       </w:r>
     </w:p>
     <w:p>
@@ -1511,16 +1643,94 @@
         <w:pStyle w:val="ManualBullet"/>
       </w:pPr>
       <w:r>
-        <w:t>read, filter, and upload qualitative evidence</w:t>
+        <w:t>participant review where source data supports it</w:t>
+      </w:r>
+    </w:p>
+    <w:p>
+      <w:pPr>
+        <w:pStyle w:val="ManualBullet"/>
+      </w:pPr>
+      <w:r>
+        <w:t>medical and emergency information where available</w:t>
       </w:r>
     </w:p>
     <w:p/>
     <w:p>
       <w:pPr>
+        <w:pStyle w:val="Heading2"/>
+      </w:pPr>
+      <w:r>
+        <w:t>Funder Dashboard</w:t>
+      </w:r>
+    </w:p>
+    <w:p>
+      <w:r>
+        <w:t>Use this for:</w:t>
+      </w:r>
+    </w:p>
+    <w:p/>
+    <w:p>
+      <w:pPr>
+        <w:pStyle w:val="ManualBullet"/>
+      </w:pPr>
+      <w:r>
+        <w:t>checking what funder-facing users will see</w:t>
+      </w:r>
+    </w:p>
+    <w:p>
+      <w:pPr>
+        <w:pStyle w:val="ManualBullet"/>
+      </w:pPr>
+      <w:r>
+        <w:t>sponsor or funder reporting review</w:t>
+      </w:r>
+    </w:p>
+    <w:p/>
+    <w:p>
+      <w:pPr>
+        <w:pStyle w:val="Heading2"/>
+      </w:pPr>
+      <w:r>
+        <w:t>Case Studies</w:t>
+      </w:r>
+    </w:p>
+    <w:p>
+      <w:r>
+        <w:t>Use this for:</w:t>
+      </w:r>
+    </w:p>
+    <w:p/>
+    <w:p>
+      <w:pPr>
+        <w:pStyle w:val="ManualBullet"/>
+      </w:pPr>
+      <w:r>
+        <w:t>reading existing stories</w:t>
+      </w:r>
+    </w:p>
+    <w:p>
+      <w:pPr>
+        <w:pStyle w:val="ManualBullet"/>
+      </w:pPr>
+      <w:r>
+        <w:t>filtering by date and region</w:t>
+      </w:r>
+    </w:p>
+    <w:p>
+      <w:pPr>
+        <w:pStyle w:val="ManualBullet"/>
+      </w:pPr>
+      <w:r>
+        <w:t>adding new stories and testimonials</w:t>
+      </w:r>
+    </w:p>
+    <w:p/>
+    <w:p>
+      <w:pPr>
         <w:pStyle w:val="Heading1"/>
       </w:pPr>
       <w:r>
-        <w:t>9. Recommended admin operating pattern</w:t>
+        <w:t>9. Recommended way of working</w:t>
       </w:r>
     </w:p>
     <w:p>
@@ -1570,7 +1780,7 @@
         <w:pStyle w:val="ManualNumber"/>
       </w:pPr>
       <w:r>
-        <w:t>Make user-access changes with a clear reason recorded.</w:t>
+        <w:t>Record a clear reason before changing access or deleting a user.</w:t>
       </w:r>
     </w:p>
     <w:p>
@@ -1578,15 +1788,7 @@
         <w:pStyle w:val="ManualNumber"/>
       </w:pPr>
       <w:r>
-        <w:t>Validate suspicious numbers in KPI or Custom Reports before responding to stakeholders.</w:t>
-      </w:r>
-    </w:p>
-    <w:p>
-      <w:pPr>
-        <w:pStyle w:val="ManualNumber"/>
-      </w:pPr>
-      <w:r>
-        <w:t>Review audit logs if the history of an issue is unclear.</w:t>
+        <w:t>Check the audit log if you are unsure what has already happened.</w:t>
       </w:r>
     </w:p>
     <w:p/>
@@ -1611,7 +1813,7 @@
         <w:pStyle w:val="ManualBullet"/>
       </w:pPr>
       <w:r>
-        <w:t>check the admin Supabase secrets and service-role configuration</w:t>
+        <w:t>check the Admin Supabase settings</w:t>
       </w:r>
     </w:p>
     <w:p>
@@ -1619,7 +1821,7 @@
         <w:pStyle w:val="ManualBullet"/>
       </w:pPr>
       <w:r>
-        <w:t>confirm the application has the required admin credentials loaded</w:t>
+        <w:t>confirm the service-role configuration is loaded correctly</w:t>
       </w:r>
     </w:p>
     <w:p/>
@@ -1628,7 +1830,7 @@
         <w:pStyle w:val="Heading2"/>
       </w:pPr>
       <w:r>
-        <w:t>Sync appears stuck</w:t>
+        <w:t>Sync looks stuck</w:t>
       </w:r>
     </w:p>
     <w:p>
@@ -1653,7 +1855,7 @@
         <w:t>Stop Manual API Sync</w:t>
       </w:r>
       <w:r>
-        <w:t xml:space="preserve"> if a manual run is genuinely hung</w:t>
+        <w:t xml:space="preserve"> only when needed</w:t>
       </w:r>
     </w:p>
     <w:p>
@@ -1670,7 +1872,7 @@
         <w:t>Clear Stuck Sync</w:t>
       </w:r>
       <w:r>
-        <w:t xml:space="preserve"> only after confirming the process is not still active</w:t>
+        <w:t xml:space="preserve"> only after checking nothing is still running</w:t>
       </w:r>
     </w:p>
     <w:p/>
@@ -1679,7 +1881,7 @@
         <w:pStyle w:val="Heading2"/>
       </w:pPr>
       <w:r>
-        <w:t>Users cannot sign in</w:t>
+        <w:t>A user cannot sign in</w:t>
       </w:r>
     </w:p>
     <w:p>
@@ -1687,7 +1889,7 @@
         <w:pStyle w:val="ManualBullet"/>
       </w:pPr>
       <w:r>
-        <w:t>check whether there is a pending reset request</w:t>
+        <w:t>check whether they requested a password reset</w:t>
       </w:r>
     </w:p>
     <w:p>
@@ -1703,7 +1905,7 @@
         <w:pStyle w:val="ManualBullet"/>
       </w:pPr>
       <w:r>
-        <w:t>confirm the account still has a valid role assignment</w:t>
+        <w:t>check that the user still has the correct role</w:t>
       </w:r>
     </w:p>
     <w:p/>
@@ -1712,7 +1914,7 @@
         <w:pStyle w:val="Heading2"/>
       </w:pPr>
       <w:r>
-        <w:t>Dashboard data looks out of date</w:t>
+        <w:t>The dashboard looks out of date</w:t>
       </w:r>
     </w:p>
     <w:p>
@@ -1748,7 +1950,7 @@
         <w:pStyle w:val="ManualBullet"/>
       </w:pPr>
       <w:r>
-        <w:t>run a smoke test, then a manual sync if needed</w:t>
+        <w:t>run a smoke test and then a manual sync if needed</w:t>
       </w:r>
     </w:p>
     <w:p/>
@@ -1757,7 +1959,7 @@
         <w:pStyle w:val="Heading2"/>
       </w:pPr>
       <w:r>
-        <w:t>A user asks for more access</w:t>
+        <w:t>Someone needs different access</w:t>
       </w:r>
     </w:p>
     <w:p>
@@ -1765,7 +1967,7 @@
         <w:pStyle w:val="ManualBullet"/>
       </w:pPr>
       <w:r>
-        <w:t>review whether a role change is sufficient</w:t>
+        <w:t>update the role instead of deleting the account</w:t>
       </w:r>
     </w:p>
     <w:p>
@@ -1773,7 +1975,7 @@
         <w:pStyle w:val="ManualBullet"/>
       </w:pPr>
       <w:r>
-        <w:t>apply least privilege</w:t>
+        <w:t>use least privilege</w:t>
       </w:r>
     </w:p>
     <w:p>
@@ -1781,7 +1983,7 @@
         <w:pStyle w:val="ManualBullet"/>
       </w:pPr>
       <w:r>
-        <w:t>record the reason in the audit trail</w:t>
+        <w:t>record the reason for the change</w:t>
       </w:r>
     </w:p>
     <w:sectPr>

</xml_diff>

<commit_message>
Export updated guides to docx
</commit_message>
<xml_diff>
--- a/docs/manuals/docx/ADMIN-MANUAL.docx
+++ b/docs/manuals/docx/ADMIN-MANUAL.docx
@@ -27,7 +27,7 @@
     </w:p>
     <w:p>
       <w:r>
-        <w:t>Scope: user accounts, data refresh, audit review, and full reporting access</w:t>
+        <w:t>Scope: user accounts, password resets, data refresh, audit review, and full reporting access</w:t>
       </w:r>
     </w:p>
     <w:p/>
@@ -73,73 +73,33 @@
         <w:pStyle w:val="Heading1"/>
       </w:pPr>
       <w:r>
-        <w:t>1. About this guide</w:t>
-      </w:r>
-    </w:p>
-    <w:p>
-      <w:r>
-        <w:t>This guide explains how to use the dashboard as an Admin.</w:t>
+        <w:t>1. Introduction</w:t>
+      </w:r>
+    </w:p>
+    <w:p>
+      <w:r>
+        <w:t xml:space="preserve">This manual explains how to use the dashboard as an </w:t>
+      </w:r>
+      <w:r>
+        <w:rPr>
+          <w:rFonts w:ascii="Consolas" w:hAnsi="Consolas"/>
+        </w:rPr>
+        <w:t>Admin</w:t>
+      </w:r>
+      <w:r>
+        <w:t>.</w:t>
       </w:r>
     </w:p>
     <w:p/>
     <w:p>
       <w:r>
-        <w:t>Admins have the widest level of access in the system. You are responsible for:</w:t>
+        <w:t>Admins are responsible for keeping the system working safely and making sure the right people have the right access.</w:t>
       </w:r>
     </w:p>
     <w:p/>
     <w:p>
-      <w:pPr>
-        <w:pStyle w:val="ManualBullet"/>
-      </w:pPr>
-      <w:r>
-        <w:t>creating and updating user accounts</w:t>
-      </w:r>
-    </w:p>
-    <w:p>
-      <w:pPr>
-        <w:pStyle w:val="ManualBullet"/>
-      </w:pPr>
-      <w:r>
-        <w:t>handling password reset requests</w:t>
-      </w:r>
-    </w:p>
-    <w:p>
-      <w:pPr>
-        <w:pStyle w:val="ManualBullet"/>
-      </w:pPr>
-      <w:r>
-        <w:t>changing user roles and access</w:t>
-      </w:r>
-    </w:p>
-    <w:p>
-      <w:pPr>
-        <w:pStyle w:val="ManualBullet"/>
-      </w:pPr>
-      <w:r>
-        <w:t>checking whether data is up to date</w:t>
-      </w:r>
-    </w:p>
-    <w:p>
-      <w:pPr>
-        <w:pStyle w:val="ManualBullet"/>
-      </w:pPr>
-      <w:r>
-        <w:t>running manual refresh actions when needed</w:t>
-      </w:r>
-    </w:p>
-    <w:p>
-      <w:pPr>
-        <w:pStyle w:val="ManualBullet"/>
-      </w:pPr>
-      <w:r>
-        <w:t>reviewing audit history</w:t>
-      </w:r>
-    </w:p>
-    <w:p/>
-    <w:p>
-      <w:r>
-        <w:t>Available views:</w:t>
+      <w:r>
+        <w:t>Admin users can open:</w:t>
       </w:r>
     </w:p>
     <w:p/>
@@ -195,6 +155,17 @@
         <w:rPr>
           <w:rFonts w:ascii="Consolas" w:hAnsi="Consolas"/>
         </w:rPr>
+        <w:t>Data Request Form</w:t>
+      </w:r>
+    </w:p>
+    <w:p>
+      <w:pPr>
+        <w:pStyle w:val="ManualBullet"/>
+      </w:pPr>
+      <w:r>
+        <w:rPr>
+          <w:rFonts w:ascii="Consolas" w:hAnsi="Consolas"/>
+        </w:rPr>
         <w:t>Funder Dashboard</w:t>
       </w:r>
     </w:p>
@@ -211,25 +182,125 @@
     </w:p>
     <w:p/>
     <w:p>
+      <w:r>
+        <w:t>Admin access should be used carefully. Many actions affect other users. Some actions affect the whole dataset or the overall health of the dashboard.</w:t>
+      </w:r>
+    </w:p>
+    <w:p/>
+    <w:p>
       <w:pPr>
         <w:pStyle w:val="Heading1"/>
       </w:pPr>
       <w:r>
-        <w:t>2. Before you make changes</w:t>
-      </w:r>
-    </w:p>
-    <w:p>
-      <w:r>
-        <w:t>Use this quick checklist before changing anything important.</w:t>
+        <w:t>2. What the Admin role is for</w:t>
+      </w:r>
+    </w:p>
+    <w:p>
+      <w:r>
+        <w:t xml:space="preserve">The </w:t>
+      </w:r>
+      <w:r>
+        <w:rPr>
+          <w:rFonts w:ascii="Consolas" w:hAnsi="Consolas"/>
+        </w:rPr>
+        <w:t>Admin</w:t>
+      </w:r>
+      <w:r>
+        <w:t xml:space="preserve"> role is designed for:</w:t>
       </w:r>
     </w:p>
     <w:p/>
     <w:p>
       <w:pPr>
+        <w:pStyle w:val="ManualBullet"/>
+      </w:pPr>
+      <w:r>
+        <w:t>user account management</w:t>
+      </w:r>
+    </w:p>
+    <w:p>
+      <w:pPr>
+        <w:pStyle w:val="ManualBullet"/>
+      </w:pPr>
+      <w:r>
+        <w:t>role assignment</w:t>
+      </w:r>
+    </w:p>
+    <w:p>
+      <w:pPr>
+        <w:pStyle w:val="ManualBullet"/>
+      </w:pPr>
+      <w:r>
+        <w:t>password support</w:t>
+      </w:r>
+    </w:p>
+    <w:p>
+      <w:pPr>
+        <w:pStyle w:val="ManualBullet"/>
+      </w:pPr>
+      <w:r>
+        <w:t>sync monitoring</w:t>
+      </w:r>
+    </w:p>
+    <w:p>
+      <w:pPr>
+        <w:pStyle w:val="ManualBullet"/>
+      </w:pPr>
+      <w:r>
+        <w:t>manual sync actions</w:t>
+      </w:r>
+    </w:p>
+    <w:p>
+      <w:pPr>
+        <w:pStyle w:val="ManualBullet"/>
+      </w:pPr>
+      <w:r>
+        <w:t>controlled data maintenance</w:t>
+      </w:r>
+    </w:p>
+    <w:p>
+      <w:pPr>
+        <w:pStyle w:val="ManualBullet"/>
+      </w:pPr>
+      <w:r>
+        <w:t>audit review</w:t>
+      </w:r>
+    </w:p>
+    <w:p>
+      <w:pPr>
+        <w:pStyle w:val="ManualBullet"/>
+      </w:pPr>
+      <w:r>
+        <w:t>support investigations</w:t>
+      </w:r>
+    </w:p>
+    <w:p/>
+    <w:p>
+      <w:r>
+        <w:t>The Admin role is not simply a stronger reporting role. It is an operational support role with governance responsibility.</w:t>
+      </w:r>
+    </w:p>
+    <w:p/>
+    <w:p>
+      <w:pPr>
+        <w:pStyle w:val="Heading1"/>
+      </w:pPr>
+      <w:r>
+        <w:t>3. Before you make changes</w:t>
+      </w:r>
+    </w:p>
+    <w:p>
+      <w:r>
+        <w:t>Before making any important change:</w:t>
+      </w:r>
+    </w:p>
+    <w:p/>
+    <w:p>
+      <w:pPr>
         <w:pStyle w:val="ManualNumber"/>
       </w:pPr>
       <w:r>
-        <w:t>Make sure you are signed in with your own Admin account.</w:t>
+        <w:t>Confirm that you are signed in with your own named Admin account.</w:t>
       </w:r>
     </w:p>
     <w:p>
@@ -237,7 +308,7 @@
         <w:pStyle w:val="ManualNumber"/>
       </w:pPr>
       <w:r>
-        <w:t xml:space="preserve">Check the </w:t>
+        <w:t xml:space="preserve">Check </w:t>
       </w:r>
       <w:r>
         <w:rPr>
@@ -246,7 +317,7 @@
         <w:t>Last Data Refresh</w:t>
       </w:r>
       <w:r>
-        <w:t xml:space="preserve"> time in the sidebar.</w:t>
+        <w:t>.</w:t>
       </w:r>
     </w:p>
     <w:p>
@@ -254,7 +325,7 @@
         <w:pStyle w:val="ManualNumber"/>
       </w:pPr>
       <w:r>
-        <w:t>Be clear about why you are making the change.</w:t>
+        <w:t>Be clear about what problem you are solving.</w:t>
       </w:r>
     </w:p>
     <w:p>
@@ -262,7 +333,7 @@
         <w:pStyle w:val="ManualNumber"/>
       </w:pPr>
       <w:r>
-        <w:t>Choose the smallest action that solves the problem.</w:t>
+        <w:t>Use the smallest action that solves it.</w:t>
       </w:r>
     </w:p>
     <w:p>
@@ -270,7 +341,46 @@
         <w:pStyle w:val="ManualNumber"/>
       </w:pPr>
       <w:r>
-        <w:t>Be especially careful when deleting users or resetting data.</w:t>
+        <w:t>Record a clear reason for any significant access change or destructive action.</w:t>
+      </w:r>
+    </w:p>
+    <w:p/>
+    <w:p>
+      <w:r>
+        <w:t>Good Admin habits:</w:t>
+      </w:r>
+    </w:p>
+    <w:p/>
+    <w:p>
+      <w:pPr>
+        <w:pStyle w:val="ManualBullet"/>
+      </w:pPr>
+      <w:r>
+        <w:t>avoid shared accounts</w:t>
+      </w:r>
+    </w:p>
+    <w:p>
+      <w:pPr>
+        <w:pStyle w:val="ManualBullet"/>
+      </w:pPr>
+      <w:r>
+        <w:t>avoid deleting users unless removal is genuinely required</w:t>
+      </w:r>
+    </w:p>
+    <w:p>
+      <w:pPr>
+        <w:pStyle w:val="ManualBullet"/>
+      </w:pPr>
+      <w:r>
+        <w:t>prefer updating an existing user rather than recreating them</w:t>
+      </w:r>
+    </w:p>
+    <w:p>
+      <w:pPr>
+        <w:pStyle w:val="ManualBullet"/>
+      </w:pPr>
+      <w:r>
+        <w:t>check the audit log if you are not sure what already happened</w:t>
       </w:r>
     </w:p>
     <w:p/>
@@ -316,7 +426,7 @@
         <w:pStyle w:val="Heading1"/>
       </w:pPr>
       <w:r>
-        <w:t>3. Signing in</w:t>
+        <w:t>4. Signing in and moving around</w:t>
       </w:r>
     </w:p>
     <w:p>
@@ -340,7 +450,7 @@
         <w:pStyle w:val="ManualNumber"/>
       </w:pPr>
       <w:r>
-        <w:t>Change your password if the system asks you to do so.</w:t>
+        <w:t>Change your password if prompted.</w:t>
       </w:r>
     </w:p>
     <w:p>
@@ -363,7 +473,7 @@
     <w:p/>
     <w:p>
       <w:r>
-        <w:t xml:space="preserve">If you see </w:t>
+        <w:t xml:space="preserve">If you see a message such as </w:t>
       </w:r>
       <w:r>
         <w:rPr>
@@ -372,7 +482,7 @@
         <w:t>Admin client not available</w:t>
       </w:r>
       <w:r>
-        <w:t>, the system is missing some Admin configuration and should be checked before you continue.</w:t>
+        <w:t>, some Admin configuration is missing. In that situation, user-management functions may not work correctly and should be checked before you continue.</w:t>
       </w:r>
     </w:p>
     <w:p/>
@@ -381,7 +491,7 @@
         <w:pStyle w:val="Heading1"/>
       </w:pPr>
       <w:r>
-        <w:t>4. Main areas of the Admin Dashboard</w:t>
+        <w:t>5. Main areas of the Admin Dashboard</w:t>
       </w:r>
     </w:p>
     <w:p>
@@ -395,13 +505,13 @@
         <w:t>Admin Dashboard</w:t>
       </w:r>
       <w:r>
-        <w:t xml:space="preserve"> is the control area for running the system.</w:t>
+        <w:t xml:space="preserve"> is the control centre for administration and support.</w:t>
       </w:r>
     </w:p>
     <w:p/>
     <w:p>
       <w:r>
-        <w:t>Main sections:</w:t>
+        <w:t>Main sections usually include:</w:t>
       </w:r>
     </w:p>
     <w:p/>
@@ -476,7 +586,7 @@
         <w:pStyle w:val="ManualBullet"/>
       </w:pPr>
       <w:r>
-        <w:t>data reset actions</w:t>
+        <w:t>reset or rebuild actions</w:t>
       </w:r>
     </w:p>
     <w:p>
@@ -492,11 +602,42 @@
     </w:p>
     <w:p/>
     <w:p>
+      <w:r>
+        <w:t>Think of the page in three broad areas:</w:t>
+      </w:r>
+    </w:p>
+    <w:p/>
+    <w:p>
+      <w:pPr>
+        <w:pStyle w:val="ManualNumber"/>
+      </w:pPr>
+      <w:r>
+        <w:t>user access and security</w:t>
+      </w:r>
+    </w:p>
+    <w:p>
+      <w:pPr>
+        <w:pStyle w:val="ManualNumber"/>
+      </w:pPr>
+      <w:r>
+        <w:t>sync and data operations</w:t>
+      </w:r>
+    </w:p>
+    <w:p>
+      <w:pPr>
+        <w:pStyle w:val="ManualNumber"/>
+      </w:pPr>
+      <w:r>
+        <w:t>audit and investigation</w:t>
+      </w:r>
+    </w:p>
+    <w:p/>
+    <w:p>
       <w:pPr>
         <w:pStyle w:val="Heading1"/>
       </w:pPr>
       <w:r>
-        <w:t>5. User management</w:t>
+        <w:t>6. Password reset requests</w:t>
       </w:r>
     </w:p>
     <w:p>
@@ -504,12 +645,21 @@
         <w:pStyle w:val="Heading2"/>
       </w:pPr>
       <w:r>
-        <w:t>5.1 Handle a password reset request</w:t>
-      </w:r>
-    </w:p>
-    <w:p>
-      <w:r>
-        <w:t xml:space="preserve">Use this when a user has clicked </w:t>
+        <w:t>6.1 When to use this section</w:t>
+      </w:r>
+    </w:p>
+    <w:p>
+      <w:r>
+        <w:t xml:space="preserve">Use </w:t>
+      </w:r>
+      <w:r>
+        <w:rPr>
+          <w:rFonts w:ascii="Consolas" w:hAnsi="Consolas"/>
+        </w:rPr>
+        <w:t>Password Reset Requests</w:t>
+      </w:r>
+      <w:r>
+        <w:t xml:space="preserve"> when a user has triggered </w:t>
       </w:r>
       <w:r>
         <w:rPr>
@@ -518,10 +668,18 @@
         <w:t>Forgot password?</w:t>
       </w:r>
       <w:r>
-        <w:t>.</w:t>
+        <w:t xml:space="preserve"> and cannot complete sign-in.</w:t>
       </w:r>
     </w:p>
     <w:p/>
+    <w:p>
+      <w:pPr>
+        <w:pStyle w:val="Heading2"/>
+      </w:pPr>
+      <w:r>
+        <w:t>6.2 Step-by-step reset workflow</w:t>
+      </w:r>
+    </w:p>
     <w:p>
       <w:pPr>
         <w:pStyle w:val="ManualNumber"/>
@@ -544,7 +702,7 @@
         <w:pStyle w:val="ManualNumber"/>
       </w:pPr>
       <w:r>
-        <w:t>Choose the user’s email address.</w:t>
+        <w:t>Select the user's email address from the pending list.</w:t>
       </w:r>
     </w:p>
     <w:p>
@@ -577,13 +735,21 @@
         <w:pStyle w:val="ManualNumber"/>
       </w:pPr>
       <w:r>
-        <w:t>Tell the user to sign in and change the password straight away.</w:t>
+        <w:t>Tell the user to sign in and change the password immediately.</w:t>
       </w:r>
     </w:p>
     <w:p/>
     <w:p>
-      <w:r>
-        <w:t>What happens next:</w:t>
+      <w:pPr>
+        <w:pStyle w:val="Heading2"/>
+      </w:pPr>
+      <w:r>
+        <w:t>6.3 What should happen next</w:t>
+      </w:r>
+    </w:p>
+    <w:p>
+      <w:r>
+        <w:t>After a successful reset:</w:t>
       </w:r>
     </w:p>
     <w:p/>
@@ -592,7 +758,7 @@
         <w:pStyle w:val="ManualBullet"/>
       </w:pPr>
       <w:r>
-        <w:t>the reset request is marked as completed</w:t>
+        <w:t>the reset request should be marked as completed</w:t>
       </w:r>
     </w:p>
     <w:p>
@@ -600,7 +766,7 @@
         <w:pStyle w:val="ManualBullet"/>
       </w:pPr>
       <w:r>
-        <w:t>the user is asked to change the password at next sign-in</w:t>
+        <w:t>the user should be prompted to change password at next sign-in</w:t>
       </w:r>
     </w:p>
     <w:p>
@@ -608,7 +774,7 @@
         <w:pStyle w:val="ManualBullet"/>
       </w:pPr>
       <w:r>
-        <w:t>the action is recorded in the audit log</w:t>
+        <w:t>the action should be recorded in the audit log</w:t>
       </w:r>
     </w:p>
     <w:p/>
@@ -617,7 +783,87 @@
         <w:pStyle w:val="Heading2"/>
       </w:pPr>
       <w:r>
-        <w:t>5.2 Create a new user</w:t>
+        <w:t>6.4 Good practice</w:t>
+      </w:r>
+    </w:p>
+    <w:p>
+      <w:pPr>
+        <w:pStyle w:val="ManualBullet"/>
+      </w:pPr>
+      <w:r>
+        <w:t>use a temporary password that is strong but can still be communicated safely</w:t>
+      </w:r>
+    </w:p>
+    <w:p>
+      <w:pPr>
+        <w:pStyle w:val="ManualBullet"/>
+      </w:pPr>
+      <w:r>
+        <w:t>avoid sending repeated resets unless necessary</w:t>
+      </w:r>
+    </w:p>
+    <w:p>
+      <w:pPr>
+        <w:pStyle w:val="ManualBullet"/>
+      </w:pPr>
+      <w:r>
+        <w:t>if the same user needs multiple resets, investigate whether there is a wider login problem</w:t>
+      </w:r>
+    </w:p>
+    <w:p/>
+    <w:p>
+      <w:pPr>
+        <w:pStyle w:val="Heading1"/>
+      </w:pPr>
+      <w:r>
+        <w:t>7. Creating a new user</w:t>
+      </w:r>
+    </w:p>
+    <w:p>
+      <w:pPr>
+        <w:pStyle w:val="Heading2"/>
+      </w:pPr>
+      <w:r>
+        <w:t>7.1 When to create a new account</w:t>
+      </w:r>
+    </w:p>
+    <w:p>
+      <w:r>
+        <w:t>Create a new account when:</w:t>
+      </w:r>
+    </w:p>
+    <w:p/>
+    <w:p>
+      <w:pPr>
+        <w:pStyle w:val="ManualBullet"/>
+      </w:pPr>
+      <w:r>
+        <w:t>a new staff member needs access</w:t>
+      </w:r>
+    </w:p>
+    <w:p>
+      <w:pPr>
+        <w:pStyle w:val="ManualBullet"/>
+      </w:pPr>
+      <w:r>
+        <w:t>an existing person needs a separate account</w:t>
+      </w:r>
+    </w:p>
+    <w:p>
+      <w:pPr>
+        <w:pStyle w:val="ManualBullet"/>
+      </w:pPr>
+      <w:r>
+        <w:t>a new funder contact needs a restricted reporting account</w:t>
+      </w:r>
+    </w:p>
+    <w:p/>
+    <w:p>
+      <w:pPr>
+        <w:pStyle w:val="Heading2"/>
+      </w:pPr>
+      <w:r>
+        <w:t>7.2 Step-by-step workflow</w:t>
       </w:r>
     </w:p>
     <w:p>
@@ -642,7 +888,7 @@
         <w:pStyle w:val="ManualNumber"/>
       </w:pPr>
       <w:r>
-        <w:t>Enter the person’s full name.</w:t>
+        <w:t>Enter the person's full name.</w:t>
       </w:r>
     </w:p>
     <w:p>
@@ -666,7 +912,7 @@
         <w:pStyle w:val="ManualNumber"/>
       </w:pPr>
       <w:r>
-        <w:t>Choose one or more roles.</w:t>
+        <w:t>Choose the role or roles.</w:t>
       </w:r>
     </w:p>
     <w:p>
@@ -674,7 +920,7 @@
         <w:pStyle w:val="ManualNumber"/>
       </w:pPr>
       <w:r>
-        <w:t>Choose a region from the dropdown if the user is not a funder.</w:t>
+        <w:t>If the user is not a funder, choose the correct region.</w:t>
       </w:r>
     </w:p>
     <w:p>
@@ -682,7 +928,7 @@
         <w:pStyle w:val="ManualNumber"/>
       </w:pPr>
       <w:r>
-        <w:t>If the user is a funder, choose the funder name or enter one manually.</w:t>
+        <w:t>If the user is a funder, choose or enter the correct funder name.</w:t>
       </w:r>
     </w:p>
     <w:p>
@@ -702,18 +948,119 @@
         <w:t>.</w:t>
       </w:r>
     </w:p>
+    <w:p>
+      <w:pPr>
+        <w:pStyle w:val="ManualNumber"/>
+      </w:pPr>
+      <w:r>
+        <w:t>Confirm the creation result.</w:t>
+      </w:r>
+    </w:p>
     <w:p/>
     <w:p>
-      <w:r>
-        <w:t>Good practice:</w:t>
+      <w:pPr>
+        <w:pStyle w:val="Heading2"/>
+      </w:pPr>
+      <w:r>
+        <w:t>7.3 Choosing the correct role</w:t>
+      </w:r>
+    </w:p>
+    <w:p>
+      <w:r>
+        <w:t>Use least privilege.</w:t>
       </w:r>
     </w:p>
     <w:p/>
     <w:p>
+      <w:r>
+        <w:t>Typical role choices:</w:t>
+      </w:r>
+    </w:p>
+    <w:p/>
+    <w:p>
       <w:pPr>
         <w:pStyle w:val="ManualBullet"/>
       </w:pPr>
       <w:r>
+        <w:rPr>
+          <w:rFonts w:ascii="Consolas" w:hAnsi="Consolas"/>
+        </w:rPr>
+        <w:t>RPL</w:t>
+      </w:r>
+      <w:r>
+        <w:t xml:space="preserve"> for summary reporting and regional monitoring</w:t>
+      </w:r>
+    </w:p>
+    <w:p>
+      <w:pPr>
+        <w:pStyle w:val="ManualBullet"/>
+      </w:pPr>
+      <w:r>
+        <w:rPr>
+          <w:rFonts w:ascii="Consolas" w:hAnsi="Consolas"/>
+        </w:rPr>
+        <w:t>Manager</w:t>
+      </w:r>
+      <w:r>
+        <w:t xml:space="preserve"> for operational review across multiple views</w:t>
+      </w:r>
+    </w:p>
+    <w:p>
+      <w:pPr>
+        <w:pStyle w:val="ManualBullet"/>
+      </w:pPr>
+      <w:r>
+        <w:rPr>
+          <w:rFonts w:ascii="Consolas" w:hAnsi="Consolas"/>
+        </w:rPr>
+        <w:t>ML</w:t>
+      </w:r>
+      <w:r>
+        <w:t xml:space="preserve"> for event-by-event delivery work</w:t>
+      </w:r>
+    </w:p>
+    <w:p>
+      <w:pPr>
+        <w:pStyle w:val="ManualBullet"/>
+      </w:pPr>
+      <w:r>
+        <w:rPr>
+          <w:rFonts w:ascii="Consolas" w:hAnsi="Consolas"/>
+        </w:rPr>
+        <w:t>Funder</w:t>
+      </w:r>
+      <w:r>
+        <w:t xml:space="preserve"> for restricted summary access</w:t>
+      </w:r>
+    </w:p>
+    <w:p>
+      <w:pPr>
+        <w:pStyle w:val="ManualBullet"/>
+      </w:pPr>
+      <w:r>
+        <w:rPr>
+          <w:rFonts w:ascii="Consolas" w:hAnsi="Consolas"/>
+        </w:rPr>
+        <w:t>Admin</w:t>
+      </w:r>
+      <w:r>
+        <w:t xml:space="preserve"> only for people who genuinely need administrative control</w:t>
+      </w:r>
+    </w:p>
+    <w:p/>
+    <w:p>
+      <w:pPr>
+        <w:pStyle w:val="Heading2"/>
+      </w:pPr>
+      <w:r>
+        <w:t>7.4 Good practice</w:t>
+      </w:r>
+    </w:p>
+    <w:p>
+      <w:pPr>
+        <w:pStyle w:val="ManualBullet"/>
+      </w:pPr>
+      <w:r>
         <w:t>use a named work email where possible</w:t>
       </w:r>
     </w:p>
@@ -730,16 +1077,32 @@
         <w:pStyle w:val="ManualBullet"/>
       </w:pPr>
       <w:r>
-        <w:t>give the lowest level of access the person needs</w:t>
+        <w:t>check the region carefully</w:t>
+      </w:r>
+    </w:p>
+    <w:p>
+      <w:pPr>
+        <w:pStyle w:val="ManualBullet"/>
+      </w:pPr>
+      <w:r>
+        <w:t>check funder mapping carefully for funder users</w:t>
+      </w:r>
+    </w:p>
+    <w:p>
+      <w:pPr>
+        <w:pStyle w:val="ManualBullet"/>
+      </w:pPr>
+      <w:r>
+        <w:t>review the saved record after creation</w:t>
       </w:r>
     </w:p>
     <w:p/>
     <w:p>
       <w:pPr>
-        <w:pStyle w:val="Heading2"/>
-      </w:pPr>
-      <w:r>
-        <w:t>5.3 Update an existing user</w:t>
+        <w:pStyle w:val="Heading1"/>
+      </w:pPr>
+      <w:r>
+        <w:t>8. Updating an existing user</w:t>
       </w:r>
     </w:p>
     <w:p>
@@ -753,13 +1116,13 @@
         <w:t>Existing Users &amp; Actions</w:t>
       </w:r>
       <w:r>
-        <w:t xml:space="preserve"> area lets you update a user without deleting and recreating the account.</w:t>
+        <w:t xml:space="preserve"> area lets you manage current users without deleting and recreating them.</w:t>
       </w:r>
     </w:p>
     <w:p/>
     <w:p>
       <w:r>
-        <w:t>You can:</w:t>
+        <w:t>You can usually:</w:t>
       </w:r>
     </w:p>
     <w:p/>
@@ -784,7 +1147,7 @@
         <w:pStyle w:val="ManualBullet"/>
       </w:pPr>
       <w:r>
-        <w:t>update name, email, and region</w:t>
+        <w:t>update user details</w:t>
       </w:r>
     </w:p>
     <w:p>
@@ -801,26 +1164,21 @@
         <w:pStyle w:val="Heading2"/>
       </w:pPr>
       <w:r>
-        <w:t>5.4 Reset a password manually</w:t>
-      </w:r>
-    </w:p>
-    <w:p>
-      <w:pPr>
-        <w:pStyle w:val="ManualNumber"/>
-      </w:pPr>
-      <w:r>
-        <w:t xml:space="preserve">Go to </w:t>
-      </w:r>
-      <w:r>
-        <w:rPr>
-          <w:rFonts w:ascii="Consolas" w:hAnsi="Consolas"/>
-        </w:rPr>
-        <w:t>Existing Users &amp; Actions</w:t>
-      </w:r>
-      <w:r>
-        <w:t>.</w:t>
-      </w:r>
-    </w:p>
+        <w:t>8.1 Reset Password</w:t>
+      </w:r>
+    </w:p>
+    <w:p>
+      <w:r>
+        <w:t>Use this when the user needs immediate access help and the self-service route is not enough.</w:t>
+      </w:r>
+    </w:p>
+    <w:p/>
+    <w:p>
+      <w:r>
+        <w:t>Steps:</w:t>
+      </w:r>
+    </w:p>
+    <w:p/>
     <w:p>
       <w:pPr>
         <w:pStyle w:val="ManualNumber"/>
@@ -851,7 +1209,7 @@
         <w:pStyle w:val="ManualNumber"/>
       </w:pPr>
       <w:r>
-        <w:t>Enter the new temporary password.</w:t>
+        <w:t>Enter the temporary password.</w:t>
       </w:r>
     </w:p>
     <w:p>
@@ -862,21 +1220,35 @@
         <w:t>Apply the change.</w:t>
       </w:r>
     </w:p>
+    <w:p>
+      <w:pPr>
+        <w:pStyle w:val="ManualNumber"/>
+      </w:pPr>
+      <w:r>
+        <w:t>Tell the user to change the password after sign-in.</w:t>
+      </w:r>
+    </w:p>
     <w:p/>
     <w:p>
-      <w:r>
-        <w:t>Use this when the normal self-service route is not enough.</w:t>
+      <w:pPr>
+        <w:pStyle w:val="Heading2"/>
+      </w:pPr>
+      <w:r>
+        <w:t>8.2 Update Role</w:t>
+      </w:r>
+    </w:p>
+    <w:p>
+      <w:r>
+        <w:t>Use this when a user's job changes or they need different access.</w:t>
       </w:r>
     </w:p>
     <w:p/>
     <w:p>
-      <w:pPr>
-        <w:pStyle w:val="Heading2"/>
-      </w:pPr>
-      <w:r>
-        <w:t>5.5 Update a user’s role</w:t>
-      </w:r>
-    </w:p>
+      <w:r>
+        <w:t>Steps:</w:t>
+      </w:r>
+    </w:p>
+    <w:p/>
     <w:p>
       <w:pPr>
         <w:pStyle w:val="ManualNumber"/>
@@ -924,7 +1296,7 @@
         <w:t>Funder</w:t>
       </w:r>
       <w:r>
-        <w:t xml:space="preserve"> is selected, confirm the correct funder name.</w:t>
+        <w:t xml:space="preserve"> is included, confirm the funder name carefully.</w:t>
       </w:r>
     </w:p>
     <w:p>
@@ -940,7 +1312,7 @@
         <w:pStyle w:val="ManualNumber"/>
       </w:pPr>
       <w:r>
-        <w:t>Confirm the update.</w:t>
+        <w:t>Confirm the action.</w:t>
       </w:r>
     </w:p>
     <w:p>
@@ -962,13 +1334,56 @@
     </w:p>
     <w:p/>
     <w:p>
+      <w:r>
+        <w:t>Checks to make:</w:t>
+      </w:r>
+    </w:p>
+    <w:p/>
+    <w:p>
+      <w:pPr>
+        <w:pStyle w:val="ManualBullet"/>
+      </w:pPr>
+      <w:r>
+        <w:t>does the user still need their previous role</w:t>
+      </w:r>
+    </w:p>
+    <w:p>
+      <w:pPr>
+        <w:pStyle w:val="ManualBullet"/>
+      </w:pPr>
+      <w:r>
+        <w:t>is the requested access broader than necessary</w:t>
+      </w:r>
+    </w:p>
+    <w:p>
+      <w:pPr>
+        <w:pStyle w:val="ManualBullet"/>
+      </w:pPr>
+      <w:r>
+        <w:t>is the reason clear enough for later audit review</w:t>
+      </w:r>
+    </w:p>
+    <w:p/>
+    <w:p>
       <w:pPr>
         <w:pStyle w:val="Heading2"/>
       </w:pPr>
       <w:r>
-        <w:t>5.6 Update a user’s details</w:t>
-      </w:r>
-    </w:p>
+        <w:t>8.3 Update User Details</w:t>
+      </w:r>
+    </w:p>
+    <w:p>
+      <w:r>
+        <w:t>Use this when a name, email address, or region needs correction.</w:t>
+      </w:r>
+    </w:p>
+    <w:p/>
+    <w:p>
+      <w:r>
+        <w:t>Steps:</w:t>
+      </w:r>
+    </w:p>
+    <w:p/>
     <w:p>
       <w:pPr>
         <w:pStyle w:val="ManualNumber"/>
@@ -999,7 +1414,7 @@
         <w:pStyle w:val="ManualNumber"/>
       </w:pPr>
       <w:r>
-        <w:t>Update their full name if needed.</w:t>
+        <w:t>Edit the full name if needed.</w:t>
       </w:r>
     </w:p>
     <w:p>
@@ -1007,7 +1422,7 @@
         <w:pStyle w:val="ManualNumber"/>
       </w:pPr>
       <w:r>
-        <w:t>Update their email address if needed.</w:t>
+        <w:t>Edit the email address if needed.</w:t>
       </w:r>
     </w:p>
     <w:p>
@@ -1015,7 +1430,7 @@
         <w:pStyle w:val="ManualNumber"/>
       </w:pPr>
       <w:r>
-        <w:t>Update their region if needed.</w:t>
+        <w:t>Choose the correct region, or confirm the funder mapping for funder users.</w:t>
       </w:r>
     </w:p>
     <w:p>
@@ -1023,7 +1438,7 @@
         <w:pStyle w:val="ManualNumber"/>
       </w:pPr>
       <w:r>
-        <w:t>Enter the reason for the change.</w:t>
+        <w:t>Enter the reason for the update.</w:t>
       </w:r>
     </w:p>
     <w:p>
@@ -1031,7 +1446,7 @@
         <w:pStyle w:val="ManualNumber"/>
       </w:pPr>
       <w:r>
-        <w:t>Confirm the update.</w:t>
+        <w:t>Confirm the action.</w:t>
       </w:r>
     </w:p>
     <w:p>
@@ -1057,9 +1472,21 @@
         <w:pStyle w:val="Heading2"/>
       </w:pPr>
       <w:r>
-        <w:t>5.7 Delete a user</w:t>
-      </w:r>
-    </w:p>
+        <w:t>8.4 Delete User</w:t>
+      </w:r>
+    </w:p>
+    <w:p>
+      <w:r>
+        <w:t>Delete a user only when the person should no longer retain access at all.</w:t>
+      </w:r>
+    </w:p>
+    <w:p/>
+    <w:p>
+      <w:r>
+        <w:t>Steps:</w:t>
+      </w:r>
+    </w:p>
+    <w:p/>
     <w:p>
       <w:pPr>
         <w:pStyle w:val="ManualNumber"/>
@@ -1121,16 +1548,41 @@
     <w:p/>
     <w:p>
       <w:r>
-        <w:t>Delete a user only when they should no longer have access at all. If they still need access, a role or profile update is usually better.</w:t>
+        <w:t>Before deleting, ask:</w:t>
       </w:r>
     </w:p>
     <w:p/>
     <w:p>
       <w:pPr>
+        <w:pStyle w:val="ManualBullet"/>
+      </w:pPr>
+      <w:r>
+        <w:t>should the account be updated rather than deleted</w:t>
+      </w:r>
+    </w:p>
+    <w:p>
+      <w:pPr>
+        <w:pStyle w:val="ManualBullet"/>
+      </w:pPr>
+      <w:r>
+        <w:t>should the role simply be reduced</w:t>
+      </w:r>
+    </w:p>
+    <w:p>
+      <w:pPr>
+        <w:pStyle w:val="ManualBullet"/>
+      </w:pPr>
+      <w:r>
+        <w:t>is the reason clear enough for audit review</w:t>
+      </w:r>
+    </w:p>
+    <w:p/>
+    <w:p>
+      <w:pPr>
         <w:pStyle w:val="Heading1"/>
       </w:pPr>
       <w:r>
-        <w:t>6. Data refresh and sync checks</w:t>
+        <w:t>9. Sync Performance</w:t>
       </w:r>
     </w:p>
     <w:p>
@@ -1138,13 +1590,10 @@
         <w:pStyle w:val="Heading2"/>
       </w:pPr>
       <w:r>
-        <w:t>6.1 Sync Performance</w:t>
-      </w:r>
-    </w:p>
-    <w:p>
-      <w:r>
-        <w:t xml:space="preserve">Use </w:t>
-      </w:r>
+        <w:t>9.1 What this section is for</w:t>
+      </w:r>
+    </w:p>
+    <w:p>
       <w:r>
         <w:rPr>
           <w:rFonts w:ascii="Consolas" w:hAnsi="Consolas"/>
@@ -1152,13 +1601,13 @@
         <w:t>Sync Performance</w:t>
       </w:r>
       <w:r>
-        <w:t xml:space="preserve"> to check whether the system is healthy.</w:t>
+        <w:t xml:space="preserve"> helps you understand whether the data pipeline is healthy.</w:t>
       </w:r>
     </w:p>
     <w:p/>
     <w:p>
       <w:r>
-        <w:t>This section helps you review:</w:t>
+        <w:t>Use it when:</w:t>
       </w:r>
     </w:p>
     <w:p/>
@@ -1167,7 +1616,7 @@
         <w:pStyle w:val="ManualBullet"/>
       </w:pPr>
       <w:r>
-        <w:t>how long the last sync took</w:t>
+        <w:t>the dashboard looks stale</w:t>
       </w:r>
     </w:p>
     <w:p>
@@ -1175,7 +1624,7 @@
         <w:pStyle w:val="ManualBullet"/>
       </w:pPr>
       <w:r>
-        <w:t>whether the last run was manual or automatic</w:t>
+        <w:t>data appears to be missing</w:t>
       </w:r>
     </w:p>
     <w:p>
@@ -1183,7 +1632,7 @@
         <w:pStyle w:val="ManualBullet"/>
       </w:pPr>
       <w:r>
-        <w:t>whether the data may be out of date</w:t>
+        <w:t>a manual sync seems slow</w:t>
       </w:r>
     </w:p>
     <w:p>
@@ -1191,7 +1640,7 @@
         <w:pStyle w:val="ManualBullet"/>
       </w:pPr>
       <w:r>
-        <w:t>whether recent syncs are getting slower</w:t>
+        <w:t>you need to know whether the latest refresh completed normally</w:t>
       </w:r>
     </w:p>
     <w:p/>
@@ -1200,7 +1649,123 @@
         <w:pStyle w:val="Heading2"/>
       </w:pPr>
       <w:r>
-        <w:t>6.2 Run a Beacon smoke test</w:t>
+        <w:t>9.2 What to review</w:t>
+      </w:r>
+    </w:p>
+    <w:p>
+      <w:r>
+        <w:t>Typical indicators may include:</w:t>
+      </w:r>
+    </w:p>
+    <w:p/>
+    <w:p>
+      <w:pPr>
+        <w:pStyle w:val="ManualBullet"/>
+      </w:pPr>
+      <w:r>
+        <w:t>last total sync duration</w:t>
+      </w:r>
+    </w:p>
+    <w:p>
+      <w:pPr>
+        <w:pStyle w:val="ManualBullet"/>
+      </w:pPr>
+      <w:r>
+        <w:t>fetch time</w:t>
+      </w:r>
+    </w:p>
+    <w:p>
+      <w:pPr>
+        <w:pStyle w:val="ManualBullet"/>
+      </w:pPr>
+      <w:r>
+        <w:t>transform time</w:t>
+      </w:r>
+    </w:p>
+    <w:p>
+      <w:pPr>
+        <w:pStyle w:val="ManualBullet"/>
+      </w:pPr>
+      <w:r>
+        <w:t>upsert time</w:t>
+      </w:r>
+    </w:p>
+    <w:p>
+      <w:pPr>
+        <w:pStyle w:val="ManualBullet"/>
+      </w:pPr>
+      <w:r>
+        <w:t>average recent duration</w:t>
+      </w:r>
+    </w:p>
+    <w:p>
+      <w:pPr>
+        <w:pStyle w:val="ManualBullet"/>
+      </w:pPr>
+      <w:r>
+        <w:t>whether the latest run was automatic or manual</w:t>
+      </w:r>
+    </w:p>
+    <w:p/>
+    <w:p>
+      <w:pPr>
+        <w:pStyle w:val="Heading2"/>
+      </w:pPr>
+      <w:r>
+        <w:t>9.3 How to interpret it</w:t>
+      </w:r>
+    </w:p>
+    <w:p>
+      <w:r>
+        <w:t>Use this section to answer questions such as:</w:t>
+      </w:r>
+    </w:p>
+    <w:p/>
+    <w:p>
+      <w:pPr>
+        <w:pStyle w:val="ManualBullet"/>
+      </w:pPr>
+      <w:r>
+        <w:t>did a sync actually complete</w:t>
+      </w:r>
+    </w:p>
+    <w:p>
+      <w:pPr>
+        <w:pStyle w:val="ManualBullet"/>
+      </w:pPr>
+      <w:r>
+        <w:t>was it unusually slow</w:t>
+      </w:r>
+    </w:p>
+    <w:p>
+      <w:pPr>
+        <w:pStyle w:val="ManualBullet"/>
+      </w:pPr>
+      <w:r>
+        <w:t>did the issue begin after a particular run</w:t>
+      </w:r>
+    </w:p>
+    <w:p/>
+    <w:p>
+      <w:r>
+        <w:t>If the figures look normal but the data still looks wrong, the issue may be with source data rather than sync speed.</w:t>
+      </w:r>
+    </w:p>
+    <w:p/>
+    <w:p>
+      <w:pPr>
+        <w:pStyle w:val="Heading1"/>
+      </w:pPr>
+      <w:r>
+        <w:t>10. Beacon API Sync</w:t>
+      </w:r>
+    </w:p>
+    <w:p>
+      <w:pPr>
+        <w:pStyle w:val="Heading2"/>
+      </w:pPr>
+      <w:r>
+        <w:t>10.1 Smoke test</w:t>
       </w:r>
     </w:p>
     <w:p>
@@ -1214,24 +1779,86 @@
         <w:t>Run Beacon API Smoke Test</w:t>
       </w:r>
       <w:r>
-        <w:t xml:space="preserve"> before a full manual sync if you are checking for connection problems.</w:t>
+        <w:t xml:space="preserve"> as the first low-risk check when troubleshooting connectivity or refresh issues.</w:t>
       </w:r>
     </w:p>
     <w:p/>
     <w:p>
       <w:r>
-        <w:t>This is the safest first step because it checks the connection without running a full import.</w:t>
+        <w:t>It helps confirm:</w:t>
       </w:r>
     </w:p>
     <w:p/>
     <w:p>
       <w:pPr>
+        <w:pStyle w:val="ManualBullet"/>
+      </w:pPr>
+      <w:r>
+        <w:t>the Beacon connection is reachable</w:t>
+      </w:r>
+    </w:p>
+    <w:p>
+      <w:pPr>
+        <w:pStyle w:val="ManualBullet"/>
+      </w:pPr>
+      <w:r>
+        <w:t>the response shape is valid</w:t>
+      </w:r>
+    </w:p>
+    <w:p>
+      <w:pPr>
+        <w:pStyle w:val="ManualBullet"/>
+      </w:pPr>
+      <w:r>
+        <w:t>the dashboard can talk to the source</w:t>
+      </w:r>
+    </w:p>
+    <w:p/>
+    <w:p>
+      <w:pPr>
         <w:pStyle w:val="Heading2"/>
       </w:pPr>
       <w:r>
-        <w:t>6.3 Run a manual sync</w:t>
-      </w:r>
-    </w:p>
+        <w:t>10.2 Manual sync</w:t>
+      </w:r>
+    </w:p>
+    <w:p>
+      <w:r>
+        <w:t>Use a manual sync when:</w:t>
+      </w:r>
+    </w:p>
+    <w:p/>
+    <w:p>
+      <w:pPr>
+        <w:pStyle w:val="ManualBullet"/>
+      </w:pPr>
+      <w:r>
+        <w:t>the data is out of date</w:t>
+      </w:r>
+    </w:p>
+    <w:p>
+      <w:pPr>
+        <w:pStyle w:val="ManualBullet"/>
+      </w:pPr>
+      <w:r>
+        <w:t>you need the latest records immediately</w:t>
+      </w:r>
+    </w:p>
+    <w:p>
+      <w:pPr>
+        <w:pStyle w:val="ManualBullet"/>
+      </w:pPr>
+      <w:r>
+        <w:t>you are checking a support issue and need a fresh import</w:t>
+      </w:r>
+    </w:p>
+    <w:p/>
+    <w:p>
+      <w:r>
+        <w:t>Step-by-step:</w:t>
+      </w:r>
+    </w:p>
+    <w:p/>
     <w:p>
       <w:pPr>
         <w:pStyle w:val="ManualNumber"/>
@@ -1254,7 +1881,7 @@
         <w:pStyle w:val="ManualNumber"/>
       </w:pPr>
       <w:r>
-        <w:t>Run a smoke test first if you are troubleshooting.</w:t>
+        <w:t>If you are troubleshooting, run a smoke test first.</w:t>
       </w:r>
     </w:p>
     <w:p>
@@ -1287,6 +1914,28 @@
         <w:pStyle w:val="ManualNumber"/>
       </w:pPr>
       <w:r>
+        <w:t>Wait for the success or error result.</w:t>
+      </w:r>
+    </w:p>
+    <w:p>
+      <w:pPr>
+        <w:pStyle w:val="ManualNumber"/>
+      </w:pPr>
+      <w:r>
+        <w:t>Recheck the relevant dashboard view.</w:t>
+      </w:r>
+    </w:p>
+    <w:p/>
+    <w:p>
+      <w:pPr>
+        <w:pStyle w:val="Heading2"/>
+      </w:pPr>
+      <w:r>
+        <w:t>10.3 Stop or clear a stuck sync</w:t>
+      </w:r>
+    </w:p>
+    <w:p>
+      <w:r>
         <w:t xml:space="preserve">Use </w:t>
       </w:r>
       <w:r>
@@ -1296,13 +1945,11 @@
         <w:t>Stop Manual API Sync</w:t>
       </w:r>
       <w:r>
-        <w:t xml:space="preserve"> only if the sync is clearly stuck.</w:t>
-      </w:r>
-    </w:p>
-    <w:p>
-      <w:pPr>
-        <w:pStyle w:val="ManualNumber"/>
-      </w:pPr>
+        <w:t xml:space="preserve"> only when a sync is genuinely stuck or was started in error.</w:t>
+      </w:r>
+    </w:p>
+    <w:p/>
+    <w:p>
       <w:r>
         <w:t xml:space="preserve">Use </w:t>
       </w:r>
@@ -1313,36 +1960,835 @@
         <w:t>Clear Stuck Sync</w:t>
       </w:r>
       <w:r>
-        <w:t xml:space="preserve"> only after checking there is no live sync still running.</w:t>
+        <w:t xml:space="preserve"> only after checking that no live sync still is running.</w:t>
       </w:r>
     </w:p>
     <w:p/>
     <w:p>
-      <w:pPr>
-        <w:pStyle w:val="Heading2"/>
-      </w:pPr>
-      <w:r>
-        <w:t>6.4 Upload Beacon CSV files</w:t>
-      </w:r>
-    </w:p>
-    <w:p>
-      <w:r>
-        <w:t>Use this only when you are intentionally loading exported CSV files instead of using the API.</w:t>
+      <w:r>
+        <w:t>These are intervention actions, not routine buttons.</w:t>
       </w:r>
     </w:p>
     <w:p/>
     <w:p>
       <w:pPr>
+        <w:pStyle w:val="Heading1"/>
+      </w:pPr>
+      <w:r>
+        <w:t>11. Beacon CSV Upload</w:t>
+      </w:r>
+    </w:p>
+    <w:p>
+      <w:r>
+        <w:t>Use this when you are intentionally importing exported CSV files instead of relying on the API.</w:t>
+      </w:r>
+    </w:p>
+    <w:p/>
+    <w:p>
+      <w:r>
+        <w:t>Typical reasons:</w:t>
+      </w:r>
+    </w:p>
+    <w:p/>
+    <w:p>
+      <w:pPr>
+        <w:pStyle w:val="ManualBullet"/>
+      </w:pPr>
+      <w:r>
+        <w:t>API access is unavailable</w:t>
+      </w:r>
+    </w:p>
+    <w:p>
+      <w:pPr>
+        <w:pStyle w:val="ManualBullet"/>
+      </w:pPr>
+      <w:r>
+        <w:t>you have been asked to use a controlled export file set</w:t>
+      </w:r>
+    </w:p>
+    <w:p>
+      <w:pPr>
+        <w:pStyle w:val="ManualBullet"/>
+      </w:pPr>
+      <w:r>
+        <w:t>you are supporting a recovery or special maintenance task</w:t>
+      </w:r>
+    </w:p>
+    <w:p/>
+    <w:p>
+      <w:r>
+        <w:t>Before using CSV upload:</w:t>
+      </w:r>
+    </w:p>
+    <w:p/>
+    <w:p>
+      <w:pPr>
         <w:pStyle w:val="ManualNumber"/>
       </w:pPr>
       <w:r>
-        <w:t xml:space="preserve">Open </w:t>
+        <w:t>Confirm why CSV upload is needed.</w:t>
+      </w:r>
+    </w:p>
+    <w:p>
+      <w:pPr>
+        <w:pStyle w:val="ManualNumber"/>
+      </w:pPr>
+      <w:r>
+        <w:t>Confirm the files are the correct files.</w:t>
+      </w:r>
+    </w:p>
+    <w:p>
+      <w:pPr>
+        <w:pStyle w:val="ManualNumber"/>
+      </w:pPr>
+      <w:r>
+        <w:t>Confirm the scope of what will be affected.</w:t>
+      </w:r>
+    </w:p>
+    <w:p/>
+    <w:p>
+      <w:pPr>
+        <w:pStyle w:val="Heading1"/>
+      </w:pPr>
+      <w:r>
+        <w:t>12. Data reset and rebuild actions</w:t>
+      </w:r>
+    </w:p>
+    <w:p>
+      <w:r>
+        <w:t>Reset or rebuild actions should be treated as controlled maintenance work.</w:t>
+      </w:r>
+    </w:p>
+    <w:p/>
+    <w:p>
+      <w:r>
+        <w:t>Use them only when:</w:t>
+      </w:r>
+    </w:p>
+    <w:p/>
+    <w:p>
+      <w:pPr>
+        <w:pStyle w:val="ManualBullet"/>
+      </w:pPr>
+      <w:r>
+        <w:t>a bad import needs to be cleared</w:t>
+      </w:r>
+    </w:p>
+    <w:p>
+      <w:pPr>
+        <w:pStyle w:val="ManualBullet"/>
+      </w:pPr>
+      <w:r>
+        <w:t>support work has agreed that a rebuild is required</w:t>
+      </w:r>
+    </w:p>
+    <w:p>
+      <w:pPr>
+        <w:pStyle w:val="ManualBullet"/>
+      </w:pPr>
+      <w:r>
+        <w:t>the dataset is clearly in a broken state</w:t>
+      </w:r>
+    </w:p>
+    <w:p/>
+    <w:p>
+      <w:r>
+        <w:t>Before using a reset action:</w:t>
+      </w:r>
+    </w:p>
+    <w:p/>
+    <w:p>
+      <w:pPr>
+        <w:pStyle w:val="ManualNumber"/>
+      </w:pPr>
+      <w:r>
+        <w:t>Confirm the reason.</w:t>
+      </w:r>
+    </w:p>
+    <w:p>
+      <w:pPr>
+        <w:pStyle w:val="ManualNumber"/>
+      </w:pPr>
+      <w:r>
+        <w:t>Confirm the target scope.</w:t>
+      </w:r>
+    </w:p>
+    <w:p>
+      <w:pPr>
+        <w:pStyle w:val="ManualNumber"/>
+      </w:pPr>
+      <w:r>
+        <w:t>Check whether a smaller corrective action would solve the issue.</w:t>
+      </w:r>
+    </w:p>
+    <w:p>
+      <w:pPr>
+        <w:pStyle w:val="ManualNumber"/>
+      </w:pPr>
+      <w:r>
+        <w:t>Record the reason clearly.</w:t>
+      </w:r>
+    </w:p>
+    <w:p/>
+    <w:p>
+      <w:pPr>
+        <w:pStyle w:val="Heading1"/>
+      </w:pPr>
+      <w:r>
+        <w:t>13. Audit Logs</w:t>
+      </w:r>
+    </w:p>
+    <w:p>
+      <w:r>
+        <w:t>The audit log is the main place to check what happened in the system.</w:t>
+      </w:r>
+    </w:p>
+    <w:p/>
+    <w:p>
+      <w:r>
+        <w:t>Use it to answer questions such as:</w:t>
+      </w:r>
+    </w:p>
+    <w:p/>
+    <w:p>
+      <w:pPr>
+        <w:pStyle w:val="ManualBullet"/>
+      </w:pPr>
+      <w:r>
+        <w:t>who changed a role</w:t>
+      </w:r>
+    </w:p>
+    <w:p>
+      <w:pPr>
+        <w:pStyle w:val="ManualBullet"/>
+      </w:pPr>
+      <w:r>
+        <w:t>who changed a profile</w:t>
+      </w:r>
+    </w:p>
+    <w:p>
+      <w:pPr>
+        <w:pStyle w:val="ManualBullet"/>
+      </w:pPr>
+      <w:r>
+        <w:t>who reset a password</w:t>
+      </w:r>
+    </w:p>
+    <w:p>
+      <w:pPr>
+        <w:pStyle w:val="ManualBullet"/>
+      </w:pPr>
+      <w:r>
+        <w:t>who started a sync</w:t>
+      </w:r>
+    </w:p>
+    <w:p>
+      <w:pPr>
+        <w:pStyle w:val="ManualBullet"/>
+      </w:pPr>
+      <w:r>
+        <w:t>who deleted a user</w:t>
+      </w:r>
+    </w:p>
+    <w:p/>
+    <w:p>
+      <w:r>
+        <w:t>Use the audit log whenever the history of an issue is unclear.</w:t>
+      </w:r>
+    </w:p>
+    <w:p/>
+    <w:p>
+      <w:pPr>
+        <w:pStyle w:val="Heading1"/>
+      </w:pPr>
+      <w:r>
+        <w:t>14. Data Request Form and Temporary Access</w:t>
+      </w:r>
+    </w:p>
+    <w:p>
+      <w:r>
+        <w:t xml:space="preserve">Admins can use </w:t>
       </w:r>
       <w:r>
         <w:rPr>
           <w:rFonts w:ascii="Consolas" w:hAnsi="Consolas"/>
         </w:rPr>
-        <w:t>Beacon CSV Upload</w:t>
+        <w:t>Data Request Form</w:t>
+      </w:r>
+      <w:r>
+        <w:t xml:space="preserve"> to both review requests and manage temporary access.</w:t>
+      </w:r>
+    </w:p>
+    <w:p/>
+    <w:p>
+      <w:pPr>
+        <w:pStyle w:val="Heading2"/>
+      </w:pPr>
+      <w:r>
+        <w:t>14.1 Reviewing requests</w:t>
+      </w:r>
+    </w:p>
+    <w:p>
+      <w:r>
+        <w:t>When a request is submitted:</w:t>
+      </w:r>
+    </w:p>
+    <w:p/>
+    <w:p>
+      <w:pPr>
+        <w:pStyle w:val="ManualBullet"/>
+      </w:pPr>
+      <w:r>
+        <w:t>it is saved in the system</w:t>
+      </w:r>
+    </w:p>
+    <w:p>
+      <w:pPr>
+        <w:pStyle w:val="ManualBullet"/>
+      </w:pPr>
+      <w:r>
+        <w:rPr>
+          <w:rFonts w:ascii="Consolas" w:hAnsi="Consolas"/>
+        </w:rPr>
+        <w:t>Admin</w:t>
+      </w:r>
+      <w:r>
+        <w:t xml:space="preserve"> and </w:t>
+      </w:r>
+      <w:r>
+        <w:rPr>
+          <w:rFonts w:ascii="Consolas" w:hAnsi="Consolas"/>
+        </w:rPr>
+        <w:t>Manager</w:t>
+      </w:r>
+      <w:r>
+        <w:t xml:space="preserve"> users are notified in the dashboard</w:t>
+      </w:r>
+    </w:p>
+    <w:p>
+      <w:pPr>
+        <w:pStyle w:val="ManualBullet"/>
+      </w:pPr>
+      <w:r>
+        <w:t xml:space="preserve">the request appears in the review section of </w:t>
+      </w:r>
+      <w:r>
+        <w:rPr>
+          <w:rFonts w:ascii="Consolas" w:hAnsi="Consolas"/>
+        </w:rPr>
+        <w:t>Data Request Form</w:t>
+      </w:r>
+    </w:p>
+    <w:p/>
+    <w:p>
+      <w:r>
+        <w:t>Admins can review the request list and change the request status to:</w:t>
+      </w:r>
+    </w:p>
+    <w:p/>
+    <w:p>
+      <w:pPr>
+        <w:pStyle w:val="ManualBullet"/>
+      </w:pPr>
+      <w:r>
+        <w:rPr>
+          <w:rFonts w:ascii="Consolas" w:hAnsi="Consolas"/>
+        </w:rPr>
+        <w:t>Pending</w:t>
+      </w:r>
+    </w:p>
+    <w:p>
+      <w:pPr>
+        <w:pStyle w:val="ManualBullet"/>
+      </w:pPr>
+      <w:r>
+        <w:rPr>
+          <w:rFonts w:ascii="Consolas" w:hAnsi="Consolas"/>
+        </w:rPr>
+        <w:t>In Review</w:t>
+      </w:r>
+    </w:p>
+    <w:p>
+      <w:pPr>
+        <w:pStyle w:val="ManualBullet"/>
+      </w:pPr>
+      <w:r>
+        <w:rPr>
+          <w:rFonts w:ascii="Consolas" w:hAnsi="Consolas"/>
+        </w:rPr>
+        <w:t>Completed</w:t>
+      </w:r>
+    </w:p>
+    <w:p/>
+    <w:p>
+      <w:pPr>
+        <w:pStyle w:val="Heading2"/>
+      </w:pPr>
+      <w:r>
+        <w:t>14.2 Granting temporary access</w:t>
+      </w:r>
+    </w:p>
+    <w:p>
+      <w:r>
+        <w:t>Admins can also grant temporary access permissions to a single user from the same page.</w:t>
+      </w:r>
+    </w:p>
+    <w:p/>
+    <w:p>
+      <w:r>
+        <w:t>This feature is designed for time-limited access only.</w:t>
+      </w:r>
+    </w:p>
+    <w:p/>
+    <w:p>
+      <w:r>
+        <w:t>Required inputs include:</w:t>
+      </w:r>
+    </w:p>
+    <w:p/>
+    <w:p>
+      <w:pPr>
+        <w:pStyle w:val="ManualBullet"/>
+      </w:pPr>
+      <w:r>
+        <w:t>the target user</w:t>
+      </w:r>
+    </w:p>
+    <w:p>
+      <w:pPr>
+        <w:pStyle w:val="ManualBullet"/>
+      </w:pPr>
+      <w:r>
+        <w:t>one or more temporary roles</w:t>
+      </w:r>
+    </w:p>
+    <w:p>
+      <w:pPr>
+        <w:pStyle w:val="ManualBullet"/>
+      </w:pPr>
+      <w:r>
+        <w:t>an expiry date and time</w:t>
+      </w:r>
+    </w:p>
+    <w:p>
+      <w:pPr>
+        <w:pStyle w:val="ManualBullet"/>
+      </w:pPr>
+      <w:r>
+        <w:t>the reason for the temporary access</w:t>
+      </w:r>
+    </w:p>
+    <w:p/>
+    <w:p>
+      <w:r>
+        <w:t>Good practice:</w:t>
+      </w:r>
+    </w:p>
+    <w:p/>
+    <w:p>
+      <w:pPr>
+        <w:pStyle w:val="ManualBullet"/>
+      </w:pPr>
+      <w:r>
+        <w:t>grant the smallest access needed</w:t>
+      </w:r>
+    </w:p>
+    <w:p>
+      <w:pPr>
+        <w:pStyle w:val="ManualBullet"/>
+      </w:pPr>
+      <w:r>
+        <w:t>set the shortest realistic expiry</w:t>
+      </w:r>
+    </w:p>
+    <w:p>
+      <w:pPr>
+        <w:pStyle w:val="ManualBullet"/>
+      </w:pPr>
+      <w:r>
+        <w:t>write a clear reason</w:t>
+      </w:r>
+    </w:p>
+    <w:p>
+      <w:pPr>
+        <w:pStyle w:val="ManualBullet"/>
+      </w:pPr>
+      <w:r>
+        <w:t>revoke access early if it is no longer needed</w:t>
+      </w:r>
+    </w:p>
+    <w:p/>
+    <w:p>
+      <w:pPr>
+        <w:pStyle w:val="Heading2"/>
+      </w:pPr>
+      <w:r>
+        <w:t>14.3 How temporary access behaves</w:t>
+      </w:r>
+    </w:p>
+    <w:p>
+      <w:r>
+        <w:t>Temporary access is additive. It adds temporary role access on top of the user's normal role until the expiry time or until it is revoked.</w:t>
+      </w:r>
+    </w:p>
+    <w:p/>
+    <w:p>
+      <w:r>
+        <w:t>Use it when:</w:t>
+      </w:r>
+    </w:p>
+    <w:p/>
+    <w:p>
+      <w:pPr>
+        <w:pStyle w:val="ManualBullet"/>
+      </w:pPr>
+      <w:r>
+        <w:t>a single user needs short-term access for a defined task</w:t>
+      </w:r>
+    </w:p>
+    <w:p>
+      <w:pPr>
+        <w:pStyle w:val="ManualBullet"/>
+      </w:pPr>
+      <w:r>
+        <w:t>permanent role change would be too broad</w:t>
+      </w:r>
+    </w:p>
+    <w:p>
+      <w:pPr>
+        <w:pStyle w:val="ManualBullet"/>
+      </w:pPr>
+      <w:r>
+        <w:t>a request has been reviewed and approved for limited-duration access</w:t>
+      </w:r>
+    </w:p>
+    <w:p/>
+    <w:p>
+      <w:pPr>
+        <w:pStyle w:val="Heading1"/>
+      </w:pPr>
+      <w:r>
+        <w:t>15. Using the other dashboards as an Admin</w:t>
+      </w:r>
+    </w:p>
+    <w:p>
+      <w:pPr>
+        <w:pStyle w:val="Heading2"/>
+      </w:pPr>
+      <w:r>
+        <w:t>14.1 KPI Dashboard</w:t>
+      </w:r>
+    </w:p>
+    <w:p>
+      <w:r>
+        <w:t>Use this for:</w:t>
+      </w:r>
+    </w:p>
+    <w:p/>
+    <w:p>
+      <w:pPr>
+        <w:pStyle w:val="ManualBullet"/>
+      </w:pPr>
+      <w:r>
+        <w:t>headline KPI review</w:t>
+      </w:r>
+    </w:p>
+    <w:p>
+      <w:pPr>
+        <w:pStyle w:val="ManualBullet"/>
+      </w:pPr>
+      <w:r>
+        <w:t>checking what operational users see</w:t>
+      </w:r>
+    </w:p>
+    <w:p>
+      <w:pPr>
+        <w:pStyle w:val="ManualBullet"/>
+      </w:pPr>
+      <w:r>
+        <w:t>opening drill-downs</w:t>
+      </w:r>
+    </w:p>
+    <w:p>
+      <w:pPr>
+        <w:pStyle w:val="ManualBullet"/>
+      </w:pPr>
+      <w:r>
+        <w:t xml:space="preserve">validating figures with </w:t>
+      </w:r>
+      <w:r>
+        <w:rPr>
+          <w:rFonts w:ascii="Consolas" w:hAnsi="Consolas"/>
+        </w:rPr>
+        <w:t>Show KPI Debug</w:t>
+      </w:r>
+    </w:p>
+    <w:p/>
+    <w:p>
+      <w:pPr>
+        <w:pStyle w:val="Heading2"/>
+      </w:pPr>
+      <w:r>
+        <w:t>14.2 Custom Reports Dashboard</w:t>
+      </w:r>
+    </w:p>
+    <w:p>
+      <w:r>
+        <w:t>Use this for:</w:t>
+      </w:r>
+    </w:p>
+    <w:p/>
+    <w:p>
+      <w:pPr>
+        <w:pStyle w:val="ManualBullet"/>
+      </w:pPr>
+      <w:r>
+        <w:t>detailed analysis</w:t>
+      </w:r>
+    </w:p>
+    <w:p>
+      <w:pPr>
+        <w:pStyle w:val="ManualBullet"/>
+      </w:pPr>
+      <w:r>
+        <w:t>exports</w:t>
+      </w:r>
+    </w:p>
+    <w:p>
+      <w:pPr>
+        <w:pStyle w:val="ManualBullet"/>
+      </w:pPr>
+      <w:r>
+        <w:t>charts</w:t>
+      </w:r>
+    </w:p>
+    <w:p>
+      <w:pPr>
+        <w:pStyle w:val="ManualBullet"/>
+      </w:pPr>
+      <w:r>
+        <w:t>advanced filtering</w:t>
+      </w:r>
+    </w:p>
+    <w:p>
+      <w:pPr>
+        <w:pStyle w:val="ManualBullet"/>
+      </w:pPr>
+      <w:r>
+        <w:t>comparison work</w:t>
+      </w:r>
+    </w:p>
+    <w:p>
+      <w:pPr>
+        <w:pStyle w:val="ManualBullet"/>
+      </w:pPr>
+      <w:r>
+        <w:t>distance analysis</w:t>
+      </w:r>
+    </w:p>
+    <w:p/>
+    <w:p>
+      <w:r>
+        <w:t>Admins can also use it to:</w:t>
+      </w:r>
+    </w:p>
+    <w:p/>
+    <w:p>
+      <w:pPr>
+        <w:pStyle w:val="ManualBullet"/>
+      </w:pPr>
+      <w:r>
+        <w:t>combine multiple datasets in one report</w:t>
+      </w:r>
+    </w:p>
+    <w:p>
+      <w:pPr>
+        <w:pStyle w:val="ManualBullet"/>
+      </w:pPr>
+      <w:r>
+        <w:t>validate whether row-level data supports a KPI</w:t>
+      </w:r>
+    </w:p>
+    <w:p>
+      <w:pPr>
+        <w:pStyle w:val="ManualBullet"/>
+      </w:pPr>
+      <w:r>
+        <w:t xml:space="preserve">compare groups directly with </w:t>
+      </w:r>
+      <w:r>
+        <w:rPr>
+          <w:rFonts w:ascii="Consolas" w:hAnsi="Consolas"/>
+        </w:rPr>
+        <w:t>Comparison Analysis</w:t>
+      </w:r>
+    </w:p>
+    <w:p>
+      <w:pPr>
+        <w:pStyle w:val="ManualBullet"/>
+      </w:pPr>
+      <w:r>
+        <w:t xml:space="preserve">inspect travel patterns with </w:t>
+      </w:r>
+      <w:r>
+        <w:rPr>
+          <w:rFonts w:ascii="Consolas" w:hAnsi="Consolas"/>
+        </w:rPr>
+        <w:t>Distance Analysis</w:t>
+      </w:r>
+    </w:p>
+    <w:p>
+      <w:pPr>
+        <w:pStyle w:val="ManualBullet"/>
+      </w:pPr>
+      <w:r>
+        <w:t>confirm what other roles will or will not see</w:t>
+      </w:r>
+    </w:p>
+    <w:p/>
+    <w:p>
+      <w:pPr>
+        <w:pStyle w:val="Heading2"/>
+      </w:pPr>
+      <w:r>
+        <w:t>14.3 ML Dashboard</w:t>
+      </w:r>
+    </w:p>
+    <w:p>
+      <w:r>
+        <w:t>Use this for:</w:t>
+      </w:r>
+    </w:p>
+    <w:p/>
+    <w:p>
+      <w:pPr>
+        <w:pStyle w:val="ManualBullet"/>
+      </w:pPr>
+      <w:r>
+        <w:t>one-event-at-a-time checking</w:t>
+      </w:r>
+    </w:p>
+    <w:p>
+      <w:pPr>
+        <w:pStyle w:val="ManualBullet"/>
+      </w:pPr>
+      <w:r>
+        <w:t>operational detail review</w:t>
+      </w:r>
+    </w:p>
+    <w:p>
+      <w:pPr>
+        <w:pStyle w:val="ManualBullet"/>
+      </w:pPr>
+      <w:r>
+        <w:t>participant, medical, and emergency review where supported by source data</w:t>
+      </w:r>
+    </w:p>
+    <w:p/>
+    <w:p>
+      <w:pPr>
+        <w:pStyle w:val="Heading2"/>
+      </w:pPr>
+      <w:r>
+        <w:t>14.4 Funder Dashboard</w:t>
+      </w:r>
+    </w:p>
+    <w:p>
+      <w:r>
+        <w:t>Use this to check:</w:t>
+      </w:r>
+    </w:p>
+    <w:p/>
+    <w:p>
+      <w:pPr>
+        <w:pStyle w:val="ManualBullet"/>
+      </w:pPr>
+      <w:r>
+        <w:t>what funder-facing users see</w:t>
+      </w:r>
+    </w:p>
+    <w:p>
+      <w:pPr>
+        <w:pStyle w:val="ManualBullet"/>
+      </w:pPr>
+      <w:r>
+        <w:t>whether sponsor-facing figures make sense</w:t>
+      </w:r>
+    </w:p>
+    <w:p>
+      <w:pPr>
+        <w:pStyle w:val="ManualBullet"/>
+      </w:pPr>
+      <w:r>
+        <w:t>whether the restricted presentation is appropriate</w:t>
+      </w:r>
+    </w:p>
+    <w:p/>
+    <w:p>
+      <w:pPr>
+        <w:pStyle w:val="Heading2"/>
+      </w:pPr>
+      <w:r>
+        <w:t>14.5 Case Studies</w:t>
+      </w:r>
+    </w:p>
+    <w:p>
+      <w:r>
+        <w:t>Use this for:</w:t>
+      </w:r>
+    </w:p>
+    <w:p/>
+    <w:p>
+      <w:pPr>
+        <w:pStyle w:val="ManualBullet"/>
+      </w:pPr>
+      <w:r>
+        <w:t>reading supporting stories</w:t>
+      </w:r>
+    </w:p>
+    <w:p>
+      <w:pPr>
+        <w:pStyle w:val="ManualBullet"/>
+      </w:pPr>
+      <w:r>
+        <w:t>checking date and region tagging</w:t>
+      </w:r>
+    </w:p>
+    <w:p>
+      <w:pPr>
+        <w:pStyle w:val="ManualBullet"/>
+      </w:pPr>
+      <w:r>
+        <w:t>uploading new qualitative evidence</w:t>
+      </w:r>
+    </w:p>
+    <w:p/>
+    <w:p>
+      <w:pPr>
+        <w:pStyle w:val="Heading1"/>
+      </w:pPr>
+      <w:r>
+        <w:t>16. Recommended Admin working pattern</w:t>
+      </w:r>
+    </w:p>
+    <w:p>
+      <w:r>
+        <w:t>For most support issues:</w:t>
+      </w:r>
+    </w:p>
+    <w:p/>
+    <w:p>
+      <w:pPr>
+        <w:pStyle w:val="ManualNumber"/>
+      </w:pPr>
+      <w:r>
+        <w:t xml:space="preserve">Check </w:t>
+      </w:r>
+      <w:r>
+        <w:rPr>
+          <w:rFonts w:ascii="Consolas" w:hAnsi="Consolas"/>
+        </w:rPr>
+        <w:t>Last Data Refresh</w:t>
       </w:r>
       <w:r>
         <w:t>.</w:t>
@@ -1353,7 +2799,16 @@
         <w:pStyle w:val="ManualNumber"/>
       </w:pPr>
       <w:r>
-        <w:t>Select the required files.</w:t>
+        <w:t xml:space="preserve">Review </w:t>
+      </w:r>
+      <w:r>
+        <w:rPr>
+          <w:rFonts w:ascii="Consolas" w:hAnsi="Consolas"/>
+        </w:rPr>
+        <w:t>Sync Performance</w:t>
+      </w:r>
+      <w:r>
+        <w:t xml:space="preserve"> if the data looks old or unusual.</w:t>
       </w:r>
     </w:p>
     <w:p>
@@ -1361,7 +2816,7 @@
         <w:pStyle w:val="ManualNumber"/>
       </w:pPr>
       <w:r>
-        <w:t>Start the upload.</w:t>
+        <w:t>Run a smoke test before a manual sync if troubleshooting.</w:t>
       </w:r>
     </w:p>
     <w:p>
@@ -1369,72 +2824,15 @@
         <w:pStyle w:val="ManualNumber"/>
       </w:pPr>
       <w:r>
-        <w:t>Check the result message before moving on.</w:t>
-      </w:r>
-    </w:p>
-    <w:p/>
-    <w:p>
-      <w:pPr>
-        <w:pStyle w:val="Heading2"/>
-      </w:pPr>
-      <w:r>
-        <w:t>6.5 Reset or rebuild dashboard data</w:t>
-      </w:r>
-    </w:p>
-    <w:p>
-      <w:r>
-        <w:t>Treat reset actions as maintenance work.</w:t>
-      </w:r>
-    </w:p>
-    <w:p/>
-    <w:p>
-      <w:r>
-        <w:t>Use them only when:</w:t>
-      </w:r>
-    </w:p>
-    <w:p/>
-    <w:p>
-      <w:pPr>
-        <w:pStyle w:val="ManualBullet"/>
-      </w:pPr>
-      <w:r>
-        <w:t>an import has failed badly</w:t>
-      </w:r>
-    </w:p>
-    <w:p>
-      <w:pPr>
-        <w:pStyle w:val="ManualBullet"/>
-      </w:pPr>
-      <w:r>
-        <w:t>the working data needs rebuilding</w:t>
-      </w:r>
-    </w:p>
-    <w:p>
-      <w:pPr>
-        <w:pStyle w:val="ManualBullet"/>
-      </w:pPr>
-      <w:r>
-        <w:t>support or data checking work has agreed that a reset is needed</w:t>
-      </w:r>
-    </w:p>
-    <w:p/>
-    <w:p>
-      <w:r>
-        <w:t>Do not use reset actions casually during active reporting.</w:t>
-      </w:r>
-    </w:p>
-    <w:p/>
-    <w:p>
-      <w:pPr>
-        <w:pStyle w:val="Heading1"/>
-      </w:pPr>
-      <w:r>
-        <w:t>7. Audit logs</w:t>
-      </w:r>
-    </w:p>
-    <w:p>
-      <w:r>
-        <w:t xml:space="preserve">The </w:t>
+        <w:t>Make access changes carefully and always record a clear reason.</w:t>
+      </w:r>
+    </w:p>
+    <w:p>
+      <w:pPr>
+        <w:pStyle w:val="ManualNumber"/>
+      </w:pPr>
+      <w:r>
+        <w:t xml:space="preserve">Check </w:t>
       </w:r>
       <w:r>
         <w:rPr>
@@ -1443,294 +2841,87 @@
         <w:t>Audit Logs</w:t>
       </w:r>
       <w:r>
-        <w:t xml:space="preserve"> section shows a history of important actions.</w:t>
+        <w:t xml:space="preserve"> if the history is unclear.</w:t>
+      </w:r>
+    </w:p>
+    <w:p>
+      <w:pPr>
+        <w:pStyle w:val="ManualNumber"/>
+      </w:pPr>
+      <w:r>
+        <w:t>Verify the result in the relevant dashboard view after making a change.</w:t>
       </w:r>
     </w:p>
     <w:p/>
     <w:p>
-      <w:r>
-        <w:t>Use it to check:</w:t>
+      <w:pPr>
+        <w:pStyle w:val="Heading1"/>
+      </w:pPr>
+      <w:r>
+        <w:t>17. Troubleshooting</w:t>
+      </w:r>
+    </w:p>
+    <w:p>
+      <w:pPr>
+        <w:pStyle w:val="Heading2"/>
+      </w:pPr>
+      <w:r>
+        <w:t>`Admin client not available`</w:t>
+      </w:r>
+    </w:p>
+    <w:p>
+      <w:r>
+        <w:t>Check the Admin-side configuration and confirm the required credentials are loaded correctly.</w:t>
       </w:r>
     </w:p>
     <w:p/>
     <w:p>
       <w:pPr>
-        <w:pStyle w:val="ManualBullet"/>
-      </w:pPr>
-      <w:r>
-        <w:t>who changed a role</w:t>
-      </w:r>
-    </w:p>
-    <w:p>
-      <w:pPr>
-        <w:pStyle w:val="ManualBullet"/>
-      </w:pPr>
-      <w:r>
-        <w:t>who changed a user profile</w:t>
-      </w:r>
-    </w:p>
-    <w:p>
-      <w:pPr>
-        <w:pStyle w:val="ManualBullet"/>
-      </w:pPr>
-      <w:r>
-        <w:t>who reset a password</w:t>
-      </w:r>
-    </w:p>
-    <w:p>
-      <w:pPr>
-        <w:pStyle w:val="ManualBullet"/>
-      </w:pPr>
-      <w:r>
-        <w:t>who started a sync</w:t>
-      </w:r>
-    </w:p>
-    <w:p>
-      <w:pPr>
-        <w:pStyle w:val="ManualBullet"/>
-      </w:pPr>
-      <w:r>
-        <w:t>who deleted a user</w:t>
-      </w:r>
-    </w:p>
-    <w:p>
-      <w:pPr>
-        <w:pStyle w:val="ManualBullet"/>
-      </w:pPr>
-      <w:r>
-        <w:t>who saved or shared a report</w:t>
+        <w:pStyle w:val="Heading2"/>
+      </w:pPr>
+      <w:r>
+        <w:t>A user cannot sign in</w:t>
+      </w:r>
+    </w:p>
+    <w:p>
+      <w:pPr>
+        <w:pStyle w:val="ManualNumber"/>
+      </w:pPr>
+      <w:r>
+        <w:t>Check whether they requested a password reset.</w:t>
+      </w:r>
+    </w:p>
+    <w:p>
+      <w:pPr>
+        <w:pStyle w:val="ManualNumber"/>
+      </w:pPr>
+      <w:r>
+        <w:t>Reset the password manually if needed.</w:t>
+      </w:r>
+    </w:p>
+    <w:p>
+      <w:pPr>
+        <w:pStyle w:val="ManualNumber"/>
+      </w:pPr>
+      <w:r>
+        <w:t>Confirm the account still has a valid role.</w:t>
+      </w:r>
+    </w:p>
+    <w:p>
+      <w:pPr>
+        <w:pStyle w:val="ManualNumber"/>
+      </w:pPr>
+      <w:r>
+        <w:t>Confirm the email address is correct.</w:t>
       </w:r>
     </w:p>
     <w:p/>
     <w:p>
-      <w:r>
-        <w:t>Use the log when investigating support issues or checking accountability.</w:t>
-      </w:r>
-    </w:p>
-    <w:p/>
-    <w:p>
-      <w:pPr>
-        <w:pStyle w:val="Heading1"/>
-      </w:pPr>
-      <w:r>
-        <w:t>8. Other dashboards available to Admins</w:t>
-      </w:r>
-    </w:p>
-    <w:p>
       <w:pPr>
         <w:pStyle w:val="Heading2"/>
       </w:pPr>
       <w:r>
-        <w:t>KPI Dashboard</w:t>
-      </w:r>
-    </w:p>
-    <w:p>
-      <w:r>
-        <w:t>Use this for:</w:t>
-      </w:r>
-    </w:p>
-    <w:p/>
-    <w:p>
-      <w:pPr>
-        <w:pStyle w:val="ManualBullet"/>
-      </w:pPr>
-      <w:r>
-        <w:t>headline KPI monitoring</w:t>
-      </w:r>
-    </w:p>
-    <w:p>
-      <w:pPr>
-        <w:pStyle w:val="ManualBullet"/>
-      </w:pPr>
-      <w:r>
-        <w:t>drill-down into supporting records</w:t>
-      </w:r>
-    </w:p>
-    <w:p>
-      <w:pPr>
-        <w:pStyle w:val="ManualBullet"/>
-      </w:pPr>
-      <w:r>
-        <w:t xml:space="preserve">validation using </w:t>
-      </w:r>
-      <w:r>
-        <w:rPr>
-          <w:rFonts w:ascii="Consolas" w:hAnsi="Consolas"/>
-        </w:rPr>
-        <w:t>Show KPI Debug</w:t>
-      </w:r>
-    </w:p>
-    <w:p/>
-    <w:p>
-      <w:pPr>
-        <w:pStyle w:val="Heading2"/>
-      </w:pPr>
-      <w:r>
-        <w:t>Custom Reports Dashboard</w:t>
-      </w:r>
-    </w:p>
-    <w:p>
-      <w:r>
-        <w:t>Use this for:</w:t>
-      </w:r>
-    </w:p>
-    <w:p/>
-    <w:p>
-      <w:pPr>
-        <w:pStyle w:val="ManualBullet"/>
-      </w:pPr>
-      <w:r>
-        <w:t>detailed tables</w:t>
-      </w:r>
-    </w:p>
-    <w:p>
-      <w:pPr>
-        <w:pStyle w:val="ManualBullet"/>
-      </w:pPr>
-      <w:r>
-        <w:t>charts</w:t>
-      </w:r>
-    </w:p>
-    <w:p>
-      <w:pPr>
-        <w:pStyle w:val="ManualBullet"/>
-      </w:pPr>
-      <w:r>
-        <w:t>exports</w:t>
-      </w:r>
-    </w:p>
-    <w:p>
-      <w:pPr>
-        <w:pStyle w:val="ManualBullet"/>
-      </w:pPr>
-      <w:r>
-        <w:t>advanced filters</w:t>
-      </w:r>
-    </w:p>
-    <w:p>
-      <w:pPr>
-        <w:pStyle w:val="ManualBullet"/>
-      </w:pPr>
-      <w:r>
-        <w:t>distance analysis</w:t>
-      </w:r>
-    </w:p>
-    <w:p/>
-    <w:p>
-      <w:pPr>
-        <w:pStyle w:val="Heading2"/>
-      </w:pPr>
-      <w:r>
-        <w:t>ML Dashboard</w:t>
-      </w:r>
-    </w:p>
-    <w:p>
-      <w:r>
-        <w:t>Use this for:</w:t>
-      </w:r>
-    </w:p>
-    <w:p/>
-    <w:p>
-      <w:pPr>
-        <w:pStyle w:val="ManualBullet"/>
-      </w:pPr>
-      <w:r>
-        <w:t>event-by-event review</w:t>
-      </w:r>
-    </w:p>
-    <w:p>
-      <w:pPr>
-        <w:pStyle w:val="ManualBullet"/>
-      </w:pPr>
-      <w:r>
-        <w:t>participant review where source data supports it</w:t>
-      </w:r>
-    </w:p>
-    <w:p>
-      <w:pPr>
-        <w:pStyle w:val="ManualBullet"/>
-      </w:pPr>
-      <w:r>
-        <w:t>medical and emergency information where available</w:t>
-      </w:r>
-    </w:p>
-    <w:p/>
-    <w:p>
-      <w:pPr>
-        <w:pStyle w:val="Heading2"/>
-      </w:pPr>
-      <w:r>
-        <w:t>Funder Dashboard</w:t>
-      </w:r>
-    </w:p>
-    <w:p>
-      <w:r>
-        <w:t>Use this for:</w:t>
-      </w:r>
-    </w:p>
-    <w:p/>
-    <w:p>
-      <w:pPr>
-        <w:pStyle w:val="ManualBullet"/>
-      </w:pPr>
-      <w:r>
-        <w:t>checking what funder-facing users will see</w:t>
-      </w:r>
-    </w:p>
-    <w:p>
-      <w:pPr>
-        <w:pStyle w:val="ManualBullet"/>
-      </w:pPr>
-      <w:r>
-        <w:t>sponsor or funder reporting review</w:t>
-      </w:r>
-    </w:p>
-    <w:p/>
-    <w:p>
-      <w:pPr>
-        <w:pStyle w:val="Heading2"/>
-      </w:pPr>
-      <w:r>
-        <w:t>Case Studies</w:t>
-      </w:r>
-    </w:p>
-    <w:p>
-      <w:r>
-        <w:t>Use this for:</w:t>
-      </w:r>
-    </w:p>
-    <w:p/>
-    <w:p>
-      <w:pPr>
-        <w:pStyle w:val="ManualBullet"/>
-      </w:pPr>
-      <w:r>
-        <w:t>reading existing stories</w:t>
-      </w:r>
-    </w:p>
-    <w:p>
-      <w:pPr>
-        <w:pStyle w:val="ManualBullet"/>
-      </w:pPr>
-      <w:r>
-        <w:t>filtering by date and region</w:t>
-      </w:r>
-    </w:p>
-    <w:p>
-      <w:pPr>
-        <w:pStyle w:val="ManualBullet"/>
-      </w:pPr>
-      <w:r>
-        <w:t>adding new stories and testimonials</w:t>
-      </w:r>
-    </w:p>
-    <w:p/>
-    <w:p>
-      <w:pPr>
-        <w:pStyle w:val="Heading1"/>
-      </w:pPr>
-      <w:r>
-        <w:t>9. Recommended way of working</w:t>
+        <w:t>The dashboard looks out of date</w:t>
       </w:r>
     </w:p>
     <w:p>
@@ -1764,7 +2955,7 @@
         <w:t>Sync Performance</w:t>
       </w:r>
       <w:r>
-        <w:t xml:space="preserve"> if the data looks old.</w:t>
+        <w:t>.</w:t>
       </w:r>
     </w:p>
     <w:p>
@@ -1772,7 +2963,7 @@
         <w:pStyle w:val="ManualNumber"/>
       </w:pPr>
       <w:r>
-        <w:t>Run a smoke test before a manual sync.</w:t>
+        <w:t>Run a smoke test.</w:t>
       </w:r>
     </w:p>
     <w:p>
@@ -1780,7 +2971,16 @@
         <w:pStyle w:val="ManualNumber"/>
       </w:pPr>
       <w:r>
-        <w:t>Record a clear reason before changing access or deleting a user.</w:t>
+        <w:t>Run a manual sync if appropriate.</w:t>
+      </w:r>
+    </w:p>
+    <w:p/>
+    <w:p>
+      <w:pPr>
+        <w:pStyle w:val="Heading2"/>
+      </w:pPr>
+      <w:r>
+        <w:t>A sync looks stuck</w:t>
       </w:r>
     </w:p>
     <w:p>
@@ -1788,65 +2988,15 @@
         <w:pStyle w:val="ManualNumber"/>
       </w:pPr>
       <w:r>
-        <w:t>Check the audit log if you are unsure what has already happened.</w:t>
-      </w:r>
-    </w:p>
-    <w:p/>
-    <w:p>
-      <w:pPr>
-        <w:pStyle w:val="Heading1"/>
-      </w:pPr>
-      <w:r>
-        <w:t>10. Troubleshooting</w:t>
-      </w:r>
-    </w:p>
-    <w:p>
-      <w:pPr>
-        <w:pStyle w:val="Heading2"/>
-      </w:pPr>
-      <w:r>
-        <w:t>`Admin client not available`</w:t>
-      </w:r>
-    </w:p>
-    <w:p>
-      <w:pPr>
-        <w:pStyle w:val="ManualBullet"/>
-      </w:pPr>
-      <w:r>
-        <w:t>check the Admin Supabase settings</w:t>
-      </w:r>
-    </w:p>
-    <w:p>
-      <w:pPr>
-        <w:pStyle w:val="ManualBullet"/>
-      </w:pPr>
-      <w:r>
-        <w:t>confirm the service-role configuration is loaded correctly</w:t>
-      </w:r>
-    </w:p>
-    <w:p/>
-    <w:p>
-      <w:pPr>
-        <w:pStyle w:val="Heading2"/>
-      </w:pPr>
-      <w:r>
-        <w:t>Sync looks stuck</w:t>
-      </w:r>
-    </w:p>
-    <w:p>
-      <w:pPr>
-        <w:pStyle w:val="ManualBullet"/>
-      </w:pPr>
-      <w:r>
-        <w:t>review the sync status first</w:t>
-      </w:r>
-    </w:p>
-    <w:p>
-      <w:pPr>
-        <w:pStyle w:val="ManualBullet"/>
-      </w:pPr>
-      <w:r>
-        <w:t xml:space="preserve">use </w:t>
+        <w:t>Review the current sync status.</w:t>
+      </w:r>
+    </w:p>
+    <w:p>
+      <w:pPr>
+        <w:pStyle w:val="ManualNumber"/>
+      </w:pPr>
+      <w:r>
+        <w:t xml:space="preserve">Use </w:t>
       </w:r>
       <w:r>
         <w:rPr>
@@ -1855,15 +3005,15 @@
         <w:t>Stop Manual API Sync</w:t>
       </w:r>
       <w:r>
-        <w:t xml:space="preserve"> only when needed</w:t>
-      </w:r>
-    </w:p>
-    <w:p>
-      <w:pPr>
-        <w:pStyle w:val="ManualBullet"/>
-      </w:pPr>
-      <w:r>
-        <w:t xml:space="preserve">use </w:t>
+        <w:t xml:space="preserve"> only if needed.</w:t>
+      </w:r>
+    </w:p>
+    <w:p>
+      <w:pPr>
+        <w:pStyle w:val="ManualNumber"/>
+      </w:pPr>
+      <w:r>
+        <w:t xml:space="preserve">Use </w:t>
       </w:r>
       <w:r>
         <w:rPr>
@@ -1872,7 +3022,7 @@
         <w:t>Clear Stuck Sync</w:t>
       </w:r>
       <w:r>
-        <w:t xml:space="preserve"> only after checking nothing is still running</w:t>
+        <w:t xml:space="preserve"> only after confirming nothing active is still running.</w:t>
       </w:r>
     </w:p>
     <w:p/>
@@ -1881,109 +3031,39 @@
         <w:pStyle w:val="Heading2"/>
       </w:pPr>
       <w:r>
-        <w:t>A user cannot sign in</w:t>
-      </w:r>
-    </w:p>
-    <w:p>
-      <w:pPr>
-        <w:pStyle w:val="ManualBullet"/>
-      </w:pPr>
-      <w:r>
-        <w:t>check whether they requested a password reset</w:t>
-      </w:r>
-    </w:p>
-    <w:p>
-      <w:pPr>
-        <w:pStyle w:val="ManualBullet"/>
-      </w:pPr>
-      <w:r>
-        <w:t>reset the password manually if needed</w:t>
-      </w:r>
-    </w:p>
-    <w:p>
-      <w:pPr>
-        <w:pStyle w:val="ManualBullet"/>
-      </w:pPr>
-      <w:r>
-        <w:t>check that the user still has the correct role</w:t>
-      </w:r>
-    </w:p>
-    <w:p/>
-    <w:p>
-      <w:pPr>
-        <w:pStyle w:val="Heading2"/>
-      </w:pPr>
-      <w:r>
-        <w:t>The dashboard looks out of date</w:t>
-      </w:r>
-    </w:p>
-    <w:p>
-      <w:pPr>
-        <w:pStyle w:val="ManualBullet"/>
-      </w:pPr>
-      <w:r>
-        <w:t xml:space="preserve">check </w:t>
-      </w:r>
-      <w:r>
-        <w:rPr>
-          <w:rFonts w:ascii="Consolas" w:hAnsi="Consolas"/>
-        </w:rPr>
-        <w:t>Last Data Refresh</w:t>
-      </w:r>
-    </w:p>
-    <w:p>
-      <w:pPr>
-        <w:pStyle w:val="ManualBullet"/>
-      </w:pPr>
-      <w:r>
-        <w:t xml:space="preserve">review </w:t>
-      </w:r>
-      <w:r>
-        <w:rPr>
-          <w:rFonts w:ascii="Consolas" w:hAnsi="Consolas"/>
-        </w:rPr>
-        <w:t>Sync Performance</w:t>
-      </w:r>
-    </w:p>
-    <w:p>
-      <w:pPr>
-        <w:pStyle w:val="ManualBullet"/>
-      </w:pPr>
-      <w:r>
-        <w:t>run a smoke test and then a manual sync if needed</w:t>
-      </w:r>
-    </w:p>
-    <w:p/>
-    <w:p>
-      <w:pPr>
-        <w:pStyle w:val="Heading2"/>
-      </w:pPr>
-      <w:r>
-        <w:t>Someone needs different access</w:t>
-      </w:r>
-    </w:p>
-    <w:p>
-      <w:pPr>
-        <w:pStyle w:val="ManualBullet"/>
-      </w:pPr>
-      <w:r>
-        <w:t>update the role instead of deleting the account</w:t>
-      </w:r>
-    </w:p>
-    <w:p>
-      <w:pPr>
-        <w:pStyle w:val="ManualBullet"/>
-      </w:pPr>
-      <w:r>
-        <w:t>use least privilege</w:t>
-      </w:r>
-    </w:p>
-    <w:p>
-      <w:pPr>
-        <w:pStyle w:val="ManualBullet"/>
-      </w:pPr>
-      <w:r>
-        <w:t>record the reason for the change</w:t>
+        <w:t>A user has the wrong access</w:t>
+      </w:r>
+    </w:p>
+    <w:p>
+      <w:pPr>
+        <w:pStyle w:val="ManualNumber"/>
+      </w:pPr>
+      <w:r>
+        <w:t>Review the user's current role.</w:t>
+      </w:r>
+    </w:p>
+    <w:p>
+      <w:pPr>
+        <w:pStyle w:val="ManualNumber"/>
+      </w:pPr>
+      <w:r>
+        <w:t>Confirm what access they actually need.</w:t>
+      </w:r>
+    </w:p>
+    <w:p>
+      <w:pPr>
+        <w:pStyle w:val="ManualNumber"/>
+      </w:pPr>
+      <w:r>
+        <w:t>Update the role with a clear reason.</w:t>
+      </w:r>
+    </w:p>
+    <w:p>
+      <w:pPr>
+        <w:pStyle w:val="ManualNumber"/>
+      </w:pPr>
+      <w:r>
+        <w:t>Ask the user to sign out and back in if needed.</w:t>
       </w:r>
     </w:p>
     <w:sectPr>

</xml_diff>

<commit_message>
Add title pages contents and page numbers to manuals
</commit_message>
<xml_diff>
--- a/docs/manuals/docx/ADMIN-MANUAL.docx
+++ b/docs/manuals/docx/ADMIN-MANUAL.docx
@@ -2,11 +2,3429 @@
 <file path=word/document.xml><?xml version="1.0" encoding="utf-8"?>
 <w:document xmlns:wpc="http://schemas.microsoft.com/office/word/2010/wordprocessingCanvas" xmlns:cx="http://schemas.microsoft.com/office/drawing/2014/chartex" xmlns:cx1="http://schemas.microsoft.com/office/drawing/2015/9/8/chartex" xmlns:cx2="http://schemas.microsoft.com/office/drawing/2015/10/21/chartex" xmlns:cx3="http://schemas.microsoft.com/office/drawing/2016/5/9/chartex" xmlns:cx4="http://schemas.microsoft.com/office/drawing/2016/5/10/chartex" xmlns:cx5="http://schemas.microsoft.com/office/drawing/2016/5/11/chartex" xmlns:cx6="http://schemas.microsoft.com/office/drawing/2016/5/12/chartex" xmlns:cx7="http://schemas.microsoft.com/office/drawing/2016/5/13/chartex" xmlns:cx8="http://schemas.microsoft.com/office/drawing/2016/5/14/chartex" xmlns:mc="http://schemas.openxmlformats.org/markup-compatibility/2006" xmlns:aink="http://schemas.microsoft.com/office/drawing/2016/ink" xmlns:am3d="http://schemas.microsoft.com/office/drawing/2017/model3d" xmlns:o="urn:schemas-microsoft-com:office:office" xmlns:oel="http://schemas.microsoft.com/office/2019/extlst" xmlns:r="http://schemas.openxmlformats.org/officeDocument/2006/relationships" xmlns:m="http://schemas.openxmlformats.org/officeDocument/2006/math" xmlns:v="urn:schemas-microsoft-com:vml" xmlns:wp14="http://schemas.microsoft.com/office/word/2010/wordprocessingDrawing" xmlns:wp="http://schemas.openxmlformats.org/drawingml/2006/wordprocessingDrawing" xmlns:w10="urn:schemas-microsoft-com:office:word" xmlns:w="http://schemas.openxmlformats.org/wordprocessingml/2006/main" xmlns:w14="http://schemas.microsoft.com/office/word/2010/wordml" xmlns:w15="http://schemas.microsoft.com/office/word/2012/wordml" xmlns:w16cex="http://schemas.microsoft.com/office/word/2018/wordml/cex" xmlns:w16cid="http://schemas.microsoft.com/office/word/2016/wordml/cid" xmlns:w16="http://schemas.microsoft.com/office/word/2018/wordml" xmlns:w16du="http://schemas.microsoft.com/office/word/2023/wordml/word16du" xmlns:w16sdtdh="http://schemas.microsoft.com/office/word/2020/wordml/sdtdatahash" xmlns:w16sdtfl="http://schemas.microsoft.com/office/word/2024/wordml/sdtformatlock" xmlns:w16se="http://schemas.microsoft.com/office/word/2015/wordml/symex" xmlns:wpg="http://schemas.microsoft.com/office/word/2010/wordprocessingGroup" xmlns:wpi="http://schemas.microsoft.com/office/word/2010/wordprocessingInk" xmlns:wne="http://schemas.microsoft.com/office/word/2006/wordml" xmlns:wps="http://schemas.microsoft.com/office/word/2010/wordprocessingShape" mc:Ignorable="w14 w15 w16se w16cid w16 w16cex w16sdtdh w16sdtfl w16du wp14">
   <w:body>
+    <w:p/>
+    <w:p/>
+    <w:p>
+      <w:pPr>
+        <w:jc w:val="center"/>
+      </w:pPr>
+      <w:r>
+        <w:rPr>
+          <w:b/>
+          <w:sz w:val="48"/>
+        </w:rPr>
+        <w:t>Admin Dashboard Manual</w:t>
+      </w:r>
+    </w:p>
+    <w:p>
+      <w:pPr>
+        <w:jc w:val="center"/>
+      </w:pPr>
+      <w:r>
+        <w:rPr>
+          <w:sz w:val="24"/>
+        </w:rPr>
+        <w:t>Audience: `Admin` users</w:t>
+      </w:r>
+    </w:p>
+    <w:p>
+      <w:pPr>
+        <w:jc w:val="center"/>
+      </w:pPr>
+      <w:r>
+        <w:t>Generated: RPL-KPIs</w:t>
+      </w:r>
+    </w:p>
+    <w:p>
+      <w:pPr>
+        <w:jc w:val="center"/>
+      </w:pPr>
+      <w:r>
+        <w:t>Mind Over Mountains Dashboard Guide</w:t>
+      </w:r>
+    </w:p>
+    <w:p>
+      <w:r>
+        <w:br w:type="page"/>
+      </w:r>
+    </w:p>
+    <w:p>
+      <w:pPr>
+        <w:pStyle w:val="Heading1"/>
+      </w:pPr>
+      <w:bookmarkStart w:id="0" w:name="_Toc226493503"/>
+      <w:r>
+        <w:lastRenderedPageBreak/>
+        <w:t>Contents</w:t>
+      </w:r>
+      <w:bookmarkEnd w:id="0"/>
+    </w:p>
+    <w:p>
+      <w:pPr>
+        <w:pStyle w:val="TOC1"/>
+        <w:tabs>
+          <w:tab w:val="right" w:leader="dot" w:pos="9595"/>
+        </w:tabs>
+        <w:rPr>
+          <w:noProof/>
+        </w:rPr>
+      </w:pPr>
+      <w:r>
+        <w:fldChar w:fldCharType="begin"/>
+      </w:r>
+      <w:r>
+        <w:instrText xml:space="preserve"> TOC \o "1-3" \h \z \u </w:instrText>
+      </w:r>
+      <w:r>
+        <w:fldChar w:fldCharType="separate"/>
+      </w:r>
+      <w:hyperlink w:anchor="_Toc226493503" w:history="1">
+        <w:r>
+          <w:rPr>
+            <w:rStyle w:val="Hyperlink"/>
+            <w:noProof/>
+          </w:rPr>
+          <w:t>Contents</w:t>
+        </w:r>
+        <w:r>
+          <w:rPr>
+            <w:noProof/>
+            <w:webHidden/>
+          </w:rPr>
+          <w:tab/>
+        </w:r>
+        <w:r>
+          <w:rPr>
+            <w:noProof/>
+            <w:webHidden/>
+          </w:rPr>
+          <w:fldChar w:fldCharType="begin"/>
+        </w:r>
+        <w:r>
+          <w:rPr>
+            <w:noProof/>
+            <w:webHidden/>
+          </w:rPr>
+          <w:instrText xml:space="preserve"> PAGEREF _Toc226493503 \h </w:instrText>
+        </w:r>
+        <w:r>
+          <w:rPr>
+            <w:noProof/>
+            <w:webHidden/>
+          </w:rPr>
+        </w:r>
+        <w:r>
+          <w:rPr>
+            <w:noProof/>
+            <w:webHidden/>
+          </w:rPr>
+          <w:fldChar w:fldCharType="separate"/>
+        </w:r>
+        <w:r>
+          <w:rPr>
+            <w:noProof/>
+            <w:webHidden/>
+          </w:rPr>
+          <w:t>2</w:t>
+        </w:r>
+        <w:r>
+          <w:rPr>
+            <w:noProof/>
+            <w:webHidden/>
+          </w:rPr>
+          <w:fldChar w:fldCharType="end"/>
+        </w:r>
+      </w:hyperlink>
+    </w:p>
+    <w:p>
+      <w:pPr>
+        <w:pStyle w:val="TOC1"/>
+        <w:tabs>
+          <w:tab w:val="right" w:leader="dot" w:pos="9595"/>
+        </w:tabs>
+        <w:rPr>
+          <w:noProof/>
+        </w:rPr>
+      </w:pPr>
+      <w:hyperlink w:anchor="_Toc226493504" w:history="1">
+        <w:r>
+          <w:rPr>
+            <w:rStyle w:val="Hyperlink"/>
+            <w:noProof/>
+          </w:rPr>
+          <w:t>1. Introduction</w:t>
+        </w:r>
+        <w:r>
+          <w:rPr>
+            <w:noProof/>
+            <w:webHidden/>
+          </w:rPr>
+          <w:tab/>
+        </w:r>
+        <w:r>
+          <w:rPr>
+            <w:noProof/>
+            <w:webHidden/>
+          </w:rPr>
+          <w:fldChar w:fldCharType="begin"/>
+        </w:r>
+        <w:r>
+          <w:rPr>
+            <w:noProof/>
+            <w:webHidden/>
+          </w:rPr>
+          <w:instrText xml:space="preserve"> PAGEREF _Toc226493504 \h </w:instrText>
+        </w:r>
+        <w:r>
+          <w:rPr>
+            <w:noProof/>
+            <w:webHidden/>
+          </w:rPr>
+        </w:r>
+        <w:r>
+          <w:rPr>
+            <w:noProof/>
+            <w:webHidden/>
+          </w:rPr>
+          <w:fldChar w:fldCharType="separate"/>
+        </w:r>
+        <w:r>
+          <w:rPr>
+            <w:noProof/>
+            <w:webHidden/>
+          </w:rPr>
+          <w:t>4</w:t>
+        </w:r>
+        <w:r>
+          <w:rPr>
+            <w:noProof/>
+            <w:webHidden/>
+          </w:rPr>
+          <w:fldChar w:fldCharType="end"/>
+        </w:r>
+      </w:hyperlink>
+    </w:p>
+    <w:p>
+      <w:pPr>
+        <w:pStyle w:val="TOC1"/>
+        <w:tabs>
+          <w:tab w:val="right" w:leader="dot" w:pos="9595"/>
+        </w:tabs>
+        <w:rPr>
+          <w:noProof/>
+        </w:rPr>
+      </w:pPr>
+      <w:hyperlink w:anchor="_Toc226493505" w:history="1">
+        <w:r>
+          <w:rPr>
+            <w:rStyle w:val="Hyperlink"/>
+            <w:noProof/>
+          </w:rPr>
+          <w:t>2. What the Admin role is for</w:t>
+        </w:r>
+        <w:r>
+          <w:rPr>
+            <w:noProof/>
+            <w:webHidden/>
+          </w:rPr>
+          <w:tab/>
+        </w:r>
+        <w:r>
+          <w:rPr>
+            <w:noProof/>
+            <w:webHidden/>
+          </w:rPr>
+          <w:fldChar w:fldCharType="begin"/>
+        </w:r>
+        <w:r>
+          <w:rPr>
+            <w:noProof/>
+            <w:webHidden/>
+          </w:rPr>
+          <w:instrText xml:space="preserve"> PAGEREF _Toc226493505 \h </w:instrText>
+        </w:r>
+        <w:r>
+          <w:rPr>
+            <w:noProof/>
+            <w:webHidden/>
+          </w:rPr>
+        </w:r>
+        <w:r>
+          <w:rPr>
+            <w:noProof/>
+            <w:webHidden/>
+          </w:rPr>
+          <w:fldChar w:fldCharType="separate"/>
+        </w:r>
+        <w:r>
+          <w:rPr>
+            <w:noProof/>
+            <w:webHidden/>
+          </w:rPr>
+          <w:t>5</w:t>
+        </w:r>
+        <w:r>
+          <w:rPr>
+            <w:noProof/>
+            <w:webHidden/>
+          </w:rPr>
+          <w:fldChar w:fldCharType="end"/>
+        </w:r>
+      </w:hyperlink>
+    </w:p>
+    <w:p>
+      <w:pPr>
+        <w:pStyle w:val="TOC1"/>
+        <w:tabs>
+          <w:tab w:val="right" w:leader="dot" w:pos="9595"/>
+        </w:tabs>
+        <w:rPr>
+          <w:noProof/>
+        </w:rPr>
+      </w:pPr>
+      <w:hyperlink w:anchor="_Toc226493506" w:history="1">
+        <w:r>
+          <w:rPr>
+            <w:rStyle w:val="Hyperlink"/>
+            <w:noProof/>
+          </w:rPr>
+          <w:t>3. Before you make changes</w:t>
+        </w:r>
+        <w:r>
+          <w:rPr>
+            <w:noProof/>
+            <w:webHidden/>
+          </w:rPr>
+          <w:tab/>
+        </w:r>
+        <w:r>
+          <w:rPr>
+            <w:noProof/>
+            <w:webHidden/>
+          </w:rPr>
+          <w:fldChar w:fldCharType="begin"/>
+        </w:r>
+        <w:r>
+          <w:rPr>
+            <w:noProof/>
+            <w:webHidden/>
+          </w:rPr>
+          <w:instrText xml:space="preserve"> PAGEREF _Toc226493506 \h </w:instrText>
+        </w:r>
+        <w:r>
+          <w:rPr>
+            <w:noProof/>
+            <w:webHidden/>
+          </w:rPr>
+        </w:r>
+        <w:r>
+          <w:rPr>
+            <w:noProof/>
+            <w:webHidden/>
+          </w:rPr>
+          <w:fldChar w:fldCharType="separate"/>
+        </w:r>
+        <w:r>
+          <w:rPr>
+            <w:noProof/>
+            <w:webHidden/>
+          </w:rPr>
+          <w:t>5</w:t>
+        </w:r>
+        <w:r>
+          <w:rPr>
+            <w:noProof/>
+            <w:webHidden/>
+          </w:rPr>
+          <w:fldChar w:fldCharType="end"/>
+        </w:r>
+      </w:hyperlink>
+    </w:p>
+    <w:p>
+      <w:pPr>
+        <w:pStyle w:val="TOC1"/>
+        <w:tabs>
+          <w:tab w:val="right" w:leader="dot" w:pos="9595"/>
+        </w:tabs>
+        <w:rPr>
+          <w:noProof/>
+        </w:rPr>
+      </w:pPr>
+      <w:hyperlink w:anchor="_Toc226493507" w:history="1">
+        <w:r>
+          <w:rPr>
+            <w:rStyle w:val="Hyperlink"/>
+            <w:noProof/>
+          </w:rPr>
+          <w:t>4. Signing in and moving around</w:t>
+        </w:r>
+        <w:r>
+          <w:rPr>
+            <w:noProof/>
+            <w:webHidden/>
+          </w:rPr>
+          <w:tab/>
+        </w:r>
+        <w:r>
+          <w:rPr>
+            <w:noProof/>
+            <w:webHidden/>
+          </w:rPr>
+          <w:fldChar w:fldCharType="begin"/>
+        </w:r>
+        <w:r>
+          <w:rPr>
+            <w:noProof/>
+            <w:webHidden/>
+          </w:rPr>
+          <w:instrText xml:space="preserve"> PAGEREF _Toc226493507 \h </w:instrText>
+        </w:r>
+        <w:r>
+          <w:rPr>
+            <w:noProof/>
+            <w:webHidden/>
+          </w:rPr>
+        </w:r>
+        <w:r>
+          <w:rPr>
+            <w:noProof/>
+            <w:webHidden/>
+          </w:rPr>
+          <w:fldChar w:fldCharType="separate"/>
+        </w:r>
+        <w:r>
+          <w:rPr>
+            <w:noProof/>
+            <w:webHidden/>
+          </w:rPr>
+          <w:t>6</w:t>
+        </w:r>
+        <w:r>
+          <w:rPr>
+            <w:noProof/>
+            <w:webHidden/>
+          </w:rPr>
+          <w:fldChar w:fldCharType="end"/>
+        </w:r>
+      </w:hyperlink>
+    </w:p>
+    <w:p>
+      <w:pPr>
+        <w:pStyle w:val="TOC1"/>
+        <w:tabs>
+          <w:tab w:val="right" w:leader="dot" w:pos="9595"/>
+        </w:tabs>
+        <w:rPr>
+          <w:noProof/>
+        </w:rPr>
+      </w:pPr>
+      <w:hyperlink w:anchor="_Toc226493508" w:history="1">
+        <w:r>
+          <w:rPr>
+            <w:rStyle w:val="Hyperlink"/>
+            <w:noProof/>
+          </w:rPr>
+          <w:t>5. Main areas of the Admin Dashboard</w:t>
+        </w:r>
+        <w:r>
+          <w:rPr>
+            <w:noProof/>
+            <w:webHidden/>
+          </w:rPr>
+          <w:tab/>
+        </w:r>
+        <w:r>
+          <w:rPr>
+            <w:noProof/>
+            <w:webHidden/>
+          </w:rPr>
+          <w:fldChar w:fldCharType="begin"/>
+        </w:r>
+        <w:r>
+          <w:rPr>
+            <w:noProof/>
+            <w:webHidden/>
+          </w:rPr>
+          <w:instrText xml:space="preserve"> PAGEREF _Toc226493508 \h </w:instrText>
+        </w:r>
+        <w:r>
+          <w:rPr>
+            <w:noProof/>
+            <w:webHidden/>
+          </w:rPr>
+        </w:r>
+        <w:r>
+          <w:rPr>
+            <w:noProof/>
+            <w:webHidden/>
+          </w:rPr>
+          <w:fldChar w:fldCharType="separate"/>
+        </w:r>
+        <w:r>
+          <w:rPr>
+            <w:noProof/>
+            <w:webHidden/>
+          </w:rPr>
+          <w:t>6</w:t>
+        </w:r>
+        <w:r>
+          <w:rPr>
+            <w:noProof/>
+            <w:webHidden/>
+          </w:rPr>
+          <w:fldChar w:fldCharType="end"/>
+        </w:r>
+      </w:hyperlink>
+    </w:p>
+    <w:p>
+      <w:pPr>
+        <w:pStyle w:val="TOC1"/>
+        <w:tabs>
+          <w:tab w:val="right" w:leader="dot" w:pos="9595"/>
+        </w:tabs>
+        <w:rPr>
+          <w:noProof/>
+        </w:rPr>
+      </w:pPr>
+      <w:hyperlink w:anchor="_Toc226493509" w:history="1">
+        <w:r>
+          <w:rPr>
+            <w:rStyle w:val="Hyperlink"/>
+            <w:noProof/>
+          </w:rPr>
+          <w:t>6. Password reset requests</w:t>
+        </w:r>
+        <w:r>
+          <w:rPr>
+            <w:noProof/>
+            <w:webHidden/>
+          </w:rPr>
+          <w:tab/>
+        </w:r>
+        <w:r>
+          <w:rPr>
+            <w:noProof/>
+            <w:webHidden/>
+          </w:rPr>
+          <w:fldChar w:fldCharType="begin"/>
+        </w:r>
+        <w:r>
+          <w:rPr>
+            <w:noProof/>
+            <w:webHidden/>
+          </w:rPr>
+          <w:instrText xml:space="preserve"> PAGEREF _Toc226493509 \h </w:instrText>
+        </w:r>
+        <w:r>
+          <w:rPr>
+            <w:noProof/>
+            <w:webHidden/>
+          </w:rPr>
+        </w:r>
+        <w:r>
+          <w:rPr>
+            <w:noProof/>
+            <w:webHidden/>
+          </w:rPr>
+          <w:fldChar w:fldCharType="separate"/>
+        </w:r>
+        <w:r>
+          <w:rPr>
+            <w:noProof/>
+            <w:webHidden/>
+          </w:rPr>
+          <w:t>7</w:t>
+        </w:r>
+        <w:r>
+          <w:rPr>
+            <w:noProof/>
+            <w:webHidden/>
+          </w:rPr>
+          <w:fldChar w:fldCharType="end"/>
+        </w:r>
+      </w:hyperlink>
+    </w:p>
+    <w:p>
+      <w:pPr>
+        <w:pStyle w:val="TOC2"/>
+        <w:tabs>
+          <w:tab w:val="right" w:leader="dot" w:pos="9595"/>
+        </w:tabs>
+        <w:rPr>
+          <w:noProof/>
+        </w:rPr>
+      </w:pPr>
+      <w:hyperlink w:anchor="_Toc226493510" w:history="1">
+        <w:r>
+          <w:rPr>
+            <w:rStyle w:val="Hyperlink"/>
+            <w:noProof/>
+          </w:rPr>
+          <w:t>6.1 When to use this section</w:t>
+        </w:r>
+        <w:r>
+          <w:rPr>
+            <w:noProof/>
+            <w:webHidden/>
+          </w:rPr>
+          <w:tab/>
+        </w:r>
+        <w:r>
+          <w:rPr>
+            <w:noProof/>
+            <w:webHidden/>
+          </w:rPr>
+          <w:fldChar w:fldCharType="begin"/>
+        </w:r>
+        <w:r>
+          <w:rPr>
+            <w:noProof/>
+            <w:webHidden/>
+          </w:rPr>
+          <w:instrText xml:space="preserve"> PAGEREF _Toc226493510 \h </w:instrText>
+        </w:r>
+        <w:r>
+          <w:rPr>
+            <w:noProof/>
+            <w:webHidden/>
+          </w:rPr>
+        </w:r>
+        <w:r>
+          <w:rPr>
+            <w:noProof/>
+            <w:webHidden/>
+          </w:rPr>
+          <w:fldChar w:fldCharType="separate"/>
+        </w:r>
+        <w:r>
+          <w:rPr>
+            <w:noProof/>
+            <w:webHidden/>
+          </w:rPr>
+          <w:t>7</w:t>
+        </w:r>
+        <w:r>
+          <w:rPr>
+            <w:noProof/>
+            <w:webHidden/>
+          </w:rPr>
+          <w:fldChar w:fldCharType="end"/>
+        </w:r>
+      </w:hyperlink>
+    </w:p>
+    <w:p>
+      <w:pPr>
+        <w:pStyle w:val="TOC2"/>
+        <w:tabs>
+          <w:tab w:val="right" w:leader="dot" w:pos="9595"/>
+        </w:tabs>
+        <w:rPr>
+          <w:noProof/>
+        </w:rPr>
+      </w:pPr>
+      <w:hyperlink w:anchor="_Toc226493511" w:history="1">
+        <w:r>
+          <w:rPr>
+            <w:rStyle w:val="Hyperlink"/>
+            <w:noProof/>
+          </w:rPr>
+          <w:t>6.2 Step-by-step reset workflow</w:t>
+        </w:r>
+        <w:r>
+          <w:rPr>
+            <w:noProof/>
+            <w:webHidden/>
+          </w:rPr>
+          <w:tab/>
+        </w:r>
+        <w:r>
+          <w:rPr>
+            <w:noProof/>
+            <w:webHidden/>
+          </w:rPr>
+          <w:fldChar w:fldCharType="begin"/>
+        </w:r>
+        <w:r>
+          <w:rPr>
+            <w:noProof/>
+            <w:webHidden/>
+          </w:rPr>
+          <w:instrText xml:space="preserve"> PAGEREF _Toc226493511 \h </w:instrText>
+        </w:r>
+        <w:r>
+          <w:rPr>
+            <w:noProof/>
+            <w:webHidden/>
+          </w:rPr>
+        </w:r>
+        <w:r>
+          <w:rPr>
+            <w:noProof/>
+            <w:webHidden/>
+          </w:rPr>
+          <w:fldChar w:fldCharType="separate"/>
+        </w:r>
+        <w:r>
+          <w:rPr>
+            <w:noProof/>
+            <w:webHidden/>
+          </w:rPr>
+          <w:t>7</w:t>
+        </w:r>
+        <w:r>
+          <w:rPr>
+            <w:noProof/>
+            <w:webHidden/>
+          </w:rPr>
+          <w:fldChar w:fldCharType="end"/>
+        </w:r>
+      </w:hyperlink>
+    </w:p>
+    <w:p>
+      <w:pPr>
+        <w:pStyle w:val="TOC2"/>
+        <w:tabs>
+          <w:tab w:val="right" w:leader="dot" w:pos="9595"/>
+        </w:tabs>
+        <w:rPr>
+          <w:noProof/>
+        </w:rPr>
+      </w:pPr>
+      <w:hyperlink w:anchor="_Toc226493512" w:history="1">
+        <w:r>
+          <w:rPr>
+            <w:rStyle w:val="Hyperlink"/>
+            <w:noProof/>
+          </w:rPr>
+          <w:t>6.3 What should happen next</w:t>
+        </w:r>
+        <w:r>
+          <w:rPr>
+            <w:noProof/>
+            <w:webHidden/>
+          </w:rPr>
+          <w:tab/>
+        </w:r>
+        <w:r>
+          <w:rPr>
+            <w:noProof/>
+            <w:webHidden/>
+          </w:rPr>
+          <w:fldChar w:fldCharType="begin"/>
+        </w:r>
+        <w:r>
+          <w:rPr>
+            <w:noProof/>
+            <w:webHidden/>
+          </w:rPr>
+          <w:instrText xml:space="preserve"> PAGEREF _Toc226493512 \h </w:instrText>
+        </w:r>
+        <w:r>
+          <w:rPr>
+            <w:noProof/>
+            <w:webHidden/>
+          </w:rPr>
+        </w:r>
+        <w:r>
+          <w:rPr>
+            <w:noProof/>
+            <w:webHidden/>
+          </w:rPr>
+          <w:fldChar w:fldCharType="separate"/>
+        </w:r>
+        <w:r>
+          <w:rPr>
+            <w:noProof/>
+            <w:webHidden/>
+          </w:rPr>
+          <w:t>7</w:t>
+        </w:r>
+        <w:r>
+          <w:rPr>
+            <w:noProof/>
+            <w:webHidden/>
+          </w:rPr>
+          <w:fldChar w:fldCharType="end"/>
+        </w:r>
+      </w:hyperlink>
+    </w:p>
+    <w:p>
+      <w:pPr>
+        <w:pStyle w:val="TOC2"/>
+        <w:tabs>
+          <w:tab w:val="right" w:leader="dot" w:pos="9595"/>
+        </w:tabs>
+        <w:rPr>
+          <w:noProof/>
+        </w:rPr>
+      </w:pPr>
+      <w:hyperlink w:anchor="_Toc226493513" w:history="1">
+        <w:r>
+          <w:rPr>
+            <w:rStyle w:val="Hyperlink"/>
+            <w:noProof/>
+          </w:rPr>
+          <w:t>6.4 Good practice</w:t>
+        </w:r>
+        <w:r>
+          <w:rPr>
+            <w:noProof/>
+            <w:webHidden/>
+          </w:rPr>
+          <w:tab/>
+        </w:r>
+        <w:r>
+          <w:rPr>
+            <w:noProof/>
+            <w:webHidden/>
+          </w:rPr>
+          <w:fldChar w:fldCharType="begin"/>
+        </w:r>
+        <w:r>
+          <w:rPr>
+            <w:noProof/>
+            <w:webHidden/>
+          </w:rPr>
+          <w:instrText xml:space="preserve"> PAGEREF _Toc226493513 \h </w:instrText>
+        </w:r>
+        <w:r>
+          <w:rPr>
+            <w:noProof/>
+            <w:webHidden/>
+          </w:rPr>
+        </w:r>
+        <w:r>
+          <w:rPr>
+            <w:noProof/>
+            <w:webHidden/>
+          </w:rPr>
+          <w:fldChar w:fldCharType="separate"/>
+        </w:r>
+        <w:r>
+          <w:rPr>
+            <w:noProof/>
+            <w:webHidden/>
+          </w:rPr>
+          <w:t>8</w:t>
+        </w:r>
+        <w:r>
+          <w:rPr>
+            <w:noProof/>
+            <w:webHidden/>
+          </w:rPr>
+          <w:fldChar w:fldCharType="end"/>
+        </w:r>
+      </w:hyperlink>
+    </w:p>
+    <w:p>
+      <w:pPr>
+        <w:pStyle w:val="TOC1"/>
+        <w:tabs>
+          <w:tab w:val="right" w:leader="dot" w:pos="9595"/>
+        </w:tabs>
+        <w:rPr>
+          <w:noProof/>
+        </w:rPr>
+      </w:pPr>
+      <w:hyperlink w:anchor="_Toc226493514" w:history="1">
+        <w:r>
+          <w:rPr>
+            <w:rStyle w:val="Hyperlink"/>
+            <w:noProof/>
+          </w:rPr>
+          <w:t>7. Creating a new user</w:t>
+        </w:r>
+        <w:r>
+          <w:rPr>
+            <w:noProof/>
+            <w:webHidden/>
+          </w:rPr>
+          <w:tab/>
+        </w:r>
+        <w:r>
+          <w:rPr>
+            <w:noProof/>
+            <w:webHidden/>
+          </w:rPr>
+          <w:fldChar w:fldCharType="begin"/>
+        </w:r>
+        <w:r>
+          <w:rPr>
+            <w:noProof/>
+            <w:webHidden/>
+          </w:rPr>
+          <w:instrText xml:space="preserve"> PAGEREF _Toc226493514 \h </w:instrText>
+        </w:r>
+        <w:r>
+          <w:rPr>
+            <w:noProof/>
+            <w:webHidden/>
+          </w:rPr>
+        </w:r>
+        <w:r>
+          <w:rPr>
+            <w:noProof/>
+            <w:webHidden/>
+          </w:rPr>
+          <w:fldChar w:fldCharType="separate"/>
+        </w:r>
+        <w:r>
+          <w:rPr>
+            <w:noProof/>
+            <w:webHidden/>
+          </w:rPr>
+          <w:t>8</w:t>
+        </w:r>
+        <w:r>
+          <w:rPr>
+            <w:noProof/>
+            <w:webHidden/>
+          </w:rPr>
+          <w:fldChar w:fldCharType="end"/>
+        </w:r>
+      </w:hyperlink>
+    </w:p>
+    <w:p>
+      <w:pPr>
+        <w:pStyle w:val="TOC2"/>
+        <w:tabs>
+          <w:tab w:val="right" w:leader="dot" w:pos="9595"/>
+        </w:tabs>
+        <w:rPr>
+          <w:noProof/>
+        </w:rPr>
+      </w:pPr>
+      <w:hyperlink w:anchor="_Toc226493515" w:history="1">
+        <w:r>
+          <w:rPr>
+            <w:rStyle w:val="Hyperlink"/>
+            <w:noProof/>
+          </w:rPr>
+          <w:t>7.1 When to create a new account</w:t>
+        </w:r>
+        <w:r>
+          <w:rPr>
+            <w:noProof/>
+            <w:webHidden/>
+          </w:rPr>
+          <w:tab/>
+        </w:r>
+        <w:r>
+          <w:rPr>
+            <w:noProof/>
+            <w:webHidden/>
+          </w:rPr>
+          <w:fldChar w:fldCharType="begin"/>
+        </w:r>
+        <w:r>
+          <w:rPr>
+            <w:noProof/>
+            <w:webHidden/>
+          </w:rPr>
+          <w:instrText xml:space="preserve"> PAGEREF _Toc226493515 \h </w:instrText>
+        </w:r>
+        <w:r>
+          <w:rPr>
+            <w:noProof/>
+            <w:webHidden/>
+          </w:rPr>
+        </w:r>
+        <w:r>
+          <w:rPr>
+            <w:noProof/>
+            <w:webHidden/>
+          </w:rPr>
+          <w:fldChar w:fldCharType="separate"/>
+        </w:r>
+        <w:r>
+          <w:rPr>
+            <w:noProof/>
+            <w:webHidden/>
+          </w:rPr>
+          <w:t>8</w:t>
+        </w:r>
+        <w:r>
+          <w:rPr>
+            <w:noProof/>
+            <w:webHidden/>
+          </w:rPr>
+          <w:fldChar w:fldCharType="end"/>
+        </w:r>
+      </w:hyperlink>
+    </w:p>
+    <w:p>
+      <w:pPr>
+        <w:pStyle w:val="TOC2"/>
+        <w:tabs>
+          <w:tab w:val="right" w:leader="dot" w:pos="9595"/>
+        </w:tabs>
+        <w:rPr>
+          <w:noProof/>
+        </w:rPr>
+      </w:pPr>
+      <w:hyperlink w:anchor="_Toc226493516" w:history="1">
+        <w:r>
+          <w:rPr>
+            <w:rStyle w:val="Hyperlink"/>
+            <w:noProof/>
+          </w:rPr>
+          <w:t>7.2 Step-by-step workflow</w:t>
+        </w:r>
+        <w:r>
+          <w:rPr>
+            <w:noProof/>
+            <w:webHidden/>
+          </w:rPr>
+          <w:tab/>
+        </w:r>
+        <w:r>
+          <w:rPr>
+            <w:noProof/>
+            <w:webHidden/>
+          </w:rPr>
+          <w:fldChar w:fldCharType="begin"/>
+        </w:r>
+        <w:r>
+          <w:rPr>
+            <w:noProof/>
+            <w:webHidden/>
+          </w:rPr>
+          <w:instrText xml:space="preserve"> PAGEREF _Toc226493516 \h </w:instrText>
+        </w:r>
+        <w:r>
+          <w:rPr>
+            <w:noProof/>
+            <w:webHidden/>
+          </w:rPr>
+        </w:r>
+        <w:r>
+          <w:rPr>
+            <w:noProof/>
+            <w:webHidden/>
+          </w:rPr>
+          <w:fldChar w:fldCharType="separate"/>
+        </w:r>
+        <w:r>
+          <w:rPr>
+            <w:noProof/>
+            <w:webHidden/>
+          </w:rPr>
+          <w:t>8</w:t>
+        </w:r>
+        <w:r>
+          <w:rPr>
+            <w:noProof/>
+            <w:webHidden/>
+          </w:rPr>
+          <w:fldChar w:fldCharType="end"/>
+        </w:r>
+      </w:hyperlink>
+    </w:p>
+    <w:p>
+      <w:pPr>
+        <w:pStyle w:val="TOC2"/>
+        <w:tabs>
+          <w:tab w:val="right" w:leader="dot" w:pos="9595"/>
+        </w:tabs>
+        <w:rPr>
+          <w:noProof/>
+        </w:rPr>
+      </w:pPr>
+      <w:hyperlink w:anchor="_Toc226493517" w:history="1">
+        <w:r>
+          <w:rPr>
+            <w:rStyle w:val="Hyperlink"/>
+            <w:noProof/>
+          </w:rPr>
+          <w:t>7.3 Choosing the correct role</w:t>
+        </w:r>
+        <w:r>
+          <w:rPr>
+            <w:noProof/>
+            <w:webHidden/>
+          </w:rPr>
+          <w:tab/>
+        </w:r>
+        <w:r>
+          <w:rPr>
+            <w:noProof/>
+            <w:webHidden/>
+          </w:rPr>
+          <w:fldChar w:fldCharType="begin"/>
+        </w:r>
+        <w:r>
+          <w:rPr>
+            <w:noProof/>
+            <w:webHidden/>
+          </w:rPr>
+          <w:instrText xml:space="preserve"> PAGEREF _Toc226493517 \h </w:instrText>
+        </w:r>
+        <w:r>
+          <w:rPr>
+            <w:noProof/>
+            <w:webHidden/>
+          </w:rPr>
+        </w:r>
+        <w:r>
+          <w:rPr>
+            <w:noProof/>
+            <w:webHidden/>
+          </w:rPr>
+          <w:fldChar w:fldCharType="separate"/>
+        </w:r>
+        <w:r>
+          <w:rPr>
+            <w:noProof/>
+            <w:webHidden/>
+          </w:rPr>
+          <w:t>8</w:t>
+        </w:r>
+        <w:r>
+          <w:rPr>
+            <w:noProof/>
+            <w:webHidden/>
+          </w:rPr>
+          <w:fldChar w:fldCharType="end"/>
+        </w:r>
+      </w:hyperlink>
+    </w:p>
+    <w:p>
+      <w:pPr>
+        <w:pStyle w:val="TOC2"/>
+        <w:tabs>
+          <w:tab w:val="right" w:leader="dot" w:pos="9595"/>
+        </w:tabs>
+        <w:rPr>
+          <w:noProof/>
+        </w:rPr>
+      </w:pPr>
+      <w:hyperlink w:anchor="_Toc226493518" w:history="1">
+        <w:r>
+          <w:rPr>
+            <w:rStyle w:val="Hyperlink"/>
+            <w:noProof/>
+          </w:rPr>
+          <w:t>7.4 Good practice</w:t>
+        </w:r>
+        <w:r>
+          <w:rPr>
+            <w:noProof/>
+            <w:webHidden/>
+          </w:rPr>
+          <w:tab/>
+        </w:r>
+        <w:r>
+          <w:rPr>
+            <w:noProof/>
+            <w:webHidden/>
+          </w:rPr>
+          <w:fldChar w:fldCharType="begin"/>
+        </w:r>
+        <w:r>
+          <w:rPr>
+            <w:noProof/>
+            <w:webHidden/>
+          </w:rPr>
+          <w:instrText xml:space="preserve"> PAGEREF _Toc226493518 \h </w:instrText>
+        </w:r>
+        <w:r>
+          <w:rPr>
+            <w:noProof/>
+            <w:webHidden/>
+          </w:rPr>
+        </w:r>
+        <w:r>
+          <w:rPr>
+            <w:noProof/>
+            <w:webHidden/>
+          </w:rPr>
+          <w:fldChar w:fldCharType="separate"/>
+        </w:r>
+        <w:r>
+          <w:rPr>
+            <w:noProof/>
+            <w:webHidden/>
+          </w:rPr>
+          <w:t>9</w:t>
+        </w:r>
+        <w:r>
+          <w:rPr>
+            <w:noProof/>
+            <w:webHidden/>
+          </w:rPr>
+          <w:fldChar w:fldCharType="end"/>
+        </w:r>
+      </w:hyperlink>
+    </w:p>
+    <w:p>
+      <w:pPr>
+        <w:pStyle w:val="TOC1"/>
+        <w:tabs>
+          <w:tab w:val="right" w:leader="dot" w:pos="9595"/>
+        </w:tabs>
+        <w:rPr>
+          <w:noProof/>
+        </w:rPr>
+      </w:pPr>
+      <w:hyperlink w:anchor="_Toc226493519" w:history="1">
+        <w:r>
+          <w:rPr>
+            <w:rStyle w:val="Hyperlink"/>
+            <w:noProof/>
+          </w:rPr>
+          <w:t>8. Updating an existing user</w:t>
+        </w:r>
+        <w:r>
+          <w:rPr>
+            <w:noProof/>
+            <w:webHidden/>
+          </w:rPr>
+          <w:tab/>
+        </w:r>
+        <w:r>
+          <w:rPr>
+            <w:noProof/>
+            <w:webHidden/>
+          </w:rPr>
+          <w:fldChar w:fldCharType="begin"/>
+        </w:r>
+        <w:r>
+          <w:rPr>
+            <w:noProof/>
+            <w:webHidden/>
+          </w:rPr>
+          <w:instrText xml:space="preserve"> PAGEREF _Toc226493519 \h </w:instrText>
+        </w:r>
+        <w:r>
+          <w:rPr>
+            <w:noProof/>
+            <w:webHidden/>
+          </w:rPr>
+        </w:r>
+        <w:r>
+          <w:rPr>
+            <w:noProof/>
+            <w:webHidden/>
+          </w:rPr>
+          <w:fldChar w:fldCharType="separate"/>
+        </w:r>
+        <w:r>
+          <w:rPr>
+            <w:noProof/>
+            <w:webHidden/>
+          </w:rPr>
+          <w:t>9</w:t>
+        </w:r>
+        <w:r>
+          <w:rPr>
+            <w:noProof/>
+            <w:webHidden/>
+          </w:rPr>
+          <w:fldChar w:fldCharType="end"/>
+        </w:r>
+      </w:hyperlink>
+    </w:p>
+    <w:p>
+      <w:pPr>
+        <w:pStyle w:val="TOC2"/>
+        <w:tabs>
+          <w:tab w:val="right" w:leader="dot" w:pos="9595"/>
+        </w:tabs>
+        <w:rPr>
+          <w:noProof/>
+        </w:rPr>
+      </w:pPr>
+      <w:hyperlink w:anchor="_Toc226493520" w:history="1">
+        <w:r>
+          <w:rPr>
+            <w:rStyle w:val="Hyperlink"/>
+            <w:noProof/>
+          </w:rPr>
+          <w:t>8.1 Reset Password</w:t>
+        </w:r>
+        <w:r>
+          <w:rPr>
+            <w:noProof/>
+            <w:webHidden/>
+          </w:rPr>
+          <w:tab/>
+        </w:r>
+        <w:r>
+          <w:rPr>
+            <w:noProof/>
+            <w:webHidden/>
+          </w:rPr>
+          <w:fldChar w:fldCharType="begin"/>
+        </w:r>
+        <w:r>
+          <w:rPr>
+            <w:noProof/>
+            <w:webHidden/>
+          </w:rPr>
+          <w:instrText xml:space="preserve"> PAGEREF _Toc226493520 \h </w:instrText>
+        </w:r>
+        <w:r>
+          <w:rPr>
+            <w:noProof/>
+            <w:webHidden/>
+          </w:rPr>
+        </w:r>
+        <w:r>
+          <w:rPr>
+            <w:noProof/>
+            <w:webHidden/>
+          </w:rPr>
+          <w:fldChar w:fldCharType="separate"/>
+        </w:r>
+        <w:r>
+          <w:rPr>
+            <w:noProof/>
+            <w:webHidden/>
+          </w:rPr>
+          <w:t>9</w:t>
+        </w:r>
+        <w:r>
+          <w:rPr>
+            <w:noProof/>
+            <w:webHidden/>
+          </w:rPr>
+          <w:fldChar w:fldCharType="end"/>
+        </w:r>
+      </w:hyperlink>
+    </w:p>
+    <w:p>
+      <w:pPr>
+        <w:pStyle w:val="TOC2"/>
+        <w:tabs>
+          <w:tab w:val="right" w:leader="dot" w:pos="9595"/>
+        </w:tabs>
+        <w:rPr>
+          <w:noProof/>
+        </w:rPr>
+      </w:pPr>
+      <w:hyperlink w:anchor="_Toc226493521" w:history="1">
+        <w:r>
+          <w:rPr>
+            <w:rStyle w:val="Hyperlink"/>
+            <w:noProof/>
+          </w:rPr>
+          <w:t>8.2 Update Role</w:t>
+        </w:r>
+        <w:r>
+          <w:rPr>
+            <w:noProof/>
+            <w:webHidden/>
+          </w:rPr>
+          <w:tab/>
+        </w:r>
+        <w:r>
+          <w:rPr>
+            <w:noProof/>
+            <w:webHidden/>
+          </w:rPr>
+          <w:fldChar w:fldCharType="begin"/>
+        </w:r>
+        <w:r>
+          <w:rPr>
+            <w:noProof/>
+            <w:webHidden/>
+          </w:rPr>
+          <w:instrText xml:space="preserve"> PAGEREF _Toc226493521 \h </w:instrText>
+        </w:r>
+        <w:r>
+          <w:rPr>
+            <w:noProof/>
+            <w:webHidden/>
+          </w:rPr>
+        </w:r>
+        <w:r>
+          <w:rPr>
+            <w:noProof/>
+            <w:webHidden/>
+          </w:rPr>
+          <w:fldChar w:fldCharType="separate"/>
+        </w:r>
+        <w:r>
+          <w:rPr>
+            <w:noProof/>
+            <w:webHidden/>
+          </w:rPr>
+          <w:t>9</w:t>
+        </w:r>
+        <w:r>
+          <w:rPr>
+            <w:noProof/>
+            <w:webHidden/>
+          </w:rPr>
+          <w:fldChar w:fldCharType="end"/>
+        </w:r>
+      </w:hyperlink>
+    </w:p>
+    <w:p>
+      <w:pPr>
+        <w:pStyle w:val="TOC2"/>
+        <w:tabs>
+          <w:tab w:val="right" w:leader="dot" w:pos="9595"/>
+        </w:tabs>
+        <w:rPr>
+          <w:noProof/>
+        </w:rPr>
+      </w:pPr>
+      <w:hyperlink w:anchor="_Toc226493522" w:history="1">
+        <w:r>
+          <w:rPr>
+            <w:rStyle w:val="Hyperlink"/>
+            <w:noProof/>
+          </w:rPr>
+          <w:t>8.3 Update User Details</w:t>
+        </w:r>
+        <w:r>
+          <w:rPr>
+            <w:noProof/>
+            <w:webHidden/>
+          </w:rPr>
+          <w:tab/>
+        </w:r>
+        <w:r>
+          <w:rPr>
+            <w:noProof/>
+            <w:webHidden/>
+          </w:rPr>
+          <w:fldChar w:fldCharType="begin"/>
+        </w:r>
+        <w:r>
+          <w:rPr>
+            <w:noProof/>
+            <w:webHidden/>
+          </w:rPr>
+          <w:instrText xml:space="preserve"> PAGEREF _Toc226493522 \h </w:instrText>
+        </w:r>
+        <w:r>
+          <w:rPr>
+            <w:noProof/>
+            <w:webHidden/>
+          </w:rPr>
+        </w:r>
+        <w:r>
+          <w:rPr>
+            <w:noProof/>
+            <w:webHidden/>
+          </w:rPr>
+          <w:fldChar w:fldCharType="separate"/>
+        </w:r>
+        <w:r>
+          <w:rPr>
+            <w:noProof/>
+            <w:webHidden/>
+          </w:rPr>
+          <w:t>10</w:t>
+        </w:r>
+        <w:r>
+          <w:rPr>
+            <w:noProof/>
+            <w:webHidden/>
+          </w:rPr>
+          <w:fldChar w:fldCharType="end"/>
+        </w:r>
+      </w:hyperlink>
+    </w:p>
+    <w:p>
+      <w:pPr>
+        <w:pStyle w:val="TOC2"/>
+        <w:tabs>
+          <w:tab w:val="right" w:leader="dot" w:pos="9595"/>
+        </w:tabs>
+        <w:rPr>
+          <w:noProof/>
+        </w:rPr>
+      </w:pPr>
+      <w:hyperlink w:anchor="_Toc226493523" w:history="1">
+        <w:r>
+          <w:rPr>
+            <w:rStyle w:val="Hyperlink"/>
+            <w:noProof/>
+          </w:rPr>
+          <w:t>8.4 Delete User</w:t>
+        </w:r>
+        <w:r>
+          <w:rPr>
+            <w:noProof/>
+            <w:webHidden/>
+          </w:rPr>
+          <w:tab/>
+        </w:r>
+        <w:r>
+          <w:rPr>
+            <w:noProof/>
+            <w:webHidden/>
+          </w:rPr>
+          <w:fldChar w:fldCharType="begin"/>
+        </w:r>
+        <w:r>
+          <w:rPr>
+            <w:noProof/>
+            <w:webHidden/>
+          </w:rPr>
+          <w:instrText xml:space="preserve"> PAGEREF _Toc226493523 \h </w:instrText>
+        </w:r>
+        <w:r>
+          <w:rPr>
+            <w:noProof/>
+            <w:webHidden/>
+          </w:rPr>
+        </w:r>
+        <w:r>
+          <w:rPr>
+            <w:noProof/>
+            <w:webHidden/>
+          </w:rPr>
+          <w:fldChar w:fldCharType="separate"/>
+        </w:r>
+        <w:r>
+          <w:rPr>
+            <w:noProof/>
+            <w:webHidden/>
+          </w:rPr>
+          <w:t>10</w:t>
+        </w:r>
+        <w:r>
+          <w:rPr>
+            <w:noProof/>
+            <w:webHidden/>
+          </w:rPr>
+          <w:fldChar w:fldCharType="end"/>
+        </w:r>
+      </w:hyperlink>
+    </w:p>
+    <w:p>
+      <w:pPr>
+        <w:pStyle w:val="TOC1"/>
+        <w:tabs>
+          <w:tab w:val="right" w:leader="dot" w:pos="9595"/>
+        </w:tabs>
+        <w:rPr>
+          <w:noProof/>
+        </w:rPr>
+      </w:pPr>
+      <w:hyperlink w:anchor="_Toc226493524" w:history="1">
+        <w:r>
+          <w:rPr>
+            <w:rStyle w:val="Hyperlink"/>
+            <w:noProof/>
+          </w:rPr>
+          <w:t>9. Sync Performance</w:t>
+        </w:r>
+        <w:r>
+          <w:rPr>
+            <w:noProof/>
+            <w:webHidden/>
+          </w:rPr>
+          <w:tab/>
+        </w:r>
+        <w:r>
+          <w:rPr>
+            <w:noProof/>
+            <w:webHidden/>
+          </w:rPr>
+          <w:fldChar w:fldCharType="begin"/>
+        </w:r>
+        <w:r>
+          <w:rPr>
+            <w:noProof/>
+            <w:webHidden/>
+          </w:rPr>
+          <w:instrText xml:space="preserve"> PAGEREF _Toc226493524 \h </w:instrText>
+        </w:r>
+        <w:r>
+          <w:rPr>
+            <w:noProof/>
+            <w:webHidden/>
+          </w:rPr>
+        </w:r>
+        <w:r>
+          <w:rPr>
+            <w:noProof/>
+            <w:webHidden/>
+          </w:rPr>
+          <w:fldChar w:fldCharType="separate"/>
+        </w:r>
+        <w:r>
+          <w:rPr>
+            <w:noProof/>
+            <w:webHidden/>
+          </w:rPr>
+          <w:t>11</w:t>
+        </w:r>
+        <w:r>
+          <w:rPr>
+            <w:noProof/>
+            <w:webHidden/>
+          </w:rPr>
+          <w:fldChar w:fldCharType="end"/>
+        </w:r>
+      </w:hyperlink>
+    </w:p>
+    <w:p>
+      <w:pPr>
+        <w:pStyle w:val="TOC2"/>
+        <w:tabs>
+          <w:tab w:val="right" w:leader="dot" w:pos="9595"/>
+        </w:tabs>
+        <w:rPr>
+          <w:noProof/>
+        </w:rPr>
+      </w:pPr>
+      <w:hyperlink w:anchor="_Toc226493525" w:history="1">
+        <w:r>
+          <w:rPr>
+            <w:rStyle w:val="Hyperlink"/>
+            <w:noProof/>
+          </w:rPr>
+          <w:t>9.1 What this section is for</w:t>
+        </w:r>
+        <w:r>
+          <w:rPr>
+            <w:noProof/>
+            <w:webHidden/>
+          </w:rPr>
+          <w:tab/>
+        </w:r>
+        <w:r>
+          <w:rPr>
+            <w:noProof/>
+            <w:webHidden/>
+          </w:rPr>
+          <w:fldChar w:fldCharType="begin"/>
+        </w:r>
+        <w:r>
+          <w:rPr>
+            <w:noProof/>
+            <w:webHidden/>
+          </w:rPr>
+          <w:instrText xml:space="preserve"> PAGEREF _Toc226493525 \h </w:instrText>
+        </w:r>
+        <w:r>
+          <w:rPr>
+            <w:noProof/>
+            <w:webHidden/>
+          </w:rPr>
+        </w:r>
+        <w:r>
+          <w:rPr>
+            <w:noProof/>
+            <w:webHidden/>
+          </w:rPr>
+          <w:fldChar w:fldCharType="separate"/>
+        </w:r>
+        <w:r>
+          <w:rPr>
+            <w:noProof/>
+            <w:webHidden/>
+          </w:rPr>
+          <w:t>11</w:t>
+        </w:r>
+        <w:r>
+          <w:rPr>
+            <w:noProof/>
+            <w:webHidden/>
+          </w:rPr>
+          <w:fldChar w:fldCharType="end"/>
+        </w:r>
+      </w:hyperlink>
+    </w:p>
+    <w:p>
+      <w:pPr>
+        <w:pStyle w:val="TOC2"/>
+        <w:tabs>
+          <w:tab w:val="right" w:leader="dot" w:pos="9595"/>
+        </w:tabs>
+        <w:rPr>
+          <w:noProof/>
+        </w:rPr>
+      </w:pPr>
+      <w:hyperlink w:anchor="_Toc226493526" w:history="1">
+        <w:r>
+          <w:rPr>
+            <w:rStyle w:val="Hyperlink"/>
+            <w:noProof/>
+          </w:rPr>
+          <w:t>9.2 What to review</w:t>
+        </w:r>
+        <w:r>
+          <w:rPr>
+            <w:noProof/>
+            <w:webHidden/>
+          </w:rPr>
+          <w:tab/>
+        </w:r>
+        <w:r>
+          <w:rPr>
+            <w:noProof/>
+            <w:webHidden/>
+          </w:rPr>
+          <w:fldChar w:fldCharType="begin"/>
+        </w:r>
+        <w:r>
+          <w:rPr>
+            <w:noProof/>
+            <w:webHidden/>
+          </w:rPr>
+          <w:instrText xml:space="preserve"> PAGEREF _Toc226493526 \h </w:instrText>
+        </w:r>
+        <w:r>
+          <w:rPr>
+            <w:noProof/>
+            <w:webHidden/>
+          </w:rPr>
+        </w:r>
+        <w:r>
+          <w:rPr>
+            <w:noProof/>
+            <w:webHidden/>
+          </w:rPr>
+          <w:fldChar w:fldCharType="separate"/>
+        </w:r>
+        <w:r>
+          <w:rPr>
+            <w:noProof/>
+            <w:webHidden/>
+          </w:rPr>
+          <w:t>11</w:t>
+        </w:r>
+        <w:r>
+          <w:rPr>
+            <w:noProof/>
+            <w:webHidden/>
+          </w:rPr>
+          <w:fldChar w:fldCharType="end"/>
+        </w:r>
+      </w:hyperlink>
+    </w:p>
+    <w:p>
+      <w:pPr>
+        <w:pStyle w:val="TOC2"/>
+        <w:tabs>
+          <w:tab w:val="right" w:leader="dot" w:pos="9595"/>
+        </w:tabs>
+        <w:rPr>
+          <w:noProof/>
+        </w:rPr>
+      </w:pPr>
+      <w:hyperlink w:anchor="_Toc226493527" w:history="1">
+        <w:r>
+          <w:rPr>
+            <w:rStyle w:val="Hyperlink"/>
+            <w:noProof/>
+          </w:rPr>
+          <w:t>9.3 How to interpret it</w:t>
+        </w:r>
+        <w:r>
+          <w:rPr>
+            <w:noProof/>
+            <w:webHidden/>
+          </w:rPr>
+          <w:tab/>
+        </w:r>
+        <w:r>
+          <w:rPr>
+            <w:noProof/>
+            <w:webHidden/>
+          </w:rPr>
+          <w:fldChar w:fldCharType="begin"/>
+        </w:r>
+        <w:r>
+          <w:rPr>
+            <w:noProof/>
+            <w:webHidden/>
+          </w:rPr>
+          <w:instrText xml:space="preserve"> PAGEREF _Toc226493527 \h </w:instrText>
+        </w:r>
+        <w:r>
+          <w:rPr>
+            <w:noProof/>
+            <w:webHidden/>
+          </w:rPr>
+        </w:r>
+        <w:r>
+          <w:rPr>
+            <w:noProof/>
+            <w:webHidden/>
+          </w:rPr>
+          <w:fldChar w:fldCharType="separate"/>
+        </w:r>
+        <w:r>
+          <w:rPr>
+            <w:noProof/>
+            <w:webHidden/>
+          </w:rPr>
+          <w:t>11</w:t>
+        </w:r>
+        <w:r>
+          <w:rPr>
+            <w:noProof/>
+            <w:webHidden/>
+          </w:rPr>
+          <w:fldChar w:fldCharType="end"/>
+        </w:r>
+      </w:hyperlink>
+    </w:p>
+    <w:p>
+      <w:pPr>
+        <w:pStyle w:val="TOC1"/>
+        <w:tabs>
+          <w:tab w:val="right" w:leader="dot" w:pos="9595"/>
+        </w:tabs>
+        <w:rPr>
+          <w:noProof/>
+        </w:rPr>
+      </w:pPr>
+      <w:hyperlink w:anchor="_Toc226493528" w:history="1">
+        <w:r>
+          <w:rPr>
+            <w:rStyle w:val="Hyperlink"/>
+            <w:noProof/>
+          </w:rPr>
+          <w:t>10. Beacon API Sync</w:t>
+        </w:r>
+        <w:r>
+          <w:rPr>
+            <w:noProof/>
+            <w:webHidden/>
+          </w:rPr>
+          <w:tab/>
+        </w:r>
+        <w:r>
+          <w:rPr>
+            <w:noProof/>
+            <w:webHidden/>
+          </w:rPr>
+          <w:fldChar w:fldCharType="begin"/>
+        </w:r>
+        <w:r>
+          <w:rPr>
+            <w:noProof/>
+            <w:webHidden/>
+          </w:rPr>
+          <w:instrText xml:space="preserve"> PAGEREF _Toc226493528 \h </w:instrText>
+        </w:r>
+        <w:r>
+          <w:rPr>
+            <w:noProof/>
+            <w:webHidden/>
+          </w:rPr>
+        </w:r>
+        <w:r>
+          <w:rPr>
+            <w:noProof/>
+            <w:webHidden/>
+          </w:rPr>
+          <w:fldChar w:fldCharType="separate"/>
+        </w:r>
+        <w:r>
+          <w:rPr>
+            <w:noProof/>
+            <w:webHidden/>
+          </w:rPr>
+          <w:t>12</w:t>
+        </w:r>
+        <w:r>
+          <w:rPr>
+            <w:noProof/>
+            <w:webHidden/>
+          </w:rPr>
+          <w:fldChar w:fldCharType="end"/>
+        </w:r>
+      </w:hyperlink>
+    </w:p>
+    <w:p>
+      <w:pPr>
+        <w:pStyle w:val="TOC2"/>
+        <w:tabs>
+          <w:tab w:val="right" w:leader="dot" w:pos="9595"/>
+        </w:tabs>
+        <w:rPr>
+          <w:noProof/>
+        </w:rPr>
+      </w:pPr>
+      <w:hyperlink w:anchor="_Toc226493529" w:history="1">
+        <w:r>
+          <w:rPr>
+            <w:rStyle w:val="Hyperlink"/>
+            <w:noProof/>
+          </w:rPr>
+          <w:t>10.1 Smoke test</w:t>
+        </w:r>
+        <w:r>
+          <w:rPr>
+            <w:noProof/>
+            <w:webHidden/>
+          </w:rPr>
+          <w:tab/>
+        </w:r>
+        <w:r>
+          <w:rPr>
+            <w:noProof/>
+            <w:webHidden/>
+          </w:rPr>
+          <w:fldChar w:fldCharType="begin"/>
+        </w:r>
+        <w:r>
+          <w:rPr>
+            <w:noProof/>
+            <w:webHidden/>
+          </w:rPr>
+          <w:instrText xml:space="preserve"> PAGEREF _Toc226493529 \h </w:instrText>
+        </w:r>
+        <w:r>
+          <w:rPr>
+            <w:noProof/>
+            <w:webHidden/>
+          </w:rPr>
+        </w:r>
+        <w:r>
+          <w:rPr>
+            <w:noProof/>
+            <w:webHidden/>
+          </w:rPr>
+          <w:fldChar w:fldCharType="separate"/>
+        </w:r>
+        <w:r>
+          <w:rPr>
+            <w:noProof/>
+            <w:webHidden/>
+          </w:rPr>
+          <w:t>12</w:t>
+        </w:r>
+        <w:r>
+          <w:rPr>
+            <w:noProof/>
+            <w:webHidden/>
+          </w:rPr>
+          <w:fldChar w:fldCharType="end"/>
+        </w:r>
+      </w:hyperlink>
+    </w:p>
+    <w:p>
+      <w:pPr>
+        <w:pStyle w:val="TOC2"/>
+        <w:tabs>
+          <w:tab w:val="right" w:leader="dot" w:pos="9595"/>
+        </w:tabs>
+        <w:rPr>
+          <w:noProof/>
+        </w:rPr>
+      </w:pPr>
+      <w:hyperlink w:anchor="_Toc226493530" w:history="1">
+        <w:r>
+          <w:rPr>
+            <w:rStyle w:val="Hyperlink"/>
+            <w:noProof/>
+          </w:rPr>
+          <w:t>10.2 Manual sync</w:t>
+        </w:r>
+        <w:r>
+          <w:rPr>
+            <w:noProof/>
+            <w:webHidden/>
+          </w:rPr>
+          <w:tab/>
+        </w:r>
+        <w:r>
+          <w:rPr>
+            <w:noProof/>
+            <w:webHidden/>
+          </w:rPr>
+          <w:fldChar w:fldCharType="begin"/>
+        </w:r>
+        <w:r>
+          <w:rPr>
+            <w:noProof/>
+            <w:webHidden/>
+          </w:rPr>
+          <w:instrText xml:space="preserve"> PAGEREF _Toc226493530 \h </w:instrText>
+        </w:r>
+        <w:r>
+          <w:rPr>
+            <w:noProof/>
+            <w:webHidden/>
+          </w:rPr>
+        </w:r>
+        <w:r>
+          <w:rPr>
+            <w:noProof/>
+            <w:webHidden/>
+          </w:rPr>
+          <w:fldChar w:fldCharType="separate"/>
+        </w:r>
+        <w:r>
+          <w:rPr>
+            <w:noProof/>
+            <w:webHidden/>
+          </w:rPr>
+          <w:t>12</w:t>
+        </w:r>
+        <w:r>
+          <w:rPr>
+            <w:noProof/>
+            <w:webHidden/>
+          </w:rPr>
+          <w:fldChar w:fldCharType="end"/>
+        </w:r>
+      </w:hyperlink>
+    </w:p>
+    <w:p>
+      <w:pPr>
+        <w:pStyle w:val="TOC2"/>
+        <w:tabs>
+          <w:tab w:val="right" w:leader="dot" w:pos="9595"/>
+        </w:tabs>
+        <w:rPr>
+          <w:noProof/>
+        </w:rPr>
+      </w:pPr>
+      <w:hyperlink w:anchor="_Toc226493531" w:history="1">
+        <w:r>
+          <w:rPr>
+            <w:rStyle w:val="Hyperlink"/>
+            <w:noProof/>
+          </w:rPr>
+          <w:t>10.3 Stop or clear a stuck sync</w:t>
+        </w:r>
+        <w:r>
+          <w:rPr>
+            <w:noProof/>
+            <w:webHidden/>
+          </w:rPr>
+          <w:tab/>
+        </w:r>
+        <w:r>
+          <w:rPr>
+            <w:noProof/>
+            <w:webHidden/>
+          </w:rPr>
+          <w:fldChar w:fldCharType="begin"/>
+        </w:r>
+        <w:r>
+          <w:rPr>
+            <w:noProof/>
+            <w:webHidden/>
+          </w:rPr>
+          <w:instrText xml:space="preserve"> PAGEREF _Toc226493531 \h </w:instrText>
+        </w:r>
+        <w:r>
+          <w:rPr>
+            <w:noProof/>
+            <w:webHidden/>
+          </w:rPr>
+        </w:r>
+        <w:r>
+          <w:rPr>
+            <w:noProof/>
+            <w:webHidden/>
+          </w:rPr>
+          <w:fldChar w:fldCharType="separate"/>
+        </w:r>
+        <w:r>
+          <w:rPr>
+            <w:noProof/>
+            <w:webHidden/>
+          </w:rPr>
+          <w:t>13</w:t>
+        </w:r>
+        <w:r>
+          <w:rPr>
+            <w:noProof/>
+            <w:webHidden/>
+          </w:rPr>
+          <w:fldChar w:fldCharType="end"/>
+        </w:r>
+      </w:hyperlink>
+    </w:p>
+    <w:p>
+      <w:pPr>
+        <w:pStyle w:val="TOC1"/>
+        <w:tabs>
+          <w:tab w:val="right" w:leader="dot" w:pos="9595"/>
+        </w:tabs>
+        <w:rPr>
+          <w:noProof/>
+        </w:rPr>
+      </w:pPr>
+      <w:hyperlink w:anchor="_Toc226493532" w:history="1">
+        <w:r>
+          <w:rPr>
+            <w:rStyle w:val="Hyperlink"/>
+            <w:noProof/>
+          </w:rPr>
+          <w:t>11. Beacon CSV Upload</w:t>
+        </w:r>
+        <w:r>
+          <w:rPr>
+            <w:noProof/>
+            <w:webHidden/>
+          </w:rPr>
+          <w:tab/>
+        </w:r>
+        <w:r>
+          <w:rPr>
+            <w:noProof/>
+            <w:webHidden/>
+          </w:rPr>
+          <w:fldChar w:fldCharType="begin"/>
+        </w:r>
+        <w:r>
+          <w:rPr>
+            <w:noProof/>
+            <w:webHidden/>
+          </w:rPr>
+          <w:instrText xml:space="preserve"> PAGEREF _Toc226493532 \h </w:instrText>
+        </w:r>
+        <w:r>
+          <w:rPr>
+            <w:noProof/>
+            <w:webHidden/>
+          </w:rPr>
+        </w:r>
+        <w:r>
+          <w:rPr>
+            <w:noProof/>
+            <w:webHidden/>
+          </w:rPr>
+          <w:fldChar w:fldCharType="separate"/>
+        </w:r>
+        <w:r>
+          <w:rPr>
+            <w:noProof/>
+            <w:webHidden/>
+          </w:rPr>
+          <w:t>13</w:t>
+        </w:r>
+        <w:r>
+          <w:rPr>
+            <w:noProof/>
+            <w:webHidden/>
+          </w:rPr>
+          <w:fldChar w:fldCharType="end"/>
+        </w:r>
+      </w:hyperlink>
+    </w:p>
+    <w:p>
+      <w:pPr>
+        <w:pStyle w:val="TOC1"/>
+        <w:tabs>
+          <w:tab w:val="right" w:leader="dot" w:pos="9595"/>
+        </w:tabs>
+        <w:rPr>
+          <w:noProof/>
+        </w:rPr>
+      </w:pPr>
+      <w:hyperlink w:anchor="_Toc226493533" w:history="1">
+        <w:r>
+          <w:rPr>
+            <w:rStyle w:val="Hyperlink"/>
+            <w:noProof/>
+          </w:rPr>
+          <w:t>12. Data reset and rebuild actions</w:t>
+        </w:r>
+        <w:r>
+          <w:rPr>
+            <w:noProof/>
+            <w:webHidden/>
+          </w:rPr>
+          <w:tab/>
+        </w:r>
+        <w:r>
+          <w:rPr>
+            <w:noProof/>
+            <w:webHidden/>
+          </w:rPr>
+          <w:fldChar w:fldCharType="begin"/>
+        </w:r>
+        <w:r>
+          <w:rPr>
+            <w:noProof/>
+            <w:webHidden/>
+          </w:rPr>
+          <w:instrText xml:space="preserve"> PAGEREF _Toc226493533 \h </w:instrText>
+        </w:r>
+        <w:r>
+          <w:rPr>
+            <w:noProof/>
+            <w:webHidden/>
+          </w:rPr>
+        </w:r>
+        <w:r>
+          <w:rPr>
+            <w:noProof/>
+            <w:webHidden/>
+          </w:rPr>
+          <w:fldChar w:fldCharType="separate"/>
+        </w:r>
+        <w:r>
+          <w:rPr>
+            <w:noProof/>
+            <w:webHidden/>
+          </w:rPr>
+          <w:t>13</w:t>
+        </w:r>
+        <w:r>
+          <w:rPr>
+            <w:noProof/>
+            <w:webHidden/>
+          </w:rPr>
+          <w:fldChar w:fldCharType="end"/>
+        </w:r>
+      </w:hyperlink>
+    </w:p>
+    <w:p>
+      <w:pPr>
+        <w:pStyle w:val="TOC1"/>
+        <w:tabs>
+          <w:tab w:val="right" w:leader="dot" w:pos="9595"/>
+        </w:tabs>
+        <w:rPr>
+          <w:noProof/>
+        </w:rPr>
+      </w:pPr>
+      <w:hyperlink w:anchor="_Toc226493534" w:history="1">
+        <w:r>
+          <w:rPr>
+            <w:rStyle w:val="Hyperlink"/>
+            <w:noProof/>
+          </w:rPr>
+          <w:t>13. Audit Logs</w:t>
+        </w:r>
+        <w:r>
+          <w:rPr>
+            <w:noProof/>
+            <w:webHidden/>
+          </w:rPr>
+          <w:tab/>
+        </w:r>
+        <w:r>
+          <w:rPr>
+            <w:noProof/>
+            <w:webHidden/>
+          </w:rPr>
+          <w:fldChar w:fldCharType="begin"/>
+        </w:r>
+        <w:r>
+          <w:rPr>
+            <w:noProof/>
+            <w:webHidden/>
+          </w:rPr>
+          <w:instrText xml:space="preserve"> PAGEREF _Toc226493534 \h </w:instrText>
+        </w:r>
+        <w:r>
+          <w:rPr>
+            <w:noProof/>
+            <w:webHidden/>
+          </w:rPr>
+        </w:r>
+        <w:r>
+          <w:rPr>
+            <w:noProof/>
+            <w:webHidden/>
+          </w:rPr>
+          <w:fldChar w:fldCharType="separate"/>
+        </w:r>
+        <w:r>
+          <w:rPr>
+            <w:noProof/>
+            <w:webHidden/>
+          </w:rPr>
+          <w:t>14</w:t>
+        </w:r>
+        <w:r>
+          <w:rPr>
+            <w:noProof/>
+            <w:webHidden/>
+          </w:rPr>
+          <w:fldChar w:fldCharType="end"/>
+        </w:r>
+      </w:hyperlink>
+    </w:p>
+    <w:p>
+      <w:pPr>
+        <w:pStyle w:val="TOC1"/>
+        <w:tabs>
+          <w:tab w:val="right" w:leader="dot" w:pos="9595"/>
+        </w:tabs>
+        <w:rPr>
+          <w:noProof/>
+        </w:rPr>
+      </w:pPr>
+      <w:hyperlink w:anchor="_Toc226493535" w:history="1">
+        <w:r>
+          <w:rPr>
+            <w:rStyle w:val="Hyperlink"/>
+            <w:noProof/>
+          </w:rPr>
+          <w:t>14. Data Request Form and Temporary Access</w:t>
+        </w:r>
+        <w:r>
+          <w:rPr>
+            <w:noProof/>
+            <w:webHidden/>
+          </w:rPr>
+          <w:tab/>
+        </w:r>
+        <w:r>
+          <w:rPr>
+            <w:noProof/>
+            <w:webHidden/>
+          </w:rPr>
+          <w:fldChar w:fldCharType="begin"/>
+        </w:r>
+        <w:r>
+          <w:rPr>
+            <w:noProof/>
+            <w:webHidden/>
+          </w:rPr>
+          <w:instrText xml:space="preserve"> PAGEREF _Toc226493535 \h </w:instrText>
+        </w:r>
+        <w:r>
+          <w:rPr>
+            <w:noProof/>
+            <w:webHidden/>
+          </w:rPr>
+        </w:r>
+        <w:r>
+          <w:rPr>
+            <w:noProof/>
+            <w:webHidden/>
+          </w:rPr>
+          <w:fldChar w:fldCharType="separate"/>
+        </w:r>
+        <w:r>
+          <w:rPr>
+            <w:noProof/>
+            <w:webHidden/>
+          </w:rPr>
+          <w:t>14</w:t>
+        </w:r>
+        <w:r>
+          <w:rPr>
+            <w:noProof/>
+            <w:webHidden/>
+          </w:rPr>
+          <w:fldChar w:fldCharType="end"/>
+        </w:r>
+      </w:hyperlink>
+    </w:p>
+    <w:p>
+      <w:pPr>
+        <w:pStyle w:val="TOC2"/>
+        <w:tabs>
+          <w:tab w:val="right" w:leader="dot" w:pos="9595"/>
+        </w:tabs>
+        <w:rPr>
+          <w:noProof/>
+        </w:rPr>
+      </w:pPr>
+      <w:hyperlink w:anchor="_Toc226493536" w:history="1">
+        <w:r>
+          <w:rPr>
+            <w:rStyle w:val="Hyperlink"/>
+            <w:noProof/>
+          </w:rPr>
+          <w:t>14.1 Reviewing requests</w:t>
+        </w:r>
+        <w:r>
+          <w:rPr>
+            <w:noProof/>
+            <w:webHidden/>
+          </w:rPr>
+          <w:tab/>
+        </w:r>
+        <w:r>
+          <w:rPr>
+            <w:noProof/>
+            <w:webHidden/>
+          </w:rPr>
+          <w:fldChar w:fldCharType="begin"/>
+        </w:r>
+        <w:r>
+          <w:rPr>
+            <w:noProof/>
+            <w:webHidden/>
+          </w:rPr>
+          <w:instrText xml:space="preserve"> PAGEREF _Toc226493536 \h </w:instrText>
+        </w:r>
+        <w:r>
+          <w:rPr>
+            <w:noProof/>
+            <w:webHidden/>
+          </w:rPr>
+        </w:r>
+        <w:r>
+          <w:rPr>
+            <w:noProof/>
+            <w:webHidden/>
+          </w:rPr>
+          <w:fldChar w:fldCharType="separate"/>
+        </w:r>
+        <w:r>
+          <w:rPr>
+            <w:noProof/>
+            <w:webHidden/>
+          </w:rPr>
+          <w:t>14</w:t>
+        </w:r>
+        <w:r>
+          <w:rPr>
+            <w:noProof/>
+            <w:webHidden/>
+          </w:rPr>
+          <w:fldChar w:fldCharType="end"/>
+        </w:r>
+      </w:hyperlink>
+    </w:p>
+    <w:p>
+      <w:pPr>
+        <w:pStyle w:val="TOC2"/>
+        <w:tabs>
+          <w:tab w:val="right" w:leader="dot" w:pos="9595"/>
+        </w:tabs>
+        <w:rPr>
+          <w:noProof/>
+        </w:rPr>
+      </w:pPr>
+      <w:hyperlink w:anchor="_Toc226493537" w:history="1">
+        <w:r>
+          <w:rPr>
+            <w:rStyle w:val="Hyperlink"/>
+            <w:noProof/>
+          </w:rPr>
+          <w:t>14.2 Granting temporary access</w:t>
+        </w:r>
+        <w:r>
+          <w:rPr>
+            <w:noProof/>
+            <w:webHidden/>
+          </w:rPr>
+          <w:tab/>
+        </w:r>
+        <w:r>
+          <w:rPr>
+            <w:noProof/>
+            <w:webHidden/>
+          </w:rPr>
+          <w:fldChar w:fldCharType="begin"/>
+        </w:r>
+        <w:r>
+          <w:rPr>
+            <w:noProof/>
+            <w:webHidden/>
+          </w:rPr>
+          <w:instrText xml:space="preserve"> PAGEREF _Toc226493537 \h </w:instrText>
+        </w:r>
+        <w:r>
+          <w:rPr>
+            <w:noProof/>
+            <w:webHidden/>
+          </w:rPr>
+        </w:r>
+        <w:r>
+          <w:rPr>
+            <w:noProof/>
+            <w:webHidden/>
+          </w:rPr>
+          <w:fldChar w:fldCharType="separate"/>
+        </w:r>
+        <w:r>
+          <w:rPr>
+            <w:noProof/>
+            <w:webHidden/>
+          </w:rPr>
+          <w:t>15</w:t>
+        </w:r>
+        <w:r>
+          <w:rPr>
+            <w:noProof/>
+            <w:webHidden/>
+          </w:rPr>
+          <w:fldChar w:fldCharType="end"/>
+        </w:r>
+      </w:hyperlink>
+    </w:p>
+    <w:p>
+      <w:pPr>
+        <w:pStyle w:val="TOC2"/>
+        <w:tabs>
+          <w:tab w:val="right" w:leader="dot" w:pos="9595"/>
+        </w:tabs>
+        <w:rPr>
+          <w:noProof/>
+        </w:rPr>
+      </w:pPr>
+      <w:hyperlink w:anchor="_Toc226493538" w:history="1">
+        <w:r>
+          <w:rPr>
+            <w:rStyle w:val="Hyperlink"/>
+            <w:noProof/>
+          </w:rPr>
+          <w:t>14.3 How temporary access behaves</w:t>
+        </w:r>
+        <w:r>
+          <w:rPr>
+            <w:noProof/>
+            <w:webHidden/>
+          </w:rPr>
+          <w:tab/>
+        </w:r>
+        <w:r>
+          <w:rPr>
+            <w:noProof/>
+            <w:webHidden/>
+          </w:rPr>
+          <w:fldChar w:fldCharType="begin"/>
+        </w:r>
+        <w:r>
+          <w:rPr>
+            <w:noProof/>
+            <w:webHidden/>
+          </w:rPr>
+          <w:instrText xml:space="preserve"> PAGEREF _Toc226493538 \h </w:instrText>
+        </w:r>
+        <w:r>
+          <w:rPr>
+            <w:noProof/>
+            <w:webHidden/>
+          </w:rPr>
+        </w:r>
+        <w:r>
+          <w:rPr>
+            <w:noProof/>
+            <w:webHidden/>
+          </w:rPr>
+          <w:fldChar w:fldCharType="separate"/>
+        </w:r>
+        <w:r>
+          <w:rPr>
+            <w:noProof/>
+            <w:webHidden/>
+          </w:rPr>
+          <w:t>15</w:t>
+        </w:r>
+        <w:r>
+          <w:rPr>
+            <w:noProof/>
+            <w:webHidden/>
+          </w:rPr>
+          <w:fldChar w:fldCharType="end"/>
+        </w:r>
+      </w:hyperlink>
+    </w:p>
+    <w:p>
+      <w:pPr>
+        <w:pStyle w:val="TOC1"/>
+        <w:tabs>
+          <w:tab w:val="right" w:leader="dot" w:pos="9595"/>
+        </w:tabs>
+        <w:rPr>
+          <w:noProof/>
+        </w:rPr>
+      </w:pPr>
+      <w:hyperlink w:anchor="_Toc226493539" w:history="1">
+        <w:r>
+          <w:rPr>
+            <w:rStyle w:val="Hyperlink"/>
+            <w:noProof/>
+          </w:rPr>
+          <w:t>15. Using the other dashboards as an Admin</w:t>
+        </w:r>
+        <w:r>
+          <w:rPr>
+            <w:noProof/>
+            <w:webHidden/>
+          </w:rPr>
+          <w:tab/>
+        </w:r>
+        <w:r>
+          <w:rPr>
+            <w:noProof/>
+            <w:webHidden/>
+          </w:rPr>
+          <w:fldChar w:fldCharType="begin"/>
+        </w:r>
+        <w:r>
+          <w:rPr>
+            <w:noProof/>
+            <w:webHidden/>
+          </w:rPr>
+          <w:instrText xml:space="preserve"> PAGEREF _Toc226493539 \h </w:instrText>
+        </w:r>
+        <w:r>
+          <w:rPr>
+            <w:noProof/>
+            <w:webHidden/>
+          </w:rPr>
+        </w:r>
+        <w:r>
+          <w:rPr>
+            <w:noProof/>
+            <w:webHidden/>
+          </w:rPr>
+          <w:fldChar w:fldCharType="separate"/>
+        </w:r>
+        <w:r>
+          <w:rPr>
+            <w:noProof/>
+            <w:webHidden/>
+          </w:rPr>
+          <w:t>16</w:t>
+        </w:r>
+        <w:r>
+          <w:rPr>
+            <w:noProof/>
+            <w:webHidden/>
+          </w:rPr>
+          <w:fldChar w:fldCharType="end"/>
+        </w:r>
+      </w:hyperlink>
+    </w:p>
+    <w:p>
+      <w:pPr>
+        <w:pStyle w:val="TOC2"/>
+        <w:tabs>
+          <w:tab w:val="right" w:leader="dot" w:pos="9595"/>
+        </w:tabs>
+        <w:rPr>
+          <w:noProof/>
+        </w:rPr>
+      </w:pPr>
+      <w:hyperlink w:anchor="_Toc226493540" w:history="1">
+        <w:r>
+          <w:rPr>
+            <w:rStyle w:val="Hyperlink"/>
+            <w:noProof/>
+          </w:rPr>
+          <w:t>14.1 KPI Dashboard</w:t>
+        </w:r>
+        <w:r>
+          <w:rPr>
+            <w:noProof/>
+            <w:webHidden/>
+          </w:rPr>
+          <w:tab/>
+        </w:r>
+        <w:r>
+          <w:rPr>
+            <w:noProof/>
+            <w:webHidden/>
+          </w:rPr>
+          <w:fldChar w:fldCharType="begin"/>
+        </w:r>
+        <w:r>
+          <w:rPr>
+            <w:noProof/>
+            <w:webHidden/>
+          </w:rPr>
+          <w:instrText xml:space="preserve"> PAGEREF _Toc226493540 \h </w:instrText>
+        </w:r>
+        <w:r>
+          <w:rPr>
+            <w:noProof/>
+            <w:webHidden/>
+          </w:rPr>
+        </w:r>
+        <w:r>
+          <w:rPr>
+            <w:noProof/>
+            <w:webHidden/>
+          </w:rPr>
+          <w:fldChar w:fldCharType="separate"/>
+        </w:r>
+        <w:r>
+          <w:rPr>
+            <w:noProof/>
+            <w:webHidden/>
+          </w:rPr>
+          <w:t>16</w:t>
+        </w:r>
+        <w:r>
+          <w:rPr>
+            <w:noProof/>
+            <w:webHidden/>
+          </w:rPr>
+          <w:fldChar w:fldCharType="end"/>
+        </w:r>
+      </w:hyperlink>
+    </w:p>
+    <w:p>
+      <w:pPr>
+        <w:pStyle w:val="TOC2"/>
+        <w:tabs>
+          <w:tab w:val="right" w:leader="dot" w:pos="9595"/>
+        </w:tabs>
+        <w:rPr>
+          <w:noProof/>
+        </w:rPr>
+      </w:pPr>
+      <w:hyperlink w:anchor="_Toc226493541" w:history="1">
+        <w:r>
+          <w:rPr>
+            <w:rStyle w:val="Hyperlink"/>
+            <w:noProof/>
+          </w:rPr>
+          <w:t>14.2 Custom Reports Dashboard</w:t>
+        </w:r>
+        <w:r>
+          <w:rPr>
+            <w:noProof/>
+            <w:webHidden/>
+          </w:rPr>
+          <w:tab/>
+        </w:r>
+        <w:r>
+          <w:rPr>
+            <w:noProof/>
+            <w:webHidden/>
+          </w:rPr>
+          <w:fldChar w:fldCharType="begin"/>
+        </w:r>
+        <w:r>
+          <w:rPr>
+            <w:noProof/>
+            <w:webHidden/>
+          </w:rPr>
+          <w:instrText xml:space="preserve"> PAGEREF _Toc226493541 \h </w:instrText>
+        </w:r>
+        <w:r>
+          <w:rPr>
+            <w:noProof/>
+            <w:webHidden/>
+          </w:rPr>
+        </w:r>
+        <w:r>
+          <w:rPr>
+            <w:noProof/>
+            <w:webHidden/>
+          </w:rPr>
+          <w:fldChar w:fldCharType="separate"/>
+        </w:r>
+        <w:r>
+          <w:rPr>
+            <w:noProof/>
+            <w:webHidden/>
+          </w:rPr>
+          <w:t>16</w:t>
+        </w:r>
+        <w:r>
+          <w:rPr>
+            <w:noProof/>
+            <w:webHidden/>
+          </w:rPr>
+          <w:fldChar w:fldCharType="end"/>
+        </w:r>
+      </w:hyperlink>
+    </w:p>
+    <w:p>
+      <w:pPr>
+        <w:pStyle w:val="TOC2"/>
+        <w:tabs>
+          <w:tab w:val="right" w:leader="dot" w:pos="9595"/>
+        </w:tabs>
+        <w:rPr>
+          <w:noProof/>
+        </w:rPr>
+      </w:pPr>
+      <w:hyperlink w:anchor="_Toc226493542" w:history="1">
+        <w:r>
+          <w:rPr>
+            <w:rStyle w:val="Hyperlink"/>
+            <w:noProof/>
+          </w:rPr>
+          <w:t>14.3 ML Dashboard</w:t>
+        </w:r>
+        <w:r>
+          <w:rPr>
+            <w:noProof/>
+            <w:webHidden/>
+          </w:rPr>
+          <w:tab/>
+        </w:r>
+        <w:r>
+          <w:rPr>
+            <w:noProof/>
+            <w:webHidden/>
+          </w:rPr>
+          <w:fldChar w:fldCharType="begin"/>
+        </w:r>
+        <w:r>
+          <w:rPr>
+            <w:noProof/>
+            <w:webHidden/>
+          </w:rPr>
+          <w:instrText xml:space="preserve"> PAGEREF _Toc226493542 \h </w:instrText>
+        </w:r>
+        <w:r>
+          <w:rPr>
+            <w:noProof/>
+            <w:webHidden/>
+          </w:rPr>
+        </w:r>
+        <w:r>
+          <w:rPr>
+            <w:noProof/>
+            <w:webHidden/>
+          </w:rPr>
+          <w:fldChar w:fldCharType="separate"/>
+        </w:r>
+        <w:r>
+          <w:rPr>
+            <w:noProof/>
+            <w:webHidden/>
+          </w:rPr>
+          <w:t>16</w:t>
+        </w:r>
+        <w:r>
+          <w:rPr>
+            <w:noProof/>
+            <w:webHidden/>
+          </w:rPr>
+          <w:fldChar w:fldCharType="end"/>
+        </w:r>
+      </w:hyperlink>
+    </w:p>
+    <w:p>
+      <w:pPr>
+        <w:pStyle w:val="TOC2"/>
+        <w:tabs>
+          <w:tab w:val="right" w:leader="dot" w:pos="9595"/>
+        </w:tabs>
+        <w:rPr>
+          <w:noProof/>
+        </w:rPr>
+      </w:pPr>
+      <w:hyperlink w:anchor="_Toc226493543" w:history="1">
+        <w:r>
+          <w:rPr>
+            <w:rStyle w:val="Hyperlink"/>
+            <w:noProof/>
+          </w:rPr>
+          <w:t>14.4 Funder Dashboard</w:t>
+        </w:r>
+        <w:r>
+          <w:rPr>
+            <w:noProof/>
+            <w:webHidden/>
+          </w:rPr>
+          <w:tab/>
+        </w:r>
+        <w:r>
+          <w:rPr>
+            <w:noProof/>
+            <w:webHidden/>
+          </w:rPr>
+          <w:fldChar w:fldCharType="begin"/>
+        </w:r>
+        <w:r>
+          <w:rPr>
+            <w:noProof/>
+            <w:webHidden/>
+          </w:rPr>
+          <w:instrText xml:space="preserve"> PAGEREF _Toc226493543 \h </w:instrText>
+        </w:r>
+        <w:r>
+          <w:rPr>
+            <w:noProof/>
+            <w:webHidden/>
+          </w:rPr>
+        </w:r>
+        <w:r>
+          <w:rPr>
+            <w:noProof/>
+            <w:webHidden/>
+          </w:rPr>
+          <w:fldChar w:fldCharType="separate"/>
+        </w:r>
+        <w:r>
+          <w:rPr>
+            <w:noProof/>
+            <w:webHidden/>
+          </w:rPr>
+          <w:t>17</w:t>
+        </w:r>
+        <w:r>
+          <w:rPr>
+            <w:noProof/>
+            <w:webHidden/>
+          </w:rPr>
+          <w:fldChar w:fldCharType="end"/>
+        </w:r>
+      </w:hyperlink>
+    </w:p>
+    <w:p>
+      <w:pPr>
+        <w:pStyle w:val="TOC2"/>
+        <w:tabs>
+          <w:tab w:val="right" w:leader="dot" w:pos="9595"/>
+        </w:tabs>
+        <w:rPr>
+          <w:noProof/>
+        </w:rPr>
+      </w:pPr>
+      <w:hyperlink w:anchor="_Toc226493544" w:history="1">
+        <w:r>
+          <w:rPr>
+            <w:rStyle w:val="Hyperlink"/>
+            <w:noProof/>
+          </w:rPr>
+          <w:t>14.5 Case Studies</w:t>
+        </w:r>
+        <w:r>
+          <w:rPr>
+            <w:noProof/>
+            <w:webHidden/>
+          </w:rPr>
+          <w:tab/>
+        </w:r>
+        <w:r>
+          <w:rPr>
+            <w:noProof/>
+            <w:webHidden/>
+          </w:rPr>
+          <w:fldChar w:fldCharType="begin"/>
+        </w:r>
+        <w:r>
+          <w:rPr>
+            <w:noProof/>
+            <w:webHidden/>
+          </w:rPr>
+          <w:instrText xml:space="preserve"> PAGEREF _Toc226493544 \h </w:instrText>
+        </w:r>
+        <w:r>
+          <w:rPr>
+            <w:noProof/>
+            <w:webHidden/>
+          </w:rPr>
+        </w:r>
+        <w:r>
+          <w:rPr>
+            <w:noProof/>
+            <w:webHidden/>
+          </w:rPr>
+          <w:fldChar w:fldCharType="separate"/>
+        </w:r>
+        <w:r>
+          <w:rPr>
+            <w:noProof/>
+            <w:webHidden/>
+          </w:rPr>
+          <w:t>17</w:t>
+        </w:r>
+        <w:r>
+          <w:rPr>
+            <w:noProof/>
+            <w:webHidden/>
+          </w:rPr>
+          <w:fldChar w:fldCharType="end"/>
+        </w:r>
+      </w:hyperlink>
+    </w:p>
+    <w:p>
+      <w:pPr>
+        <w:pStyle w:val="TOC1"/>
+        <w:tabs>
+          <w:tab w:val="right" w:leader="dot" w:pos="9595"/>
+        </w:tabs>
+        <w:rPr>
+          <w:noProof/>
+        </w:rPr>
+      </w:pPr>
+      <w:hyperlink w:anchor="_Toc226493545" w:history="1">
+        <w:r>
+          <w:rPr>
+            <w:rStyle w:val="Hyperlink"/>
+            <w:noProof/>
+          </w:rPr>
+          <w:t>16. Recommended Admin working pattern</w:t>
+        </w:r>
+        <w:r>
+          <w:rPr>
+            <w:noProof/>
+            <w:webHidden/>
+          </w:rPr>
+          <w:tab/>
+        </w:r>
+        <w:r>
+          <w:rPr>
+            <w:noProof/>
+            <w:webHidden/>
+          </w:rPr>
+          <w:fldChar w:fldCharType="begin"/>
+        </w:r>
+        <w:r>
+          <w:rPr>
+            <w:noProof/>
+            <w:webHidden/>
+          </w:rPr>
+          <w:instrText xml:space="preserve"> PAGEREF _Toc226493545 \h </w:instrText>
+        </w:r>
+        <w:r>
+          <w:rPr>
+            <w:noProof/>
+            <w:webHidden/>
+          </w:rPr>
+        </w:r>
+        <w:r>
+          <w:rPr>
+            <w:noProof/>
+            <w:webHidden/>
+          </w:rPr>
+          <w:fldChar w:fldCharType="separate"/>
+        </w:r>
+        <w:r>
+          <w:rPr>
+            <w:noProof/>
+            <w:webHidden/>
+          </w:rPr>
+          <w:t>17</w:t>
+        </w:r>
+        <w:r>
+          <w:rPr>
+            <w:noProof/>
+            <w:webHidden/>
+          </w:rPr>
+          <w:fldChar w:fldCharType="end"/>
+        </w:r>
+      </w:hyperlink>
+    </w:p>
+    <w:p>
+      <w:pPr>
+        <w:pStyle w:val="TOC1"/>
+        <w:tabs>
+          <w:tab w:val="right" w:leader="dot" w:pos="9595"/>
+        </w:tabs>
+        <w:rPr>
+          <w:noProof/>
+        </w:rPr>
+      </w:pPr>
+      <w:hyperlink w:anchor="_Toc226493546" w:history="1">
+        <w:r>
+          <w:rPr>
+            <w:rStyle w:val="Hyperlink"/>
+            <w:noProof/>
+          </w:rPr>
+          <w:t>17. Troubleshooting</w:t>
+        </w:r>
+        <w:r>
+          <w:rPr>
+            <w:noProof/>
+            <w:webHidden/>
+          </w:rPr>
+          <w:tab/>
+        </w:r>
+        <w:r>
+          <w:rPr>
+            <w:noProof/>
+            <w:webHidden/>
+          </w:rPr>
+          <w:fldChar w:fldCharType="begin"/>
+        </w:r>
+        <w:r>
+          <w:rPr>
+            <w:noProof/>
+            <w:webHidden/>
+          </w:rPr>
+          <w:instrText xml:space="preserve"> PAGEREF _Toc226493546 \h </w:instrText>
+        </w:r>
+        <w:r>
+          <w:rPr>
+            <w:noProof/>
+            <w:webHidden/>
+          </w:rPr>
+        </w:r>
+        <w:r>
+          <w:rPr>
+            <w:noProof/>
+            <w:webHidden/>
+          </w:rPr>
+          <w:fldChar w:fldCharType="separate"/>
+        </w:r>
+        <w:r>
+          <w:rPr>
+            <w:noProof/>
+            <w:webHidden/>
+          </w:rPr>
+          <w:t>17</w:t>
+        </w:r>
+        <w:r>
+          <w:rPr>
+            <w:noProof/>
+            <w:webHidden/>
+          </w:rPr>
+          <w:fldChar w:fldCharType="end"/>
+        </w:r>
+      </w:hyperlink>
+    </w:p>
+    <w:p>
+      <w:pPr>
+        <w:pStyle w:val="TOC2"/>
+        <w:tabs>
+          <w:tab w:val="right" w:leader="dot" w:pos="9595"/>
+        </w:tabs>
+        <w:rPr>
+          <w:noProof/>
+        </w:rPr>
+      </w:pPr>
+      <w:hyperlink w:anchor="_Toc226493547" w:history="1">
+        <w:r>
+          <w:rPr>
+            <w:rStyle w:val="Hyperlink"/>
+            <w:noProof/>
+          </w:rPr>
+          <w:t>`Admin client not available`</w:t>
+        </w:r>
+        <w:r>
+          <w:rPr>
+            <w:noProof/>
+            <w:webHidden/>
+          </w:rPr>
+          <w:tab/>
+        </w:r>
+        <w:r>
+          <w:rPr>
+            <w:noProof/>
+            <w:webHidden/>
+          </w:rPr>
+          <w:fldChar w:fldCharType="begin"/>
+        </w:r>
+        <w:r>
+          <w:rPr>
+            <w:noProof/>
+            <w:webHidden/>
+          </w:rPr>
+          <w:instrText xml:space="preserve"> PAGEREF _Toc226493547 \h </w:instrText>
+        </w:r>
+        <w:r>
+          <w:rPr>
+            <w:noProof/>
+            <w:webHidden/>
+          </w:rPr>
+        </w:r>
+        <w:r>
+          <w:rPr>
+            <w:noProof/>
+            <w:webHidden/>
+          </w:rPr>
+          <w:fldChar w:fldCharType="separate"/>
+        </w:r>
+        <w:r>
+          <w:rPr>
+            <w:noProof/>
+            <w:webHidden/>
+          </w:rPr>
+          <w:t>17</w:t>
+        </w:r>
+        <w:r>
+          <w:rPr>
+            <w:noProof/>
+            <w:webHidden/>
+          </w:rPr>
+          <w:fldChar w:fldCharType="end"/>
+        </w:r>
+      </w:hyperlink>
+    </w:p>
+    <w:p>
+      <w:pPr>
+        <w:pStyle w:val="TOC2"/>
+        <w:tabs>
+          <w:tab w:val="right" w:leader="dot" w:pos="9595"/>
+        </w:tabs>
+        <w:rPr>
+          <w:noProof/>
+        </w:rPr>
+      </w:pPr>
+      <w:hyperlink w:anchor="_Toc226493548" w:history="1">
+        <w:r>
+          <w:rPr>
+            <w:rStyle w:val="Hyperlink"/>
+            <w:noProof/>
+          </w:rPr>
+          <w:t>A user cannot sign in</w:t>
+        </w:r>
+        <w:r>
+          <w:rPr>
+            <w:noProof/>
+            <w:webHidden/>
+          </w:rPr>
+          <w:tab/>
+        </w:r>
+        <w:r>
+          <w:rPr>
+            <w:noProof/>
+            <w:webHidden/>
+          </w:rPr>
+          <w:fldChar w:fldCharType="begin"/>
+        </w:r>
+        <w:r>
+          <w:rPr>
+            <w:noProof/>
+            <w:webHidden/>
+          </w:rPr>
+          <w:instrText xml:space="preserve"> PAGEREF _Toc226493548 \h </w:instrText>
+        </w:r>
+        <w:r>
+          <w:rPr>
+            <w:noProof/>
+            <w:webHidden/>
+          </w:rPr>
+        </w:r>
+        <w:r>
+          <w:rPr>
+            <w:noProof/>
+            <w:webHidden/>
+          </w:rPr>
+          <w:fldChar w:fldCharType="separate"/>
+        </w:r>
+        <w:r>
+          <w:rPr>
+            <w:noProof/>
+            <w:webHidden/>
+          </w:rPr>
+          <w:t>17</w:t>
+        </w:r>
+        <w:r>
+          <w:rPr>
+            <w:noProof/>
+            <w:webHidden/>
+          </w:rPr>
+          <w:fldChar w:fldCharType="end"/>
+        </w:r>
+      </w:hyperlink>
+    </w:p>
+    <w:p>
+      <w:pPr>
+        <w:pStyle w:val="TOC2"/>
+        <w:tabs>
+          <w:tab w:val="right" w:leader="dot" w:pos="9595"/>
+        </w:tabs>
+        <w:rPr>
+          <w:noProof/>
+        </w:rPr>
+      </w:pPr>
+      <w:hyperlink w:anchor="_Toc226493549" w:history="1">
+        <w:r>
+          <w:rPr>
+            <w:rStyle w:val="Hyperlink"/>
+            <w:noProof/>
+          </w:rPr>
+          <w:t>The dashboard looks out of date</w:t>
+        </w:r>
+        <w:r>
+          <w:rPr>
+            <w:noProof/>
+            <w:webHidden/>
+          </w:rPr>
+          <w:tab/>
+        </w:r>
+        <w:r>
+          <w:rPr>
+            <w:noProof/>
+            <w:webHidden/>
+          </w:rPr>
+          <w:fldChar w:fldCharType="begin"/>
+        </w:r>
+        <w:r>
+          <w:rPr>
+            <w:noProof/>
+            <w:webHidden/>
+          </w:rPr>
+          <w:instrText xml:space="preserve"> PAGEREF _Toc226493549 \h </w:instrText>
+        </w:r>
+        <w:r>
+          <w:rPr>
+            <w:noProof/>
+            <w:webHidden/>
+          </w:rPr>
+        </w:r>
+        <w:r>
+          <w:rPr>
+            <w:noProof/>
+            <w:webHidden/>
+          </w:rPr>
+          <w:fldChar w:fldCharType="separate"/>
+        </w:r>
+        <w:r>
+          <w:rPr>
+            <w:noProof/>
+            <w:webHidden/>
+          </w:rPr>
+          <w:t>18</w:t>
+        </w:r>
+        <w:r>
+          <w:rPr>
+            <w:noProof/>
+            <w:webHidden/>
+          </w:rPr>
+          <w:fldChar w:fldCharType="end"/>
+        </w:r>
+      </w:hyperlink>
+    </w:p>
+    <w:p>
+      <w:pPr>
+        <w:pStyle w:val="TOC2"/>
+        <w:tabs>
+          <w:tab w:val="right" w:leader="dot" w:pos="9595"/>
+        </w:tabs>
+        <w:rPr>
+          <w:noProof/>
+        </w:rPr>
+      </w:pPr>
+      <w:hyperlink w:anchor="_Toc226493550" w:history="1">
+        <w:r>
+          <w:rPr>
+            <w:rStyle w:val="Hyperlink"/>
+            <w:noProof/>
+          </w:rPr>
+          <w:t>A sync looks stuck</w:t>
+        </w:r>
+        <w:r>
+          <w:rPr>
+            <w:noProof/>
+            <w:webHidden/>
+          </w:rPr>
+          <w:tab/>
+        </w:r>
+        <w:r>
+          <w:rPr>
+            <w:noProof/>
+            <w:webHidden/>
+          </w:rPr>
+          <w:fldChar w:fldCharType="begin"/>
+        </w:r>
+        <w:r>
+          <w:rPr>
+            <w:noProof/>
+            <w:webHidden/>
+          </w:rPr>
+          <w:instrText xml:space="preserve"> PAGEREF _Toc226493550 \h </w:instrText>
+        </w:r>
+        <w:r>
+          <w:rPr>
+            <w:noProof/>
+            <w:webHidden/>
+          </w:rPr>
+        </w:r>
+        <w:r>
+          <w:rPr>
+            <w:noProof/>
+            <w:webHidden/>
+          </w:rPr>
+          <w:fldChar w:fldCharType="separate"/>
+        </w:r>
+        <w:r>
+          <w:rPr>
+            <w:noProof/>
+            <w:webHidden/>
+          </w:rPr>
+          <w:t>18</w:t>
+        </w:r>
+        <w:r>
+          <w:rPr>
+            <w:noProof/>
+            <w:webHidden/>
+          </w:rPr>
+          <w:fldChar w:fldCharType="end"/>
+        </w:r>
+      </w:hyperlink>
+    </w:p>
+    <w:p>
+      <w:pPr>
+        <w:pStyle w:val="TOC2"/>
+        <w:tabs>
+          <w:tab w:val="right" w:leader="dot" w:pos="9595"/>
+        </w:tabs>
+        <w:rPr>
+          <w:noProof/>
+        </w:rPr>
+      </w:pPr>
+      <w:hyperlink w:anchor="_Toc226493551" w:history="1">
+        <w:r>
+          <w:rPr>
+            <w:rStyle w:val="Hyperlink"/>
+            <w:noProof/>
+          </w:rPr>
+          <w:t>A user has the wrong access</w:t>
+        </w:r>
+        <w:r>
+          <w:rPr>
+            <w:noProof/>
+            <w:webHidden/>
+          </w:rPr>
+          <w:tab/>
+        </w:r>
+        <w:r>
+          <w:rPr>
+            <w:noProof/>
+            <w:webHidden/>
+          </w:rPr>
+          <w:fldChar w:fldCharType="begin"/>
+        </w:r>
+        <w:r>
+          <w:rPr>
+            <w:noProof/>
+            <w:webHidden/>
+          </w:rPr>
+          <w:instrText xml:space="preserve"> PAGEREF _Toc226493551 \h </w:instrText>
+        </w:r>
+        <w:r>
+          <w:rPr>
+            <w:noProof/>
+            <w:webHidden/>
+          </w:rPr>
+        </w:r>
+        <w:r>
+          <w:rPr>
+            <w:noProof/>
+            <w:webHidden/>
+          </w:rPr>
+          <w:fldChar w:fldCharType="separate"/>
+        </w:r>
+        <w:r>
+          <w:rPr>
+            <w:noProof/>
+            <w:webHidden/>
+          </w:rPr>
+          <w:t>18</w:t>
+        </w:r>
+        <w:r>
+          <w:rPr>
+            <w:noProof/>
+            <w:webHidden/>
+          </w:rPr>
+          <w:fldChar w:fldCharType="end"/>
+        </w:r>
+      </w:hyperlink>
+    </w:p>
+    <w:p>
+      <w:r>
+        <w:fldChar w:fldCharType="end"/>
+      </w:r>
+    </w:p>
+    <w:p>
+      <w:r>
+        <w:rPr>
+          <w:i/>
+          <w:sz w:val="20"/>
+        </w:rPr>
+        <w:t>Update the table in Word if entries do not appear immediately.</w:t>
+      </w:r>
+    </w:p>
+    <w:p>
+      <w:r>
+        <w:br w:type="page"/>
+      </w:r>
+    </w:p>
     <w:p>
       <w:pPr>
         <w:pStyle w:val="Title"/>
       </w:pPr>
       <w:r>
+        <w:lastRenderedPageBreak/>
         <w:t>Admin Dashboard Manual</w:t>
       </w:r>
     </w:p>
@@ -37,7 +3455,7 @@
           <w:noProof/>
         </w:rPr>
         <w:drawing>
-          <wp:inline distT="0" distB="0" distL="0" distR="0" wp14:anchorId="4ADE3F39" wp14:editId="4B2C3C4E">
+          <wp:inline distT="0" distB="0" distL="0" distR="0" wp14:anchorId="2B920F44" wp14:editId="1D607381">
             <wp:extent cx="6217920" cy="3819579"/>
             <wp:effectExtent l="0" t="0" r="0" b="0"/>
             <wp:docPr id="1" name="Picture 1"/>
@@ -52,7 +3470,7 @@
                     <pic:cNvPicPr/>
                   </pic:nvPicPr>
                   <pic:blipFill>
-                    <a:blip r:embed="rId6"/>
+                    <a:blip r:embed="rId8"/>
                     <a:stretch>
                       <a:fillRect/>
                     </a:stretch>
@@ -78,9 +3496,11 @@
       <w:pPr>
         <w:pStyle w:val="Heading1"/>
       </w:pPr>
+      <w:bookmarkStart w:id="1" w:name="_Toc226493504"/>
       <w:r>
         <w:t>1. Introduction</w:t>
       </w:r>
+      <w:bookmarkEnd w:id="1"/>
     </w:p>
     <w:p>
       <w:r>
@@ -198,9 +3618,11 @@
       <w:pPr>
         <w:pStyle w:val="Heading1"/>
       </w:pPr>
+      <w:bookmarkStart w:id="2" w:name="_Toc226493505"/>
       <w:r>
         <w:t>2. What the Admin role is for</w:t>
       </w:r>
+      <w:bookmarkEnd w:id="2"/>
     </w:p>
     <w:p>
       <w:r>
@@ -292,9 +3714,11 @@
       <w:pPr>
         <w:pStyle w:val="Heading1"/>
       </w:pPr>
+      <w:bookmarkStart w:id="3" w:name="_Toc226493506"/>
       <w:r>
         <w:t>3. Before you make changes</w:t>
       </w:r>
+      <w:bookmarkEnd w:id="3"/>
     </w:p>
     <w:p>
       <w:r>
@@ -398,7 +3822,7 @@
           <w:noProof/>
         </w:rPr>
         <w:drawing>
-          <wp:inline distT="0" distB="0" distL="0" distR="0" wp14:anchorId="7B126AED" wp14:editId="0C9D0A33">
+          <wp:inline distT="0" distB="0" distL="0" distR="0" wp14:anchorId="183BE080" wp14:editId="4C2050A9">
             <wp:extent cx="6217920" cy="3819579"/>
             <wp:effectExtent l="0" t="0" r="0" b="0"/>
             <wp:docPr id="2" name="Picture 2"/>
@@ -413,7 +3837,7 @@
                     <pic:cNvPicPr/>
                   </pic:nvPicPr>
                   <pic:blipFill>
-                    <a:blip r:embed="rId7"/>
+                    <a:blip r:embed="rId9"/>
                     <a:stretch>
                       <a:fillRect/>
                     </a:stretch>
@@ -439,17 +3863,15 @@
       <w:pPr>
         <w:pStyle w:val="Heading1"/>
       </w:pPr>
+      <w:bookmarkStart w:id="4" w:name="_Toc226493507"/>
       <w:r>
         <w:t>4. Signing in and moving around</w:t>
       </w:r>
-    </w:p>
-    <w:p>
-      <w:pPr>
-        <w:pStyle w:val="ListNumber"/>
-        <w:numPr>
-          <w:ilvl w:val="0"/>
-          <w:numId w:val="10"/>
-        </w:numPr>
+      <w:bookmarkEnd w:id="4"/>
+    </w:p>
+    <w:p>
+      <w:pPr>
+        <w:pStyle w:val="ManualNumber"/>
       </w:pPr>
       <w:r>
         <w:t>Open the dashboard link.</w:t>
@@ -508,9 +3930,11 @@
       <w:pPr>
         <w:pStyle w:val="Heading1"/>
       </w:pPr>
+      <w:bookmarkStart w:id="5" w:name="_Toc226493508"/>
       <w:r>
         <w:t>5. Main areas of the Admin Dashboard</w:t>
       </w:r>
+      <w:bookmarkEnd w:id="5"/>
     </w:p>
     <w:p>
       <w:r>
@@ -655,17 +4079,21 @@
       <w:pPr>
         <w:pStyle w:val="Heading1"/>
       </w:pPr>
+      <w:bookmarkStart w:id="6" w:name="_Toc226493509"/>
       <w:r>
         <w:t>6. Password reset requests</w:t>
       </w:r>
+      <w:bookmarkEnd w:id="6"/>
     </w:p>
     <w:p>
       <w:pPr>
         <w:pStyle w:val="Heading2"/>
       </w:pPr>
+      <w:bookmarkStart w:id="7" w:name="_Toc226493510"/>
       <w:r>
         <w:t>6.1 When to use this section</w:t>
       </w:r>
+      <w:bookmarkEnd w:id="7"/>
     </w:p>
     <w:p>
       <w:r>
@@ -695,17 +4123,15 @@
       <w:pPr>
         <w:pStyle w:val="Heading2"/>
       </w:pPr>
+      <w:bookmarkStart w:id="8" w:name="_Toc226493511"/>
       <w:r>
         <w:t>6.2 Step-by-step reset workflow</w:t>
       </w:r>
-    </w:p>
-    <w:p>
-      <w:pPr>
-        <w:pStyle w:val="ListNumber"/>
-        <w:numPr>
-          <w:ilvl w:val="0"/>
-          <w:numId w:val="11"/>
-        </w:numPr>
+      <w:bookmarkEnd w:id="8"/>
+    </w:p>
+    <w:p>
+      <w:pPr>
+        <w:pStyle w:val="ManualNumber"/>
       </w:pPr>
       <w:r>
         <w:t xml:space="preserve">Open </w:t>
@@ -766,9 +4192,11 @@
       <w:pPr>
         <w:pStyle w:val="Heading2"/>
       </w:pPr>
+      <w:bookmarkStart w:id="9" w:name="_Toc226493512"/>
       <w:r>
         <w:t>6.3 What should happen next</w:t>
       </w:r>
+      <w:bookmarkEnd w:id="9"/>
     </w:p>
     <w:p>
       <w:r>
@@ -805,9 +4233,11 @@
       <w:pPr>
         <w:pStyle w:val="Heading2"/>
       </w:pPr>
+      <w:bookmarkStart w:id="10" w:name="_Toc226493513"/>
       <w:r>
         <w:t>6.4 Good practice</w:t>
       </w:r>
+      <w:bookmarkEnd w:id="10"/>
     </w:p>
     <w:p>
       <w:pPr>
@@ -838,17 +4268,21 @@
       <w:pPr>
         <w:pStyle w:val="Heading1"/>
       </w:pPr>
+      <w:bookmarkStart w:id="11" w:name="_Toc226493514"/>
       <w:r>
         <w:t>7. Creating a new user</w:t>
       </w:r>
+      <w:bookmarkEnd w:id="11"/>
     </w:p>
     <w:p>
       <w:pPr>
         <w:pStyle w:val="Heading2"/>
       </w:pPr>
+      <w:bookmarkStart w:id="12" w:name="_Toc226493515"/>
       <w:r>
         <w:t>7.1 When to create a new account</w:t>
       </w:r>
+      <w:bookmarkEnd w:id="12"/>
     </w:p>
     <w:p>
       <w:r>
@@ -885,17 +4319,15 @@
       <w:pPr>
         <w:pStyle w:val="Heading2"/>
       </w:pPr>
+      <w:bookmarkStart w:id="13" w:name="_Toc226493516"/>
       <w:r>
         <w:t>7.2 Step-by-step workflow</w:t>
       </w:r>
-    </w:p>
-    <w:p>
-      <w:pPr>
-        <w:pStyle w:val="ListNumber"/>
-        <w:numPr>
-          <w:ilvl w:val="0"/>
-          <w:numId w:val="12"/>
-        </w:numPr>
+      <w:bookmarkEnd w:id="13"/>
+    </w:p>
+    <w:p>
+      <w:pPr>
+        <w:pStyle w:val="ManualNumber"/>
       </w:pPr>
       <w:r>
         <w:t xml:space="preserve">Open </w:t>
@@ -988,9 +4420,11 @@
       <w:pPr>
         <w:pStyle w:val="Heading2"/>
       </w:pPr>
+      <w:bookmarkStart w:id="14" w:name="_Toc226493517"/>
       <w:r>
         <w:t>7.3 Choosing the correct role</w:t>
       </w:r>
+      <w:bookmarkEnd w:id="14"/>
     </w:p>
     <w:p>
       <w:r>
@@ -1079,9 +4513,11 @@
       <w:pPr>
         <w:pStyle w:val="Heading2"/>
       </w:pPr>
+      <w:bookmarkStart w:id="15" w:name="_Toc226493518"/>
       <w:r>
         <w:t>7.4 Good practice</w:t>
       </w:r>
+      <w:bookmarkEnd w:id="15"/>
     </w:p>
     <w:p>
       <w:pPr>
@@ -1128,9 +4564,11 @@
       <w:pPr>
         <w:pStyle w:val="Heading1"/>
       </w:pPr>
+      <w:bookmarkStart w:id="16" w:name="_Toc226493519"/>
       <w:r>
         <w:t>8. Updating an existing user</w:t>
       </w:r>
+      <w:bookmarkEnd w:id="16"/>
     </w:p>
     <w:p>
       <w:r>
@@ -1190,9 +4628,11 @@
       <w:pPr>
         <w:pStyle w:val="Heading2"/>
       </w:pPr>
+      <w:bookmarkStart w:id="17" w:name="_Toc226493520"/>
       <w:r>
         <w:t>8.1 Reset Password</w:t>
       </w:r>
+      <w:bookmarkEnd w:id="17"/>
     </w:p>
     <w:p>
       <w:r>
@@ -1208,11 +4648,7 @@
     <w:p/>
     <w:p>
       <w:pPr>
-        <w:pStyle w:val="ListNumber"/>
-        <w:numPr>
-          <w:ilvl w:val="0"/>
-          <w:numId w:val="13"/>
-        </w:numPr>
+        <w:pStyle w:val="ManualNumber"/>
       </w:pPr>
       <w:r>
         <w:t xml:space="preserve">Open </w:t>
@@ -1264,9 +4700,11 @@
       <w:pPr>
         <w:pStyle w:val="Heading2"/>
       </w:pPr>
+      <w:bookmarkStart w:id="18" w:name="_Toc226493521"/>
       <w:r>
         <w:t>8.2 Update Role</w:t>
       </w:r>
+      <w:bookmarkEnd w:id="18"/>
     </w:p>
     <w:p>
       <w:r>
@@ -1276,18 +4714,13 @@
     <w:p/>
     <w:p>
       <w:r>
-        <w:lastRenderedPageBreak/>
         <w:t>Steps:</w:t>
       </w:r>
     </w:p>
     <w:p/>
     <w:p>
       <w:pPr>
-        <w:pStyle w:val="ListNumber"/>
-        <w:numPr>
-          <w:ilvl w:val="0"/>
-          <w:numId w:val="14"/>
-        </w:numPr>
+        <w:pStyle w:val="ManualNumber"/>
       </w:pPr>
       <w:r>
         <w:t xml:space="preserve">Open </w:t>
@@ -1404,9 +4837,11 @@
       <w:pPr>
         <w:pStyle w:val="Heading2"/>
       </w:pPr>
+      <w:bookmarkStart w:id="19" w:name="_Toc226493522"/>
       <w:r>
         <w:t>8.3 Update User Details</w:t>
       </w:r>
+      <w:bookmarkEnd w:id="19"/>
     </w:p>
     <w:p>
       <w:r>
@@ -1422,11 +4857,7 @@
     <w:p/>
     <w:p>
       <w:pPr>
-        <w:pStyle w:val="ListNumber"/>
-        <w:numPr>
-          <w:ilvl w:val="0"/>
-          <w:numId w:val="15"/>
-        </w:numPr>
+        <w:pStyle w:val="ManualNumber"/>
       </w:pPr>
       <w:r>
         <w:t xml:space="preserve">Open </w:t>
@@ -1511,9 +4942,11 @@
       <w:pPr>
         <w:pStyle w:val="Heading2"/>
       </w:pPr>
+      <w:bookmarkStart w:id="20" w:name="_Toc226493523"/>
       <w:r>
         <w:t>8.4 Delete User</w:t>
       </w:r>
+      <w:bookmarkEnd w:id="20"/>
     </w:p>
     <w:p>
       <w:r>
@@ -1529,11 +4962,7 @@
     <w:p/>
     <w:p>
       <w:pPr>
-        <w:pStyle w:val="ListNumber"/>
-        <w:numPr>
-          <w:ilvl w:val="0"/>
-          <w:numId w:val="16"/>
-        </w:numPr>
+        <w:pStyle w:val="ManualNumber"/>
       </w:pPr>
       <w:r>
         <w:t xml:space="preserve">Open </w:t>
@@ -1561,6 +4990,7 @@
         <w:pStyle w:val="ManualNumber"/>
       </w:pPr>
       <w:r>
+        <w:lastRenderedPageBreak/>
         <w:t>Enter the reason for deletion.</w:t>
       </w:r>
     </w:p>
@@ -1625,17 +5055,21 @@
       <w:pPr>
         <w:pStyle w:val="Heading1"/>
       </w:pPr>
+      <w:bookmarkStart w:id="21" w:name="_Toc226493524"/>
       <w:r>
         <w:t>9. Sync Performance</w:t>
       </w:r>
+      <w:bookmarkEnd w:id="21"/>
     </w:p>
     <w:p>
       <w:pPr>
         <w:pStyle w:val="Heading2"/>
       </w:pPr>
+      <w:bookmarkStart w:id="22" w:name="_Toc226493525"/>
       <w:r>
         <w:t>9.1 What this section is for</w:t>
       </w:r>
+      <w:bookmarkEnd w:id="22"/>
     </w:p>
     <w:p>
       <w:r>
@@ -1692,9 +5126,11 @@
       <w:pPr>
         <w:pStyle w:val="Heading2"/>
       </w:pPr>
+      <w:bookmarkStart w:id="23" w:name="_Toc226493526"/>
       <w:r>
         <w:t>9.2 What to review</w:t>
       </w:r>
+      <w:bookmarkEnd w:id="23"/>
     </w:p>
     <w:p>
       <w:r>
@@ -1755,9 +5191,11 @@
       <w:pPr>
         <w:pStyle w:val="Heading2"/>
       </w:pPr>
+      <w:bookmarkStart w:id="24" w:name="_Toc226493527"/>
       <w:r>
         <w:t>9.3 How to interpret it</w:t>
       </w:r>
+      <w:bookmarkEnd w:id="24"/>
     </w:p>
     <w:p>
       <w:r>
@@ -1800,17 +5238,21 @@
       <w:pPr>
         <w:pStyle w:val="Heading1"/>
       </w:pPr>
+      <w:bookmarkStart w:id="25" w:name="_Toc226493528"/>
       <w:r>
         <w:t>10. Beacon API Sync</w:t>
       </w:r>
+      <w:bookmarkEnd w:id="25"/>
     </w:p>
     <w:p>
       <w:pPr>
         <w:pStyle w:val="Heading2"/>
       </w:pPr>
+      <w:bookmarkStart w:id="26" w:name="_Toc226493529"/>
       <w:r>
         <w:t>10.1 Smoke test</w:t>
       </w:r>
+      <w:bookmarkEnd w:id="26"/>
     </w:p>
     <w:p>
       <w:r>
@@ -1862,9 +5304,11 @@
       <w:pPr>
         <w:pStyle w:val="Heading2"/>
       </w:pPr>
+      <w:bookmarkStart w:id="27" w:name="_Toc226493530"/>
       <w:r>
         <w:t>10.2 Manual sync</w:t>
       </w:r>
+      <w:bookmarkEnd w:id="27"/>
     </w:p>
     <w:p>
       <w:r>
@@ -1922,14 +5366,9 @@
     </w:p>
     <w:p>
       <w:pPr>
-        <w:pStyle w:val="ListNumber"/>
-        <w:numPr>
-          <w:ilvl w:val="0"/>
-          <w:numId w:val="17"/>
-        </w:numPr>
-      </w:pPr>
-      <w:r>
-        <w:lastRenderedPageBreak/>
+        <w:pStyle w:val="ManualNumber"/>
+      </w:pPr>
+      <w:r>
         <w:t>If you are troubleshooting, run a smoke test first.</w:t>
       </w:r>
     </w:p>
@@ -1979,9 +5418,11 @@
       <w:pPr>
         <w:pStyle w:val="Heading2"/>
       </w:pPr>
+      <w:bookmarkStart w:id="28" w:name="_Toc226493531"/>
       <w:r>
         <w:t>10.3 Stop or clear a stuck sync</w:t>
       </w:r>
+      <w:bookmarkEnd w:id="28"/>
     </w:p>
     <w:p>
       <w:r>
@@ -2023,9 +5464,11 @@
       <w:pPr>
         <w:pStyle w:val="Heading1"/>
       </w:pPr>
+      <w:bookmarkStart w:id="29" w:name="_Toc226493532"/>
       <w:r>
         <w:t>11. Beacon CSV Upload</w:t>
       </w:r>
+      <w:bookmarkEnd w:id="29"/>
     </w:p>
     <w:p>
       <w:r>
@@ -2072,11 +5515,7 @@
     <w:p/>
     <w:p>
       <w:pPr>
-        <w:pStyle w:val="ListNumber"/>
-        <w:numPr>
-          <w:ilvl w:val="0"/>
-          <w:numId w:val="18"/>
-        </w:numPr>
+        <w:pStyle w:val="ManualNumber"/>
       </w:pPr>
       <w:r>
         <w:t>Confirm why CSV upload is needed.</w:t>
@@ -2103,9 +5542,11 @@
       <w:pPr>
         <w:pStyle w:val="Heading1"/>
       </w:pPr>
+      <w:bookmarkStart w:id="30" w:name="_Toc226493533"/>
       <w:r>
         <w:t>12. Data reset and rebuild actions</w:t>
       </w:r>
+      <w:bookmarkEnd w:id="30"/>
     </w:p>
     <w:p>
       <w:r>
@@ -2115,7 +5556,6 @@
     <w:p/>
     <w:p>
       <w:r>
-        <w:lastRenderedPageBreak/>
         <w:t>Use them only when:</w:t>
       </w:r>
     </w:p>
@@ -2153,11 +5593,7 @@
     <w:p/>
     <w:p>
       <w:pPr>
-        <w:pStyle w:val="ListNumber"/>
-        <w:numPr>
-          <w:ilvl w:val="0"/>
-          <w:numId w:val="19"/>
-        </w:numPr>
+        <w:pStyle w:val="ManualNumber"/>
       </w:pPr>
       <w:r>
         <w:t>Confirm the reason.</w:t>
@@ -2192,9 +5628,11 @@
       <w:pPr>
         <w:pStyle w:val="Heading1"/>
       </w:pPr>
+      <w:bookmarkStart w:id="31" w:name="_Toc226493534"/>
       <w:r>
         <w:t>13. Audit Logs</w:t>
       </w:r>
+      <w:bookmarkEnd w:id="31"/>
     </w:p>
     <w:p>
       <w:r>
@@ -2259,9 +5697,11 @@
       <w:pPr>
         <w:pStyle w:val="Heading1"/>
       </w:pPr>
+      <w:bookmarkStart w:id="32" w:name="_Toc226493535"/>
       <w:r>
         <w:t>14. Data Request Form and Temporary Access</w:t>
       </w:r>
+      <w:bookmarkEnd w:id="32"/>
     </w:p>
     <w:p>
       <w:r>
@@ -2282,9 +5722,11 @@
       <w:pPr>
         <w:pStyle w:val="Heading2"/>
       </w:pPr>
+      <w:bookmarkStart w:id="33" w:name="_Toc226493536"/>
       <w:r>
         <w:t>14.1 Reviewing requests</w:t>
       </w:r>
+      <w:bookmarkEnd w:id="33"/>
     </w:p>
     <w:p>
       <w:r>
@@ -2382,9 +5824,11 @@
       <w:pPr>
         <w:pStyle w:val="Heading2"/>
       </w:pPr>
+      <w:bookmarkStart w:id="34" w:name="_Toc226493537"/>
       <w:r>
         <w:t>14.2 Granting temporary access</w:t>
       </w:r>
+      <w:bookmarkEnd w:id="34"/>
     </w:p>
     <w:p>
       <w:r>
@@ -2480,9 +5924,11 @@
       <w:pPr>
         <w:pStyle w:val="Heading2"/>
       </w:pPr>
+      <w:bookmarkStart w:id="35" w:name="_Toc226493538"/>
       <w:r>
         <w:t>14.3 How temporary access behaves</w:t>
       </w:r>
+      <w:bookmarkEnd w:id="35"/>
     </w:p>
     <w:p>
       <w:r>
@@ -2525,17 +5971,21 @@
       <w:pPr>
         <w:pStyle w:val="Heading1"/>
       </w:pPr>
+      <w:bookmarkStart w:id="36" w:name="_Toc226493539"/>
       <w:r>
         <w:t>15. Using the other dashboards as an Admin</w:t>
       </w:r>
+      <w:bookmarkEnd w:id="36"/>
     </w:p>
     <w:p>
       <w:pPr>
         <w:pStyle w:val="Heading2"/>
       </w:pPr>
+      <w:bookmarkStart w:id="37" w:name="_Toc226493540"/>
       <w:r>
         <w:t>14.1 KPI Dashboard</w:t>
       </w:r>
+      <w:bookmarkEnd w:id="37"/>
     </w:p>
     <w:p>
       <w:r>
@@ -2586,9 +6036,11 @@
       <w:pPr>
         <w:pStyle w:val="Heading2"/>
       </w:pPr>
+      <w:bookmarkStart w:id="38" w:name="_Toc226493541"/>
       <w:r>
         <w:t>14.2 Custom Reports Dashboard</w:t>
       </w:r>
+      <w:bookmarkEnd w:id="38"/>
     </w:p>
     <w:p>
       <w:r>
@@ -2708,10 +6160,11 @@
       <w:pPr>
         <w:pStyle w:val="Heading2"/>
       </w:pPr>
-      <w:r>
-        <w:lastRenderedPageBreak/>
+      <w:bookmarkStart w:id="39" w:name="_Toc226493542"/>
+      <w:r>
         <w:t>14.3 ML Dashboard</w:t>
       </w:r>
+      <w:bookmarkEnd w:id="39"/>
     </w:p>
     <w:p>
       <w:r>
@@ -2748,9 +6201,11 @@
       <w:pPr>
         <w:pStyle w:val="Heading2"/>
       </w:pPr>
+      <w:bookmarkStart w:id="40" w:name="_Toc226493543"/>
       <w:r>
         <w:t>14.4 Funder Dashboard</w:t>
       </w:r>
+      <w:bookmarkEnd w:id="40"/>
     </w:p>
     <w:p>
       <w:r>
@@ -2787,9 +6242,11 @@
       <w:pPr>
         <w:pStyle w:val="Heading2"/>
       </w:pPr>
+      <w:bookmarkStart w:id="41" w:name="_Toc226493544"/>
       <w:r>
         <w:t>14.5 Case Studies</w:t>
       </w:r>
+      <w:bookmarkEnd w:id="41"/>
     </w:p>
     <w:p>
       <w:r>
@@ -2826,9 +6283,11 @@
       <w:pPr>
         <w:pStyle w:val="Heading1"/>
       </w:pPr>
+      <w:bookmarkStart w:id="42" w:name="_Toc226493545"/>
       <w:r>
         <w:t>16. Recommended Admin working pattern</w:t>
       </w:r>
+      <w:bookmarkEnd w:id="42"/>
     </w:p>
     <w:p>
       <w:r>
@@ -2838,11 +6297,7 @@
     <w:p/>
     <w:p>
       <w:pPr>
-        <w:pStyle w:val="ListNumber"/>
-        <w:numPr>
-          <w:ilvl w:val="0"/>
-          <w:numId w:val="20"/>
-        </w:numPr>
+        <w:pStyle w:val="ManualNumber"/>
       </w:pPr>
       <w:r>
         <w:t xml:space="preserve">Check </w:t>
@@ -2920,85 +6375,85 @@
       <w:pPr>
         <w:pStyle w:val="Heading1"/>
       </w:pPr>
+      <w:bookmarkStart w:id="43" w:name="_Toc226493546"/>
+      <w:r>
+        <w:t>17. Troubleshooting</w:t>
+      </w:r>
+      <w:bookmarkEnd w:id="43"/>
+    </w:p>
+    <w:p>
+      <w:pPr>
+        <w:pStyle w:val="Heading2"/>
+      </w:pPr>
+      <w:bookmarkStart w:id="44" w:name="_Toc226493547"/>
+      <w:r>
+        <w:t>`Admin client not available`</w:t>
+      </w:r>
+      <w:bookmarkEnd w:id="44"/>
+    </w:p>
+    <w:p>
+      <w:r>
+        <w:t>Check the Admin-side configuration and confirm the required credentials are loaded correctly.</w:t>
+      </w:r>
+    </w:p>
+    <w:p/>
+    <w:p>
+      <w:pPr>
+        <w:pStyle w:val="Heading2"/>
+      </w:pPr>
+      <w:bookmarkStart w:id="45" w:name="_Toc226493548"/>
+      <w:r>
+        <w:t>A user cannot sign in</w:t>
+      </w:r>
+      <w:bookmarkEnd w:id="45"/>
+    </w:p>
+    <w:p>
+      <w:pPr>
+        <w:pStyle w:val="ManualNumber"/>
+      </w:pPr>
+      <w:r>
+        <w:t>Check whether they requested a password reset.</w:t>
+      </w:r>
+    </w:p>
+    <w:p>
+      <w:pPr>
+        <w:pStyle w:val="ManualNumber"/>
+      </w:pPr>
+      <w:r>
+        <w:t>Reset the password manually if needed.</w:t>
+      </w:r>
+    </w:p>
+    <w:p>
+      <w:pPr>
+        <w:pStyle w:val="ManualNumber"/>
+      </w:pPr>
+      <w:r>
+        <w:t>Confirm the account still has a valid role.</w:t>
+      </w:r>
+    </w:p>
+    <w:p>
+      <w:pPr>
+        <w:pStyle w:val="ManualNumber"/>
+      </w:pPr>
       <w:r>
         <w:lastRenderedPageBreak/>
-        <w:t>17. Troubleshooting</w:t>
-      </w:r>
-    </w:p>
+        <w:t>Confirm the email address is correct.</w:t>
+      </w:r>
+    </w:p>
+    <w:p/>
     <w:p>
       <w:pPr>
         <w:pStyle w:val="Heading2"/>
       </w:pPr>
-      <w:r>
-        <w:t>`Admin client not available`</w:t>
-      </w:r>
-    </w:p>
-    <w:p>
-      <w:r>
-        <w:t>Check the Admin-side configuration and confirm the required credentials are loaded correctly.</w:t>
-      </w:r>
-    </w:p>
-    <w:p/>
-    <w:p>
-      <w:pPr>
-        <w:pStyle w:val="Heading2"/>
-      </w:pPr>
-      <w:r>
-        <w:t>A user cannot sign in</w:t>
-      </w:r>
-    </w:p>
-    <w:p>
-      <w:pPr>
-        <w:pStyle w:val="ListNumber"/>
-        <w:numPr>
-          <w:ilvl w:val="0"/>
-          <w:numId w:val="21"/>
-        </w:numPr>
-      </w:pPr>
-      <w:r>
-        <w:t>Check whether they requested a password reset.</w:t>
-      </w:r>
+      <w:bookmarkStart w:id="46" w:name="_Toc226493549"/>
+      <w:r>
+        <w:t>The dashboard looks out of date</w:t>
+      </w:r>
+      <w:bookmarkEnd w:id="46"/>
     </w:p>
     <w:p>
       <w:pPr>
         <w:pStyle w:val="ManualNumber"/>
-      </w:pPr>
-      <w:r>
-        <w:t>Reset the password manually if needed.</w:t>
-      </w:r>
-    </w:p>
-    <w:p>
-      <w:pPr>
-        <w:pStyle w:val="ManualNumber"/>
-      </w:pPr>
-      <w:r>
-        <w:t>Confirm the account still has a valid role.</w:t>
-      </w:r>
-    </w:p>
-    <w:p>
-      <w:pPr>
-        <w:pStyle w:val="ManualNumber"/>
-      </w:pPr>
-      <w:r>
-        <w:t>Confirm the email address is correct.</w:t>
-      </w:r>
-    </w:p>
-    <w:p/>
-    <w:p>
-      <w:pPr>
-        <w:pStyle w:val="Heading2"/>
-      </w:pPr>
-      <w:r>
-        <w:t>The dashboard looks out of date</w:t>
-      </w:r>
-    </w:p>
-    <w:p>
-      <w:pPr>
-        <w:pStyle w:val="ListNumber"/>
-        <w:numPr>
-          <w:ilvl w:val="0"/>
-          <w:numId w:val="22"/>
-        </w:numPr>
       </w:pPr>
       <w:r>
         <w:t xml:space="preserve">Check </w:t>
@@ -3051,17 +6506,15 @@
       <w:pPr>
         <w:pStyle w:val="Heading2"/>
       </w:pPr>
+      <w:bookmarkStart w:id="47" w:name="_Toc226493550"/>
       <w:r>
         <w:t>A sync looks stuck</w:t>
       </w:r>
-    </w:p>
-    <w:p>
-      <w:pPr>
-        <w:pStyle w:val="ListNumber"/>
-        <w:numPr>
-          <w:ilvl w:val="0"/>
-          <w:numId w:val="23"/>
-        </w:numPr>
+      <w:bookmarkEnd w:id="47"/>
+    </w:p>
+    <w:p>
+      <w:pPr>
+        <w:pStyle w:val="ManualNumber"/>
       </w:pPr>
       <w:r>
         <w:t>Review the current sync status.</w:t>
@@ -3106,17 +6559,15 @@
       <w:pPr>
         <w:pStyle w:val="Heading2"/>
       </w:pPr>
+      <w:bookmarkStart w:id="48" w:name="_Toc226493551"/>
       <w:r>
         <w:t>A user has the wrong access</w:t>
       </w:r>
-    </w:p>
-    <w:p>
-      <w:pPr>
-        <w:pStyle w:val="ListNumber"/>
-        <w:numPr>
-          <w:ilvl w:val="0"/>
-          <w:numId w:val="24"/>
-        </w:numPr>
+      <w:bookmarkEnd w:id="48"/>
+    </w:p>
+    <w:p>
+      <w:pPr>
+        <w:pStyle w:val="ManualNumber"/>
       </w:pPr>
       <w:r>
         <w:t>Review the user's current role.</w:t>
@@ -3147,6 +6598,7 @@
       </w:r>
     </w:p>
     <w:sectPr>
+      <w:footerReference w:type="default" r:id="rId10"/>
       <w:pgSz w:w="11909" w:h="16834"/>
       <w:pgMar w:top="1080" w:right="1152" w:bottom="1080" w:left="1152" w:header="720" w:footer="720" w:gutter="0"/>
       <w:cols w:space="720"/>
@@ -3154,6 +6606,109 @@
     </w:sectPr>
   </w:body>
 </w:document>
+</file>
+
+<file path=word/endnotes.xml><?xml version="1.0" encoding="utf-8"?>
+<w:endnotes xmlns:wpc="http://schemas.microsoft.com/office/word/2010/wordprocessingCanvas" xmlns:cx="http://schemas.microsoft.com/office/drawing/2014/chartex" xmlns:cx1="http://schemas.microsoft.com/office/drawing/2015/9/8/chartex" xmlns:cx2="http://schemas.microsoft.com/office/drawing/2015/10/21/chartex" xmlns:cx3="http://schemas.microsoft.com/office/drawing/2016/5/9/chartex" xmlns:cx4="http://schemas.microsoft.com/office/drawing/2016/5/10/chartex" xmlns:cx5="http://schemas.microsoft.com/office/drawing/2016/5/11/chartex" xmlns:cx6="http://schemas.microsoft.com/office/drawing/2016/5/12/chartex" xmlns:cx7="http://schemas.microsoft.com/office/drawing/2016/5/13/chartex" xmlns:cx8="http://schemas.microsoft.com/office/drawing/2016/5/14/chartex" xmlns:mc="http://schemas.openxmlformats.org/markup-compatibility/2006" xmlns:aink="http://schemas.microsoft.com/office/drawing/2016/ink" xmlns:am3d="http://schemas.microsoft.com/office/drawing/2017/model3d" xmlns:o="urn:schemas-microsoft-com:office:office" xmlns:oel="http://schemas.microsoft.com/office/2019/extlst" xmlns:r="http://schemas.openxmlformats.org/officeDocument/2006/relationships" xmlns:m="http://schemas.openxmlformats.org/officeDocument/2006/math" xmlns:v="urn:schemas-microsoft-com:vml" xmlns:wp14="http://schemas.microsoft.com/office/word/2010/wordprocessingDrawing" xmlns:wp="http://schemas.openxmlformats.org/drawingml/2006/wordprocessingDrawing" xmlns:w10="urn:schemas-microsoft-com:office:word" xmlns:w="http://schemas.openxmlformats.org/wordprocessingml/2006/main" xmlns:w14="http://schemas.microsoft.com/office/word/2010/wordml" xmlns:w15="http://schemas.microsoft.com/office/word/2012/wordml" xmlns:w16cex="http://schemas.microsoft.com/office/word/2018/wordml/cex" xmlns:w16cid="http://schemas.microsoft.com/office/word/2016/wordml/cid" xmlns:w16="http://schemas.microsoft.com/office/word/2018/wordml" xmlns:w16du="http://schemas.microsoft.com/office/word/2023/wordml/word16du" xmlns:w16sdtdh="http://schemas.microsoft.com/office/word/2020/wordml/sdtdatahash" xmlns:w16sdtfl="http://schemas.microsoft.com/office/word/2024/wordml/sdtformatlock" xmlns:w16se="http://schemas.microsoft.com/office/word/2015/wordml/symex" xmlns:wpg="http://schemas.microsoft.com/office/word/2010/wordprocessingGroup" xmlns:wpi="http://schemas.microsoft.com/office/word/2010/wordprocessingInk" xmlns:wne="http://schemas.microsoft.com/office/word/2006/wordml" xmlns:wps="http://schemas.microsoft.com/office/word/2010/wordprocessingShape" mc:Ignorable="w14 w15 w16se w16cid w16 w16cex w16sdtdh w16sdtfl w16du wp14">
+  <w:endnote w:type="separator" w:id="-1">
+    <w:p>
+      <w:pPr>
+        <w:spacing w:after="0" w:line="240" w:lineRule="auto"/>
+      </w:pPr>
+      <w:r>
+        <w:separator/>
+      </w:r>
+    </w:p>
+  </w:endnote>
+  <w:endnote w:type="continuationSeparator" w:id="0">
+    <w:p>
+      <w:pPr>
+        <w:spacing w:after="0" w:line="240" w:lineRule="auto"/>
+      </w:pPr>
+      <w:r>
+        <w:continuationSeparator/>
+      </w:r>
+    </w:p>
+  </w:endnote>
+</w:endnotes>
+</file>
+
+<file path=word/footer1.xml><?xml version="1.0" encoding="utf-8"?>
+<w:ftr xmlns:wpc="http://schemas.microsoft.com/office/word/2010/wordprocessingCanvas" xmlns:cx="http://schemas.microsoft.com/office/drawing/2014/chartex" xmlns:cx1="http://schemas.microsoft.com/office/drawing/2015/9/8/chartex" xmlns:cx2="http://schemas.microsoft.com/office/drawing/2015/10/21/chartex" xmlns:cx3="http://schemas.microsoft.com/office/drawing/2016/5/9/chartex" xmlns:cx4="http://schemas.microsoft.com/office/drawing/2016/5/10/chartex" xmlns:cx5="http://schemas.microsoft.com/office/drawing/2016/5/11/chartex" xmlns:cx6="http://schemas.microsoft.com/office/drawing/2016/5/12/chartex" xmlns:cx7="http://schemas.microsoft.com/office/drawing/2016/5/13/chartex" xmlns:cx8="http://schemas.microsoft.com/office/drawing/2016/5/14/chartex" xmlns:mc="http://schemas.openxmlformats.org/markup-compatibility/2006" xmlns:aink="http://schemas.microsoft.com/office/drawing/2016/ink" xmlns:am3d="http://schemas.microsoft.com/office/drawing/2017/model3d" xmlns:o="urn:schemas-microsoft-com:office:office" xmlns:oel="http://schemas.microsoft.com/office/2019/extlst" xmlns:r="http://schemas.openxmlformats.org/officeDocument/2006/relationships" xmlns:m="http://schemas.openxmlformats.org/officeDocument/2006/math" xmlns:v="urn:schemas-microsoft-com:vml" xmlns:wp14="http://schemas.microsoft.com/office/word/2010/wordprocessingDrawing" xmlns:wp="http://schemas.openxmlformats.org/drawingml/2006/wordprocessingDrawing" xmlns:w10="urn:schemas-microsoft-com:office:word" xmlns:w="http://schemas.openxmlformats.org/wordprocessingml/2006/main" xmlns:w14="http://schemas.microsoft.com/office/word/2010/wordml" xmlns:w15="http://schemas.microsoft.com/office/word/2012/wordml" xmlns:w16cex="http://schemas.microsoft.com/office/word/2018/wordml/cex" xmlns:w16cid="http://schemas.microsoft.com/office/word/2016/wordml/cid" xmlns:w16="http://schemas.microsoft.com/office/word/2018/wordml" xmlns:w16du="http://schemas.microsoft.com/office/word/2023/wordml/word16du" xmlns:w16sdtdh="http://schemas.microsoft.com/office/word/2020/wordml/sdtdatahash" xmlns:w16sdtfl="http://schemas.microsoft.com/office/word/2024/wordml/sdtformatlock" xmlns:w16se="http://schemas.microsoft.com/office/word/2015/wordml/symex" xmlns:wpg="http://schemas.microsoft.com/office/word/2010/wordprocessingGroup" xmlns:wpi="http://schemas.microsoft.com/office/word/2010/wordprocessingInk" xmlns:wne="http://schemas.microsoft.com/office/word/2006/wordml" xmlns:wps="http://schemas.microsoft.com/office/word/2010/wordprocessingShape" mc:Ignorable="w14 w15 w16se w16cid w16 w16cex w16sdtdh w16sdtfl w16du wp14">
+  <w:p>
+    <w:pPr>
+      <w:pStyle w:val="Footer"/>
+      <w:jc w:val="center"/>
+    </w:pPr>
+    <w:r>
+      <w:t xml:space="preserve">Page </w:t>
+    </w:r>
+    <w:r>
+      <w:fldChar w:fldCharType="begin"/>
+    </w:r>
+    <w:r>
+      <w:instrText xml:space="preserve"> PAGE </w:instrText>
+    </w:r>
+    <w:r>
+      <w:fldChar w:fldCharType="separate"/>
+    </w:r>
+    <w:r>
+      <w:rPr>
+        <w:noProof/>
+      </w:rPr>
+      <w:t>1</w:t>
+    </w:r>
+    <w:r>
+      <w:fldChar w:fldCharType="end"/>
+    </w:r>
+    <w:r>
+      <w:t xml:space="preserve"> of </w:t>
+    </w:r>
+    <w:r>
+      <w:fldChar w:fldCharType="begin"/>
+    </w:r>
+    <w:r>
+      <w:instrText xml:space="preserve"> NUMPAGES </w:instrText>
+    </w:r>
+    <w:r>
+      <w:fldChar w:fldCharType="separate"/>
+    </w:r>
+    <w:r>
+      <w:rPr>
+        <w:noProof/>
+      </w:rPr>
+      <w:t>2</w:t>
+    </w:r>
+    <w:r>
+      <w:fldChar w:fldCharType="end"/>
+    </w:r>
+  </w:p>
+</w:ftr>
+</file>
+
+<file path=word/footnotes.xml><?xml version="1.0" encoding="utf-8"?>
+<w:footnotes xmlns:wpc="http://schemas.microsoft.com/office/word/2010/wordprocessingCanvas" xmlns:cx="http://schemas.microsoft.com/office/drawing/2014/chartex" xmlns:cx1="http://schemas.microsoft.com/office/drawing/2015/9/8/chartex" xmlns:cx2="http://schemas.microsoft.com/office/drawing/2015/10/21/chartex" xmlns:cx3="http://schemas.microsoft.com/office/drawing/2016/5/9/chartex" xmlns:cx4="http://schemas.microsoft.com/office/drawing/2016/5/10/chartex" xmlns:cx5="http://schemas.microsoft.com/office/drawing/2016/5/11/chartex" xmlns:cx6="http://schemas.microsoft.com/office/drawing/2016/5/12/chartex" xmlns:cx7="http://schemas.microsoft.com/office/drawing/2016/5/13/chartex" xmlns:cx8="http://schemas.microsoft.com/office/drawing/2016/5/14/chartex" xmlns:mc="http://schemas.openxmlformats.org/markup-compatibility/2006" xmlns:aink="http://schemas.microsoft.com/office/drawing/2016/ink" xmlns:am3d="http://schemas.microsoft.com/office/drawing/2017/model3d" xmlns:o="urn:schemas-microsoft-com:office:office" xmlns:oel="http://schemas.microsoft.com/office/2019/extlst" xmlns:r="http://schemas.openxmlformats.org/officeDocument/2006/relationships" xmlns:m="http://schemas.openxmlformats.org/officeDocument/2006/math" xmlns:v="urn:schemas-microsoft-com:vml" xmlns:wp14="http://schemas.microsoft.com/office/word/2010/wordprocessingDrawing" xmlns:wp="http://schemas.openxmlformats.org/drawingml/2006/wordprocessingDrawing" xmlns:w10="urn:schemas-microsoft-com:office:word" xmlns:w="http://schemas.openxmlformats.org/wordprocessingml/2006/main" xmlns:w14="http://schemas.microsoft.com/office/word/2010/wordml" xmlns:w15="http://schemas.microsoft.com/office/word/2012/wordml" xmlns:w16cex="http://schemas.microsoft.com/office/word/2018/wordml/cex" xmlns:w16cid="http://schemas.microsoft.com/office/word/2016/wordml/cid" xmlns:w16="http://schemas.microsoft.com/office/word/2018/wordml" xmlns:w16du="http://schemas.microsoft.com/office/word/2023/wordml/word16du" xmlns:w16sdtdh="http://schemas.microsoft.com/office/word/2020/wordml/sdtdatahash" xmlns:w16sdtfl="http://schemas.microsoft.com/office/word/2024/wordml/sdtformatlock" xmlns:w16se="http://schemas.microsoft.com/office/word/2015/wordml/symex" xmlns:wpg="http://schemas.microsoft.com/office/word/2010/wordprocessingGroup" xmlns:wpi="http://schemas.microsoft.com/office/word/2010/wordprocessingInk" xmlns:wne="http://schemas.microsoft.com/office/word/2006/wordml" xmlns:wps="http://schemas.microsoft.com/office/word/2010/wordprocessingShape" mc:Ignorable="w14 w15 w16se w16cid w16 w16cex w16sdtdh w16sdtfl w16du wp14">
+  <w:footnote w:type="separator" w:id="-1">
+    <w:p>
+      <w:pPr>
+        <w:spacing w:after="0" w:line="240" w:lineRule="auto"/>
+      </w:pPr>
+      <w:r>
+        <w:separator/>
+      </w:r>
+    </w:p>
+  </w:footnote>
+  <w:footnote w:type="continuationSeparator" w:id="0">
+    <w:p>
+      <w:pPr>
+        <w:spacing w:after="0" w:line="240" w:lineRule="auto"/>
+      </w:pPr>
+      <w:r>
+        <w:continuationSeparator/>
+      </w:r>
+    </w:p>
+  </w:footnote>
+</w:footnotes>
 </file>
 
 <file path=word/numbering.xml><?xml version="1.0" encoding="utf-8"?>
@@ -3329,122 +6884,32 @@
       </w:rPr>
     </w:lvl>
   </w:abstractNum>
-  <w:num w:numId="1" w16cid:durableId="2090154398">
+  <w:num w:numId="1" w16cid:durableId="2016149760">
     <w:abstractNumId w:val="8"/>
   </w:num>
-  <w:num w:numId="2" w16cid:durableId="1755590466">
+  <w:num w:numId="2" w16cid:durableId="1076367035">
     <w:abstractNumId w:val="6"/>
   </w:num>
-  <w:num w:numId="3" w16cid:durableId="420109227">
+  <w:num w:numId="3" w16cid:durableId="2006739882">
     <w:abstractNumId w:val="5"/>
   </w:num>
-  <w:num w:numId="4" w16cid:durableId="55318477">
+  <w:num w:numId="4" w16cid:durableId="242690364">
     <w:abstractNumId w:val="4"/>
   </w:num>
-  <w:num w:numId="5" w16cid:durableId="5983071">
+  <w:num w:numId="5" w16cid:durableId="133185810">
     <w:abstractNumId w:val="7"/>
   </w:num>
-  <w:num w:numId="6" w16cid:durableId="996373044">
+  <w:num w:numId="6" w16cid:durableId="1152984478">
     <w:abstractNumId w:val="3"/>
   </w:num>
-  <w:num w:numId="7" w16cid:durableId="884560566">
+  <w:num w:numId="7" w16cid:durableId="1443845076">
     <w:abstractNumId w:val="2"/>
   </w:num>
-  <w:num w:numId="8" w16cid:durableId="1468821731">
+  <w:num w:numId="8" w16cid:durableId="696732600">
     <w:abstractNumId w:val="1"/>
   </w:num>
-  <w:num w:numId="9" w16cid:durableId="1141726034">
+  <w:num w:numId="9" w16cid:durableId="515657856">
     <w:abstractNumId w:val="0"/>
-  </w:num>
-  <w:num w:numId="10" w16cid:durableId="1123113467">
-    <w:abstractNumId w:val="7"/>
-    <w:lvlOverride w:ilvl="0">
-      <w:startOverride w:val="1"/>
-    </w:lvlOverride>
-  </w:num>
-  <w:num w:numId="11" w16cid:durableId="1491218190">
-    <w:abstractNumId w:val="7"/>
-    <w:lvlOverride w:ilvl="0">
-      <w:startOverride w:val="1"/>
-    </w:lvlOverride>
-  </w:num>
-  <w:num w:numId="12" w16cid:durableId="310596434">
-    <w:abstractNumId w:val="7"/>
-    <w:lvlOverride w:ilvl="0">
-      <w:startOverride w:val="1"/>
-    </w:lvlOverride>
-  </w:num>
-  <w:num w:numId="13" w16cid:durableId="1550802618">
-    <w:abstractNumId w:val="7"/>
-    <w:lvlOverride w:ilvl="0">
-      <w:startOverride w:val="1"/>
-    </w:lvlOverride>
-  </w:num>
-  <w:num w:numId="14" w16cid:durableId="1402290597">
-    <w:abstractNumId w:val="7"/>
-    <w:lvlOverride w:ilvl="0">
-      <w:startOverride w:val="1"/>
-    </w:lvlOverride>
-  </w:num>
-  <w:num w:numId="15" w16cid:durableId="268315325">
-    <w:abstractNumId w:val="7"/>
-    <w:lvlOverride w:ilvl="0">
-      <w:startOverride w:val="1"/>
-    </w:lvlOverride>
-  </w:num>
-  <w:num w:numId="16" w16cid:durableId="1755396013">
-    <w:abstractNumId w:val="7"/>
-    <w:lvlOverride w:ilvl="0">
-      <w:startOverride w:val="1"/>
-    </w:lvlOverride>
-  </w:num>
-  <w:num w:numId="17" w16cid:durableId="1346520792">
-    <w:abstractNumId w:val="7"/>
-    <w:lvlOverride w:ilvl="0">
-      <w:startOverride w:val="1"/>
-    </w:lvlOverride>
-  </w:num>
-  <w:num w:numId="18" w16cid:durableId="1860704008">
-    <w:abstractNumId w:val="7"/>
-    <w:lvlOverride w:ilvl="0">
-      <w:startOverride w:val="1"/>
-    </w:lvlOverride>
-  </w:num>
-  <w:num w:numId="19" w16cid:durableId="2097356562">
-    <w:abstractNumId w:val="7"/>
-    <w:lvlOverride w:ilvl="0">
-      <w:startOverride w:val="1"/>
-    </w:lvlOverride>
-  </w:num>
-  <w:num w:numId="20" w16cid:durableId="548690452">
-    <w:abstractNumId w:val="7"/>
-    <w:lvlOverride w:ilvl="0">
-      <w:startOverride w:val="1"/>
-    </w:lvlOverride>
-  </w:num>
-  <w:num w:numId="21" w16cid:durableId="1399864978">
-    <w:abstractNumId w:val="7"/>
-    <w:lvlOverride w:ilvl="0">
-      <w:startOverride w:val="1"/>
-    </w:lvlOverride>
-  </w:num>
-  <w:num w:numId="22" w16cid:durableId="279458246">
-    <w:abstractNumId w:val="7"/>
-    <w:lvlOverride w:ilvl="0">
-      <w:startOverride w:val="1"/>
-    </w:lvlOverride>
-  </w:num>
-  <w:num w:numId="23" w16cid:durableId="252012834">
-    <w:abstractNumId w:val="7"/>
-    <w:lvlOverride w:ilvl="0">
-      <w:startOverride w:val="1"/>
-    </w:lvlOverride>
-  </w:num>
-  <w:num w:numId="24" w16cid:durableId="1901206792">
-    <w:abstractNumId w:val="7"/>
-    <w:lvlOverride w:ilvl="0">
-      <w:startOverride w:val="1"/>
-    </w:lvlOverride>
   </w:num>
 </w:numbering>
 </file>
@@ -14840,6 +18305,42 @@
     <w:name w:val="Manual Number"/>
     <w:basedOn w:val="ListNumber"/>
   </w:style>
+  <w:style w:type="paragraph" w:styleId="TOC1">
+    <w:name w:val="toc 1"/>
+    <w:basedOn w:val="Normal"/>
+    <w:next w:val="Normal"/>
+    <w:autoRedefine/>
+    <w:uiPriority w:val="39"/>
+    <w:unhideWhenUsed/>
+    <w:rsid w:val="006226C1"/>
+    <w:pPr>
+      <w:spacing w:after="100"/>
+    </w:pPr>
+  </w:style>
+  <w:style w:type="paragraph" w:styleId="TOC2">
+    <w:name w:val="toc 2"/>
+    <w:basedOn w:val="Normal"/>
+    <w:next w:val="Normal"/>
+    <w:autoRedefine/>
+    <w:uiPriority w:val="39"/>
+    <w:unhideWhenUsed/>
+    <w:rsid w:val="006226C1"/>
+    <w:pPr>
+      <w:spacing w:after="100"/>
+      <w:ind w:left="220"/>
+    </w:pPr>
+  </w:style>
+  <w:style w:type="character" w:styleId="Hyperlink">
+    <w:name w:val="Hyperlink"/>
+    <w:basedOn w:val="DefaultParagraphFont"/>
+    <w:uiPriority w:val="99"/>
+    <w:unhideWhenUsed/>
+    <w:rsid w:val="006226C1"/>
+    <w:rPr>
+      <w:color w:val="0000FF" w:themeColor="hyperlink"/>
+      <w:u w:val="single"/>
+    </w:rPr>
+  </w:style>
 </w:styles>
 </file>
 

</xml_diff>